<commit_message>
feature configuranndo el docker
</commit_message>
<xml_diff>
--- a/PASOS PARA REALIZAR EL BACKEND DE NODE NEST.docx
+++ b/PASOS PARA REALIZAR EL BACKEND DE NODE NEST.docx
@@ -101,6 +101,7 @@
       </w:pPr>
       <w:r>
         <w:rPr>
+          <w:noProof/>
           <w:lang w:val="es-ES"/>
         </w:rPr>
         <w:drawing>
@@ -457,6 +458,7 @@
       </w:pPr>
       <w:r>
         <w:rPr>
+          <w:noProof/>
           <w:lang w:val="es-ES"/>
         </w:rPr>
         <w:lastRenderedPageBreak/>
@@ -1643,6 +1645,7 @@
       <w:r>
         <w:rPr>
           <w:rFonts w:ascii="Consolas" w:eastAsia="Times New Roman" w:hAnsi="Consolas" w:cs="Times New Roman"/>
+          <w:noProof/>
           <w:color w:val="auto"/>
           <w:sz w:val="21"/>
           <w:szCs w:val="21"/>
@@ -1683,6 +1686,2769 @@
           </wp:inline>
         </w:drawing>
       </w:r>
+    </w:p>
+    <w:p>
+      <w:pPr>
+        <w:ind w:firstLine="0"/>
+        <w:rPr>
+          <w:rFonts w:ascii="Consolas" w:eastAsia="Times New Roman" w:hAnsi="Consolas" w:cs="Times New Roman"/>
+          <w:color w:val="auto"/>
+          <w:sz w:val="21"/>
+          <w:szCs w:val="21"/>
+          <w:lang w:val="es-ES"/>
+        </w:rPr>
+      </w:pPr>
+      <w:r>
+        <w:rPr>
+          <w:rFonts w:ascii="Consolas" w:eastAsia="Times New Roman" w:hAnsi="Consolas" w:cs="Times New Roman"/>
+          <w:color w:val="auto"/>
+          <w:sz w:val="21"/>
+          <w:szCs w:val="21"/>
+          <w:lang w:val="es-ES"/>
+        </w:rPr>
+        <w:t xml:space="preserve">Seguimos configurando con </w:t>
+      </w:r>
+      <w:proofErr w:type="spellStart"/>
+      <w:r>
+        <w:rPr>
+          <w:rFonts w:ascii="Consolas" w:eastAsia="Times New Roman" w:hAnsi="Consolas" w:cs="Times New Roman"/>
+          <w:color w:val="auto"/>
+          <w:sz w:val="21"/>
+          <w:szCs w:val="21"/>
+          <w:lang w:val="es-ES"/>
+        </w:rPr>
+        <w:t>class-vidator</w:t>
+      </w:r>
+      <w:proofErr w:type="spellEnd"/>
+      <w:r>
+        <w:rPr>
+          <w:rFonts w:ascii="Consolas" w:eastAsia="Times New Roman" w:hAnsi="Consolas" w:cs="Times New Roman"/>
+          <w:color w:val="auto"/>
+          <w:sz w:val="21"/>
+          <w:szCs w:val="21"/>
+          <w:lang w:val="es-ES"/>
+        </w:rPr>
+        <w:t xml:space="preserve"> y</w:t>
+      </w:r>
+      <w:r>
+        <w:rPr>
+          <w:rFonts w:ascii="Consolas" w:eastAsia="Times New Roman" w:hAnsi="Consolas" w:cs="Times New Roman"/>
+          <w:color w:val="auto"/>
+          <w:sz w:val="21"/>
+          <w:szCs w:val="21"/>
+          <w:lang w:val="es-ES"/>
+        </w:rPr>
+        <w:t xml:space="preserve"> </w:t>
+      </w:r>
+      <w:proofErr w:type="spellStart"/>
+      <w:r>
+        <w:rPr>
+          <w:rFonts w:ascii="Consolas" w:eastAsia="Times New Roman" w:hAnsi="Consolas" w:cs="Times New Roman"/>
+          <w:color w:val="auto"/>
+          <w:sz w:val="21"/>
+          <w:szCs w:val="21"/>
+          <w:lang w:val="es-ES"/>
+        </w:rPr>
+        <w:t>class</w:t>
+      </w:r>
+      <w:r>
+        <w:rPr>
+          <w:rFonts w:ascii="Consolas" w:eastAsia="Times New Roman" w:hAnsi="Consolas" w:cs="Times New Roman"/>
+          <w:color w:val="auto"/>
+          <w:sz w:val="21"/>
+          <w:szCs w:val="21"/>
+          <w:lang w:val="es-ES"/>
+        </w:rPr>
+        <w:t>-transformer</w:t>
+      </w:r>
+      <w:proofErr w:type="spellEnd"/>
+    </w:p>
+    <w:p>
+      <w:pPr>
+        <w:ind w:firstLine="0"/>
+        <w:rPr>
+          <w:rFonts w:ascii="Consolas" w:eastAsia="Times New Roman" w:hAnsi="Consolas" w:cs="Times New Roman"/>
+          <w:b/>
+          <w:bCs/>
+          <w:color w:val="auto"/>
+          <w:sz w:val="21"/>
+          <w:szCs w:val="21"/>
+        </w:rPr>
+      </w:pPr>
+      <w:r>
+        <w:rPr>
+          <w:rFonts w:ascii="Consolas" w:eastAsia="Times New Roman" w:hAnsi="Consolas" w:cs="Times New Roman"/>
+          <w:color w:val="auto"/>
+          <w:sz w:val="21"/>
+          <w:szCs w:val="21"/>
+        </w:rPr>
+        <w:t xml:space="preserve">Con: </w:t>
+      </w:r>
+      <w:r>
+        <w:rPr>
+          <w:rFonts w:ascii="Consolas" w:eastAsia="Times New Roman" w:hAnsi="Consolas" w:cs="Times New Roman"/>
+          <w:b/>
+          <w:bCs/>
+          <w:color w:val="auto"/>
+          <w:sz w:val="21"/>
+          <w:szCs w:val="21"/>
+        </w:rPr>
+        <w:t>yarn add @nestjs/</w:t>
+      </w:r>
+      <w:r>
+        <w:rPr>
+          <w:rFonts w:ascii="Consolas" w:eastAsia="Times New Roman" w:hAnsi="Consolas" w:cs="Times New Roman"/>
+          <w:b/>
+          <w:bCs/>
+          <w:color w:val="auto"/>
+          <w:sz w:val="21"/>
+          <w:szCs w:val="21"/>
+        </w:rPr>
+        <w:t>class-validator class-transformer</w:t>
+      </w:r>
+    </w:p>
+    <w:p>
+      <w:pPr>
+        <w:shd w:val="clear" w:color="auto" w:fill="1A1B26"/>
+        <w:spacing w:after="0" w:line="285" w:lineRule="atLeast"/>
+        <w:ind w:firstLine="0"/>
+        <w:rPr>
+          <w:rFonts w:ascii="Consolas" w:eastAsia="Times New Roman" w:hAnsi="Consolas" w:cs="Times New Roman"/>
+          <w:color w:val="C0CAF5"/>
+          <w:sz w:val="21"/>
+          <w:szCs w:val="21"/>
+          <w:lang w:val="es-ES"/>
+        </w:rPr>
+      </w:pPr>
+      <w:r>
+        <w:rPr>
+          <w:rFonts w:ascii="Consolas" w:eastAsia="Times New Roman" w:hAnsi="Consolas" w:cs="Times New Roman"/>
+          <w:i/>
+          <w:iCs/>
+          <w:color w:val="565F89"/>
+          <w:sz w:val="21"/>
+          <w:szCs w:val="21"/>
+          <w:lang w:val="es-ES"/>
+        </w:rPr>
+        <w:t xml:space="preserve">//configurando el </w:t>
+      </w:r>
+      <w:proofErr w:type="spellStart"/>
+      <w:r>
+        <w:rPr>
+          <w:rFonts w:ascii="Consolas" w:eastAsia="Times New Roman" w:hAnsi="Consolas" w:cs="Times New Roman"/>
+          <w:i/>
+          <w:iCs/>
+          <w:color w:val="565F89"/>
+          <w:sz w:val="21"/>
+          <w:szCs w:val="21"/>
+          <w:lang w:val="es-ES"/>
+        </w:rPr>
+        <w:t>class-validator</w:t>
+      </w:r>
+      <w:proofErr w:type="spellEnd"/>
+      <w:r>
+        <w:rPr>
+          <w:rFonts w:ascii="Consolas" w:eastAsia="Times New Roman" w:hAnsi="Consolas" w:cs="Times New Roman"/>
+          <w:i/>
+          <w:iCs/>
+          <w:color w:val="565F89"/>
+          <w:sz w:val="21"/>
+          <w:szCs w:val="21"/>
+          <w:lang w:val="es-ES"/>
+        </w:rPr>
+        <w:t xml:space="preserve"> y </w:t>
+      </w:r>
+      <w:proofErr w:type="spellStart"/>
+      <w:r>
+        <w:rPr>
+          <w:rFonts w:ascii="Consolas" w:eastAsia="Times New Roman" w:hAnsi="Consolas" w:cs="Times New Roman"/>
+          <w:i/>
+          <w:iCs/>
+          <w:color w:val="565F89"/>
+          <w:sz w:val="21"/>
+          <w:szCs w:val="21"/>
+          <w:lang w:val="es-ES"/>
+        </w:rPr>
+        <w:t>class-transformer</w:t>
+      </w:r>
+      <w:proofErr w:type="spellEnd"/>
+    </w:p>
+    <w:p>
+      <w:pPr>
+        <w:shd w:val="clear" w:color="auto" w:fill="1A1B26"/>
+        <w:spacing w:after="0" w:line="285" w:lineRule="atLeast"/>
+        <w:ind w:firstLine="0"/>
+        <w:rPr>
+          <w:rFonts w:ascii="Consolas" w:eastAsia="Times New Roman" w:hAnsi="Consolas" w:cs="Times New Roman"/>
+          <w:color w:val="C0CAF5"/>
+          <w:sz w:val="21"/>
+          <w:szCs w:val="21"/>
+          <w:lang w:val="es-ES"/>
+        </w:rPr>
+      </w:pPr>
+      <w:r>
+        <w:rPr>
+          <w:rFonts w:ascii="Consolas" w:eastAsia="Times New Roman" w:hAnsi="Consolas" w:cs="Times New Roman"/>
+          <w:color w:val="C0CAF5"/>
+          <w:sz w:val="21"/>
+          <w:szCs w:val="21"/>
+          <w:lang w:val="es-ES"/>
+        </w:rPr>
+        <w:t xml:space="preserve">  </w:t>
+      </w:r>
+      <w:proofErr w:type="spellStart"/>
+      <w:proofErr w:type="gramStart"/>
+      <w:r>
+        <w:rPr>
+          <w:rFonts w:ascii="Consolas" w:eastAsia="Times New Roman" w:hAnsi="Consolas" w:cs="Times New Roman"/>
+          <w:color w:val="C0CAF5"/>
+          <w:sz w:val="21"/>
+          <w:szCs w:val="21"/>
+          <w:lang w:val="es-ES"/>
+        </w:rPr>
+        <w:t>app.</w:t>
+      </w:r>
+      <w:r>
+        <w:rPr>
+          <w:rFonts w:ascii="Consolas" w:eastAsia="Times New Roman" w:hAnsi="Consolas" w:cs="Times New Roman"/>
+          <w:color w:val="7AA2F7"/>
+          <w:sz w:val="21"/>
+          <w:szCs w:val="21"/>
+          <w:lang w:val="es-ES"/>
+        </w:rPr>
+        <w:t>useGlobalPipes</w:t>
+      </w:r>
+      <w:proofErr w:type="spellEnd"/>
+      <w:proofErr w:type="gramEnd"/>
+      <w:r>
+        <w:rPr>
+          <w:rFonts w:ascii="Consolas" w:eastAsia="Times New Roman" w:hAnsi="Consolas" w:cs="Times New Roman"/>
+          <w:color w:val="C0CAF5"/>
+          <w:sz w:val="21"/>
+          <w:szCs w:val="21"/>
+          <w:lang w:val="es-ES"/>
+        </w:rPr>
+        <w:t>(</w:t>
+      </w:r>
+      <w:r>
+        <w:rPr>
+          <w:rFonts w:ascii="Consolas" w:eastAsia="Times New Roman" w:hAnsi="Consolas" w:cs="Times New Roman"/>
+          <w:color w:val="BB9AF7"/>
+          <w:sz w:val="21"/>
+          <w:szCs w:val="21"/>
+          <w:lang w:val="es-ES"/>
+        </w:rPr>
+        <w:t>new</w:t>
+      </w:r>
+      <w:r>
+        <w:rPr>
+          <w:rFonts w:ascii="Consolas" w:eastAsia="Times New Roman" w:hAnsi="Consolas" w:cs="Times New Roman"/>
+          <w:color w:val="C0CAF5"/>
+          <w:sz w:val="21"/>
+          <w:szCs w:val="21"/>
+          <w:lang w:val="es-ES"/>
+        </w:rPr>
+        <w:t xml:space="preserve"> </w:t>
+      </w:r>
+      <w:proofErr w:type="spellStart"/>
+      <w:r>
+        <w:rPr>
+          <w:rFonts w:ascii="Consolas" w:eastAsia="Times New Roman" w:hAnsi="Consolas" w:cs="Times New Roman"/>
+          <w:color w:val="7AA2F7"/>
+          <w:sz w:val="21"/>
+          <w:szCs w:val="21"/>
+          <w:lang w:val="es-ES"/>
+        </w:rPr>
+        <w:t>ValidationPipe</w:t>
+      </w:r>
+      <w:proofErr w:type="spellEnd"/>
+      <w:r>
+        <w:rPr>
+          <w:rFonts w:ascii="Consolas" w:eastAsia="Times New Roman" w:hAnsi="Consolas" w:cs="Times New Roman"/>
+          <w:color w:val="C0CAF5"/>
+          <w:sz w:val="21"/>
+          <w:szCs w:val="21"/>
+          <w:lang w:val="es-ES"/>
+        </w:rPr>
+        <w:t>());</w:t>
+      </w:r>
+    </w:p>
+    <w:p>
+      <w:pPr>
+        <w:ind w:firstLine="0"/>
+        <w:rPr>
+          <w:rFonts w:ascii="Consolas" w:eastAsia="Times New Roman" w:hAnsi="Consolas" w:cs="Times New Roman"/>
+          <w:color w:val="auto"/>
+          <w:sz w:val="21"/>
+          <w:szCs w:val="21"/>
+          <w:lang w:val="es-ES"/>
+        </w:rPr>
+      </w:pPr>
+      <w:r>
+        <w:rPr>
+          <w:rFonts w:ascii="Consolas" w:eastAsia="Times New Roman" w:hAnsi="Consolas" w:cs="Times New Roman"/>
+          <w:color w:val="auto"/>
+          <w:sz w:val="21"/>
+          <w:szCs w:val="21"/>
+          <w:lang w:val="es-ES"/>
+        </w:rPr>
+        <w:t>en e</w:t>
+      </w:r>
+      <w:r>
+        <w:rPr>
+          <w:rFonts w:ascii="Consolas" w:eastAsia="Times New Roman" w:hAnsi="Consolas" w:cs="Times New Roman"/>
+          <w:color w:val="auto"/>
+          <w:sz w:val="21"/>
+          <w:szCs w:val="21"/>
+          <w:lang w:val="es-ES"/>
+        </w:rPr>
+        <w:t xml:space="preserve">l </w:t>
+      </w:r>
+      <w:proofErr w:type="spellStart"/>
+      <w:r>
+        <w:rPr>
+          <w:rFonts w:ascii="Consolas" w:eastAsia="Times New Roman" w:hAnsi="Consolas" w:cs="Times New Roman"/>
+          <w:color w:val="auto"/>
+          <w:sz w:val="21"/>
+          <w:szCs w:val="21"/>
+          <w:lang w:val="es-ES"/>
+        </w:rPr>
+        <w:t>main.ts</w:t>
+      </w:r>
+      <w:proofErr w:type="spellEnd"/>
+    </w:p>
+    <w:p>
+      <w:pPr>
+        <w:ind w:firstLine="0"/>
+        <w:rPr>
+          <w:rFonts w:ascii="Consolas" w:eastAsia="Times New Roman" w:hAnsi="Consolas" w:cs="Times New Roman"/>
+          <w:color w:val="auto"/>
+          <w:sz w:val="21"/>
+          <w:szCs w:val="21"/>
+          <w:lang w:val="es-ES"/>
+        </w:rPr>
+      </w:pPr>
+      <w:r>
+        <w:rPr>
+          <w:rFonts w:ascii="Consolas" w:eastAsia="Times New Roman" w:hAnsi="Consolas" w:cs="Times New Roman"/>
+          <w:color w:val="auto"/>
+          <w:sz w:val="21"/>
+          <w:szCs w:val="21"/>
+          <w:lang w:val="es-ES"/>
+        </w:rPr>
+        <w:t xml:space="preserve">Luego se </w:t>
+      </w:r>
+      <w:proofErr w:type="spellStart"/>
+      <w:r>
+        <w:rPr>
+          <w:rFonts w:ascii="Consolas" w:eastAsia="Times New Roman" w:hAnsi="Consolas" w:cs="Times New Roman"/>
+          <w:color w:val="auto"/>
+          <w:sz w:val="21"/>
+          <w:szCs w:val="21"/>
+          <w:lang w:val="es-ES"/>
+        </w:rPr>
+        <w:t>creo</w:t>
+      </w:r>
+      <w:proofErr w:type="spellEnd"/>
+      <w:r>
+        <w:rPr>
+          <w:rFonts w:ascii="Consolas" w:eastAsia="Times New Roman" w:hAnsi="Consolas" w:cs="Times New Roman"/>
+          <w:color w:val="auto"/>
+          <w:sz w:val="21"/>
+          <w:szCs w:val="21"/>
+          <w:lang w:val="es-ES"/>
+        </w:rPr>
+        <w:t xml:space="preserve"> el contenedor Docker</w:t>
+      </w:r>
+    </w:p>
+    <w:p>
+      <w:pPr>
+        <w:ind w:firstLine="0"/>
+        <w:rPr>
+          <w:rFonts w:ascii="Consolas" w:eastAsia="Times New Roman" w:hAnsi="Consolas" w:cs="Times New Roman"/>
+          <w:color w:val="auto"/>
+          <w:sz w:val="21"/>
+          <w:szCs w:val="21"/>
+          <w:lang w:val="es-ES"/>
+        </w:rPr>
+      </w:pPr>
+      <w:r>
+        <w:rPr>
+          <w:rFonts w:ascii="Consolas" w:eastAsia="Times New Roman" w:hAnsi="Consolas" w:cs="Times New Roman"/>
+          <w:color w:val="auto"/>
+          <w:sz w:val="21"/>
+          <w:szCs w:val="21"/>
+          <w:lang w:val="es-ES"/>
+        </w:rPr>
+        <w:t xml:space="preserve">Se creo en la raíz el archivo </w:t>
+      </w:r>
+      <w:proofErr w:type="spellStart"/>
+      <w:r>
+        <w:rPr>
+          <w:rFonts w:ascii="Consolas" w:eastAsia="Times New Roman" w:hAnsi="Consolas" w:cs="Times New Roman"/>
+          <w:color w:val="auto"/>
+          <w:sz w:val="21"/>
+          <w:szCs w:val="21"/>
+          <w:lang w:val="es-ES"/>
+        </w:rPr>
+        <w:t>docker-compose.yml</w:t>
+      </w:r>
+      <w:proofErr w:type="spellEnd"/>
+    </w:p>
+    <w:p>
+      <w:pPr>
+        <w:shd w:val="clear" w:color="auto" w:fill="1A1B26"/>
+        <w:spacing w:after="0" w:line="285" w:lineRule="atLeast"/>
+        <w:ind w:firstLine="0"/>
+        <w:rPr>
+          <w:rFonts w:ascii="Consolas" w:eastAsia="Times New Roman" w:hAnsi="Consolas" w:cs="Times New Roman"/>
+          <w:color w:val="C0CAF5"/>
+          <w:sz w:val="21"/>
+          <w:szCs w:val="21"/>
+        </w:rPr>
+      </w:pPr>
+      <w:r>
+        <w:rPr>
+          <w:rFonts w:ascii="Consolas" w:eastAsia="Times New Roman" w:hAnsi="Consolas" w:cs="Times New Roman"/>
+          <w:color w:val="F7768E"/>
+          <w:sz w:val="21"/>
+          <w:szCs w:val="21"/>
+        </w:rPr>
+        <w:t>services</w:t>
+      </w:r>
+      <w:r>
+        <w:rPr>
+          <w:rFonts w:ascii="Consolas" w:eastAsia="Times New Roman" w:hAnsi="Consolas" w:cs="Times New Roman"/>
+          <w:color w:val="C0CAF5"/>
+          <w:sz w:val="21"/>
+          <w:szCs w:val="21"/>
+        </w:rPr>
+        <w:t>:</w:t>
+      </w:r>
+    </w:p>
+    <w:p>
+      <w:pPr>
+        <w:shd w:val="clear" w:color="auto" w:fill="1A1B26"/>
+        <w:spacing w:after="0" w:line="285" w:lineRule="atLeast"/>
+        <w:ind w:firstLine="0"/>
+        <w:rPr>
+          <w:rFonts w:ascii="Consolas" w:eastAsia="Times New Roman" w:hAnsi="Consolas" w:cs="Times New Roman"/>
+          <w:color w:val="C0CAF5"/>
+          <w:sz w:val="21"/>
+          <w:szCs w:val="21"/>
+        </w:rPr>
+      </w:pPr>
+      <w:r>
+        <w:rPr>
+          <w:rFonts w:ascii="Consolas" w:eastAsia="Times New Roman" w:hAnsi="Consolas" w:cs="Times New Roman"/>
+          <w:color w:val="C0CAF5"/>
+          <w:sz w:val="21"/>
+          <w:szCs w:val="21"/>
+        </w:rPr>
+        <w:t xml:space="preserve">  </w:t>
+      </w:r>
+      <w:proofErr w:type="spellStart"/>
+      <w:r>
+        <w:rPr>
+          <w:rFonts w:ascii="Consolas" w:eastAsia="Times New Roman" w:hAnsi="Consolas" w:cs="Times New Roman"/>
+          <w:color w:val="F7768E"/>
+          <w:sz w:val="21"/>
+          <w:szCs w:val="21"/>
+        </w:rPr>
+        <w:t>postgres</w:t>
+      </w:r>
+      <w:proofErr w:type="spellEnd"/>
+      <w:r>
+        <w:rPr>
+          <w:rFonts w:ascii="Consolas" w:eastAsia="Times New Roman" w:hAnsi="Consolas" w:cs="Times New Roman"/>
+          <w:color w:val="C0CAF5"/>
+          <w:sz w:val="21"/>
+          <w:szCs w:val="21"/>
+        </w:rPr>
+        <w:t>:</w:t>
+      </w:r>
+    </w:p>
+    <w:p>
+      <w:pPr>
+        <w:shd w:val="clear" w:color="auto" w:fill="1A1B26"/>
+        <w:spacing w:after="0" w:line="285" w:lineRule="atLeast"/>
+        <w:ind w:firstLine="0"/>
+        <w:rPr>
+          <w:rFonts w:ascii="Consolas" w:eastAsia="Times New Roman" w:hAnsi="Consolas" w:cs="Times New Roman"/>
+          <w:color w:val="C0CAF5"/>
+          <w:sz w:val="21"/>
+          <w:szCs w:val="21"/>
+        </w:rPr>
+      </w:pPr>
+      <w:r>
+        <w:rPr>
+          <w:rFonts w:ascii="Consolas" w:eastAsia="Times New Roman" w:hAnsi="Consolas" w:cs="Times New Roman"/>
+          <w:color w:val="C0CAF5"/>
+          <w:sz w:val="21"/>
+          <w:szCs w:val="21"/>
+        </w:rPr>
+        <w:t xml:space="preserve">    </w:t>
+      </w:r>
+      <w:r>
+        <w:rPr>
+          <w:rFonts w:ascii="Consolas" w:eastAsia="Times New Roman" w:hAnsi="Consolas" w:cs="Times New Roman"/>
+          <w:color w:val="F7768E"/>
+          <w:sz w:val="21"/>
+          <w:szCs w:val="21"/>
+        </w:rPr>
+        <w:t>image</w:t>
+      </w:r>
+      <w:r>
+        <w:rPr>
+          <w:rFonts w:ascii="Consolas" w:eastAsia="Times New Roman" w:hAnsi="Consolas" w:cs="Times New Roman"/>
+          <w:color w:val="C0CAF5"/>
+          <w:sz w:val="21"/>
+          <w:szCs w:val="21"/>
+        </w:rPr>
+        <w:t xml:space="preserve">: </w:t>
+      </w:r>
+      <w:r>
+        <w:rPr>
+          <w:rFonts w:ascii="Consolas" w:eastAsia="Times New Roman" w:hAnsi="Consolas" w:cs="Times New Roman"/>
+          <w:color w:val="9ECE6A"/>
+          <w:sz w:val="21"/>
+          <w:szCs w:val="21"/>
+        </w:rPr>
+        <w:t>postgres:15</w:t>
+      </w:r>
+    </w:p>
+    <w:p>
+      <w:pPr>
+        <w:shd w:val="clear" w:color="auto" w:fill="1A1B26"/>
+        <w:spacing w:after="0" w:line="285" w:lineRule="atLeast"/>
+        <w:ind w:firstLine="0"/>
+        <w:rPr>
+          <w:rFonts w:ascii="Consolas" w:eastAsia="Times New Roman" w:hAnsi="Consolas" w:cs="Times New Roman"/>
+          <w:color w:val="C0CAF5"/>
+          <w:sz w:val="21"/>
+          <w:szCs w:val="21"/>
+        </w:rPr>
+      </w:pPr>
+      <w:r>
+        <w:rPr>
+          <w:rFonts w:ascii="Consolas" w:eastAsia="Times New Roman" w:hAnsi="Consolas" w:cs="Times New Roman"/>
+          <w:color w:val="C0CAF5"/>
+          <w:sz w:val="21"/>
+          <w:szCs w:val="21"/>
+        </w:rPr>
+        <w:t xml:space="preserve">    </w:t>
+      </w:r>
+      <w:proofErr w:type="spellStart"/>
+      <w:r>
+        <w:rPr>
+          <w:rFonts w:ascii="Consolas" w:eastAsia="Times New Roman" w:hAnsi="Consolas" w:cs="Times New Roman"/>
+          <w:color w:val="F7768E"/>
+          <w:sz w:val="21"/>
+          <w:szCs w:val="21"/>
+        </w:rPr>
+        <w:t>container_name</w:t>
+      </w:r>
+      <w:proofErr w:type="spellEnd"/>
+      <w:r>
+        <w:rPr>
+          <w:rFonts w:ascii="Consolas" w:eastAsia="Times New Roman" w:hAnsi="Consolas" w:cs="Times New Roman"/>
+          <w:color w:val="C0CAF5"/>
+          <w:sz w:val="21"/>
+          <w:szCs w:val="21"/>
+        </w:rPr>
+        <w:t xml:space="preserve">: </w:t>
+      </w:r>
+      <w:proofErr w:type="spellStart"/>
+      <w:r>
+        <w:rPr>
+          <w:rFonts w:ascii="Consolas" w:eastAsia="Times New Roman" w:hAnsi="Consolas" w:cs="Times New Roman"/>
+          <w:color w:val="9ECE6A"/>
+          <w:sz w:val="21"/>
+          <w:szCs w:val="21"/>
+        </w:rPr>
+        <w:t>bd_inventario</w:t>
+      </w:r>
+      <w:proofErr w:type="spellEnd"/>
+    </w:p>
+    <w:p>
+      <w:pPr>
+        <w:shd w:val="clear" w:color="auto" w:fill="1A1B26"/>
+        <w:spacing w:after="0" w:line="285" w:lineRule="atLeast"/>
+        <w:ind w:firstLine="0"/>
+        <w:rPr>
+          <w:rFonts w:ascii="Consolas" w:eastAsia="Times New Roman" w:hAnsi="Consolas" w:cs="Times New Roman"/>
+          <w:color w:val="C0CAF5"/>
+          <w:sz w:val="21"/>
+          <w:szCs w:val="21"/>
+        </w:rPr>
+      </w:pPr>
+      <w:r>
+        <w:rPr>
+          <w:rFonts w:ascii="Consolas" w:eastAsia="Times New Roman" w:hAnsi="Consolas" w:cs="Times New Roman"/>
+          <w:color w:val="C0CAF5"/>
+          <w:sz w:val="21"/>
+          <w:szCs w:val="21"/>
+        </w:rPr>
+        <w:t xml:space="preserve">    </w:t>
+      </w:r>
+      <w:r>
+        <w:rPr>
+          <w:rFonts w:ascii="Consolas" w:eastAsia="Times New Roman" w:hAnsi="Consolas" w:cs="Times New Roman"/>
+          <w:color w:val="F7768E"/>
+          <w:sz w:val="21"/>
+          <w:szCs w:val="21"/>
+        </w:rPr>
+        <w:t>environment</w:t>
+      </w:r>
+      <w:r>
+        <w:rPr>
+          <w:rFonts w:ascii="Consolas" w:eastAsia="Times New Roman" w:hAnsi="Consolas" w:cs="Times New Roman"/>
+          <w:color w:val="C0CAF5"/>
+          <w:sz w:val="21"/>
+          <w:szCs w:val="21"/>
+        </w:rPr>
+        <w:t>:</w:t>
+      </w:r>
+    </w:p>
+    <w:p>
+      <w:pPr>
+        <w:shd w:val="clear" w:color="auto" w:fill="1A1B26"/>
+        <w:spacing w:after="0" w:line="285" w:lineRule="atLeast"/>
+        <w:ind w:firstLine="0"/>
+        <w:rPr>
+          <w:rFonts w:ascii="Consolas" w:eastAsia="Times New Roman" w:hAnsi="Consolas" w:cs="Times New Roman"/>
+          <w:color w:val="C0CAF5"/>
+          <w:sz w:val="21"/>
+          <w:szCs w:val="21"/>
+        </w:rPr>
+      </w:pPr>
+      <w:r>
+        <w:rPr>
+          <w:rFonts w:ascii="Consolas" w:eastAsia="Times New Roman" w:hAnsi="Consolas" w:cs="Times New Roman"/>
+          <w:color w:val="C0CAF5"/>
+          <w:sz w:val="21"/>
+          <w:szCs w:val="21"/>
+        </w:rPr>
+        <w:t xml:space="preserve">      </w:t>
+      </w:r>
+      <w:r>
+        <w:rPr>
+          <w:rFonts w:ascii="Consolas" w:eastAsia="Times New Roman" w:hAnsi="Consolas" w:cs="Times New Roman"/>
+          <w:color w:val="F7768E"/>
+          <w:sz w:val="21"/>
+          <w:szCs w:val="21"/>
+        </w:rPr>
+        <w:t>POSTGRES_DB</w:t>
+      </w:r>
+      <w:r>
+        <w:rPr>
+          <w:rFonts w:ascii="Consolas" w:eastAsia="Times New Roman" w:hAnsi="Consolas" w:cs="Times New Roman"/>
+          <w:color w:val="C0CAF5"/>
+          <w:sz w:val="21"/>
+          <w:szCs w:val="21"/>
+        </w:rPr>
+        <w:t xml:space="preserve">: </w:t>
+      </w:r>
+      <w:proofErr w:type="spellStart"/>
+      <w:r>
+        <w:rPr>
+          <w:rFonts w:ascii="Consolas" w:eastAsia="Times New Roman" w:hAnsi="Consolas" w:cs="Times New Roman"/>
+          <w:color w:val="9ECE6A"/>
+          <w:sz w:val="21"/>
+          <w:szCs w:val="21"/>
+        </w:rPr>
+        <w:t>bd_inventario</w:t>
+      </w:r>
+      <w:proofErr w:type="spellEnd"/>
+    </w:p>
+    <w:p>
+      <w:pPr>
+        <w:shd w:val="clear" w:color="auto" w:fill="1A1B26"/>
+        <w:spacing w:after="0" w:line="285" w:lineRule="atLeast"/>
+        <w:ind w:firstLine="0"/>
+        <w:rPr>
+          <w:rFonts w:ascii="Consolas" w:eastAsia="Times New Roman" w:hAnsi="Consolas" w:cs="Times New Roman"/>
+          <w:color w:val="C0CAF5"/>
+          <w:sz w:val="21"/>
+          <w:szCs w:val="21"/>
+        </w:rPr>
+      </w:pPr>
+      <w:r>
+        <w:rPr>
+          <w:rFonts w:ascii="Consolas" w:eastAsia="Times New Roman" w:hAnsi="Consolas" w:cs="Times New Roman"/>
+          <w:color w:val="C0CAF5"/>
+          <w:sz w:val="21"/>
+          <w:szCs w:val="21"/>
+        </w:rPr>
+        <w:t xml:space="preserve">      </w:t>
+      </w:r>
+      <w:r>
+        <w:rPr>
+          <w:rFonts w:ascii="Consolas" w:eastAsia="Times New Roman" w:hAnsi="Consolas" w:cs="Times New Roman"/>
+          <w:color w:val="F7768E"/>
+          <w:sz w:val="21"/>
+          <w:szCs w:val="21"/>
+        </w:rPr>
+        <w:t>POSTGRES_USER</w:t>
+      </w:r>
+      <w:r>
+        <w:rPr>
+          <w:rFonts w:ascii="Consolas" w:eastAsia="Times New Roman" w:hAnsi="Consolas" w:cs="Times New Roman"/>
+          <w:color w:val="C0CAF5"/>
+          <w:sz w:val="21"/>
+          <w:szCs w:val="21"/>
+        </w:rPr>
+        <w:t xml:space="preserve">: </w:t>
+      </w:r>
+      <w:proofErr w:type="spellStart"/>
+      <w:r>
+        <w:rPr>
+          <w:rFonts w:ascii="Consolas" w:eastAsia="Times New Roman" w:hAnsi="Consolas" w:cs="Times New Roman"/>
+          <w:color w:val="9ECE6A"/>
+          <w:sz w:val="21"/>
+          <w:szCs w:val="21"/>
+        </w:rPr>
+        <w:t>postgres</w:t>
+      </w:r>
+      <w:proofErr w:type="spellEnd"/>
+    </w:p>
+    <w:p>
+      <w:pPr>
+        <w:shd w:val="clear" w:color="auto" w:fill="1A1B26"/>
+        <w:spacing w:after="0" w:line="285" w:lineRule="atLeast"/>
+        <w:ind w:firstLine="0"/>
+        <w:rPr>
+          <w:rFonts w:ascii="Consolas" w:eastAsia="Times New Roman" w:hAnsi="Consolas" w:cs="Times New Roman"/>
+          <w:color w:val="C0CAF5"/>
+          <w:sz w:val="21"/>
+          <w:szCs w:val="21"/>
+        </w:rPr>
+      </w:pPr>
+      <w:r>
+        <w:rPr>
+          <w:rFonts w:ascii="Consolas" w:eastAsia="Times New Roman" w:hAnsi="Consolas" w:cs="Times New Roman"/>
+          <w:color w:val="C0CAF5"/>
+          <w:sz w:val="21"/>
+          <w:szCs w:val="21"/>
+        </w:rPr>
+        <w:t xml:space="preserve">      </w:t>
+      </w:r>
+      <w:r>
+        <w:rPr>
+          <w:rFonts w:ascii="Consolas" w:eastAsia="Times New Roman" w:hAnsi="Consolas" w:cs="Times New Roman"/>
+          <w:color w:val="F7768E"/>
+          <w:sz w:val="21"/>
+          <w:szCs w:val="21"/>
+        </w:rPr>
+        <w:t>POSTGRES_PASSWORD</w:t>
+      </w:r>
+      <w:r>
+        <w:rPr>
+          <w:rFonts w:ascii="Consolas" w:eastAsia="Times New Roman" w:hAnsi="Consolas" w:cs="Times New Roman"/>
+          <w:color w:val="C0CAF5"/>
+          <w:sz w:val="21"/>
+          <w:szCs w:val="21"/>
+        </w:rPr>
+        <w:t xml:space="preserve">: </w:t>
+      </w:r>
+      <w:proofErr w:type="spellStart"/>
+      <w:r>
+        <w:rPr>
+          <w:rFonts w:ascii="Consolas" w:eastAsia="Times New Roman" w:hAnsi="Consolas" w:cs="Times New Roman"/>
+          <w:color w:val="9ECE6A"/>
+          <w:sz w:val="21"/>
+          <w:szCs w:val="21"/>
+        </w:rPr>
+        <w:t>postgresql</w:t>
+      </w:r>
+      <w:proofErr w:type="spellEnd"/>
+    </w:p>
+    <w:p>
+      <w:pPr>
+        <w:shd w:val="clear" w:color="auto" w:fill="1A1B26"/>
+        <w:spacing w:after="0" w:line="285" w:lineRule="atLeast"/>
+        <w:ind w:firstLine="0"/>
+        <w:rPr>
+          <w:rFonts w:ascii="Consolas" w:eastAsia="Times New Roman" w:hAnsi="Consolas" w:cs="Times New Roman"/>
+          <w:color w:val="C0CAF5"/>
+          <w:sz w:val="21"/>
+          <w:szCs w:val="21"/>
+        </w:rPr>
+      </w:pPr>
+      <w:r>
+        <w:rPr>
+          <w:rFonts w:ascii="Consolas" w:eastAsia="Times New Roman" w:hAnsi="Consolas" w:cs="Times New Roman"/>
+          <w:color w:val="C0CAF5"/>
+          <w:sz w:val="21"/>
+          <w:szCs w:val="21"/>
+        </w:rPr>
+        <w:t xml:space="preserve">    </w:t>
+      </w:r>
+      <w:r>
+        <w:rPr>
+          <w:rFonts w:ascii="Consolas" w:eastAsia="Times New Roman" w:hAnsi="Consolas" w:cs="Times New Roman"/>
+          <w:color w:val="F7768E"/>
+          <w:sz w:val="21"/>
+          <w:szCs w:val="21"/>
+        </w:rPr>
+        <w:t>ports</w:t>
+      </w:r>
+      <w:r>
+        <w:rPr>
+          <w:rFonts w:ascii="Consolas" w:eastAsia="Times New Roman" w:hAnsi="Consolas" w:cs="Times New Roman"/>
+          <w:color w:val="C0CAF5"/>
+          <w:sz w:val="21"/>
+          <w:szCs w:val="21"/>
+        </w:rPr>
+        <w:t>:</w:t>
+      </w:r>
+    </w:p>
+    <w:p>
+      <w:pPr>
+        <w:shd w:val="clear" w:color="auto" w:fill="1A1B26"/>
+        <w:spacing w:after="0" w:line="285" w:lineRule="atLeast"/>
+        <w:ind w:firstLine="0"/>
+        <w:rPr>
+          <w:rFonts w:ascii="Consolas" w:eastAsia="Times New Roman" w:hAnsi="Consolas" w:cs="Times New Roman"/>
+          <w:color w:val="C0CAF5"/>
+          <w:sz w:val="21"/>
+          <w:szCs w:val="21"/>
+        </w:rPr>
+      </w:pPr>
+      <w:r>
+        <w:rPr>
+          <w:rFonts w:ascii="Consolas" w:eastAsia="Times New Roman" w:hAnsi="Consolas" w:cs="Times New Roman"/>
+          <w:color w:val="C0CAF5"/>
+          <w:sz w:val="21"/>
+          <w:szCs w:val="21"/>
+        </w:rPr>
+        <w:lastRenderedPageBreak/>
+        <w:t>      - "</w:t>
+      </w:r>
+      <w:r>
+        <w:rPr>
+          <w:rFonts w:ascii="Consolas" w:eastAsia="Times New Roman" w:hAnsi="Consolas" w:cs="Times New Roman"/>
+          <w:color w:val="9ECE6A"/>
+          <w:sz w:val="21"/>
+          <w:szCs w:val="21"/>
+        </w:rPr>
+        <w:t>5434:5432</w:t>
+      </w:r>
+      <w:r>
+        <w:rPr>
+          <w:rFonts w:ascii="Consolas" w:eastAsia="Times New Roman" w:hAnsi="Consolas" w:cs="Times New Roman"/>
+          <w:color w:val="C0CAF5"/>
+          <w:sz w:val="21"/>
+          <w:szCs w:val="21"/>
+        </w:rPr>
+        <w:t>"</w:t>
+      </w:r>
+    </w:p>
+    <w:p>
+      <w:pPr>
+        <w:shd w:val="clear" w:color="auto" w:fill="1A1B26"/>
+        <w:spacing w:after="0" w:line="285" w:lineRule="atLeast"/>
+        <w:ind w:firstLine="0"/>
+        <w:rPr>
+          <w:rFonts w:ascii="Consolas" w:eastAsia="Times New Roman" w:hAnsi="Consolas" w:cs="Times New Roman"/>
+          <w:color w:val="C0CAF5"/>
+          <w:sz w:val="21"/>
+          <w:szCs w:val="21"/>
+        </w:rPr>
+      </w:pPr>
+      <w:r>
+        <w:rPr>
+          <w:rFonts w:ascii="Consolas" w:eastAsia="Times New Roman" w:hAnsi="Consolas" w:cs="Times New Roman"/>
+          <w:color w:val="C0CAF5"/>
+          <w:sz w:val="21"/>
+          <w:szCs w:val="21"/>
+        </w:rPr>
+        <w:t xml:space="preserve">    </w:t>
+      </w:r>
+      <w:r>
+        <w:rPr>
+          <w:rFonts w:ascii="Consolas" w:eastAsia="Times New Roman" w:hAnsi="Consolas" w:cs="Times New Roman"/>
+          <w:color w:val="F7768E"/>
+          <w:sz w:val="21"/>
+          <w:szCs w:val="21"/>
+        </w:rPr>
+        <w:t>volumes</w:t>
+      </w:r>
+      <w:r>
+        <w:rPr>
+          <w:rFonts w:ascii="Consolas" w:eastAsia="Times New Roman" w:hAnsi="Consolas" w:cs="Times New Roman"/>
+          <w:color w:val="C0CAF5"/>
+          <w:sz w:val="21"/>
+          <w:szCs w:val="21"/>
+        </w:rPr>
+        <w:t>:</w:t>
+      </w:r>
+    </w:p>
+    <w:p>
+      <w:pPr>
+        <w:shd w:val="clear" w:color="auto" w:fill="1A1B26"/>
+        <w:spacing w:after="0" w:line="285" w:lineRule="atLeast"/>
+        <w:ind w:firstLine="0"/>
+        <w:rPr>
+          <w:rFonts w:ascii="Consolas" w:eastAsia="Times New Roman" w:hAnsi="Consolas" w:cs="Times New Roman"/>
+          <w:color w:val="C0CAF5"/>
+          <w:sz w:val="21"/>
+          <w:szCs w:val="21"/>
+        </w:rPr>
+      </w:pPr>
+      <w:r>
+        <w:rPr>
+          <w:rFonts w:ascii="Consolas" w:eastAsia="Times New Roman" w:hAnsi="Consolas" w:cs="Times New Roman"/>
+          <w:color w:val="C0CAF5"/>
+          <w:sz w:val="21"/>
+          <w:szCs w:val="21"/>
+        </w:rPr>
+        <w:t xml:space="preserve">      </w:t>
+      </w:r>
+      <w:proofErr w:type="gramStart"/>
+      <w:r>
+        <w:rPr>
+          <w:rFonts w:ascii="Consolas" w:eastAsia="Times New Roman" w:hAnsi="Consolas" w:cs="Times New Roman"/>
+          <w:color w:val="C0CAF5"/>
+          <w:sz w:val="21"/>
+          <w:szCs w:val="21"/>
+        </w:rPr>
+        <w:t xml:space="preserve">- </w:t>
+      </w:r>
+      <w:r>
+        <w:rPr>
+          <w:rFonts w:ascii="Consolas" w:eastAsia="Times New Roman" w:hAnsi="Consolas" w:cs="Times New Roman"/>
+          <w:color w:val="9ECE6A"/>
+          <w:sz w:val="21"/>
+          <w:szCs w:val="21"/>
+        </w:rPr>
+        <w:t>.</w:t>
+      </w:r>
+      <w:proofErr w:type="gramEnd"/>
+      <w:r>
+        <w:rPr>
+          <w:rFonts w:ascii="Consolas" w:eastAsia="Times New Roman" w:hAnsi="Consolas" w:cs="Times New Roman"/>
+          <w:color w:val="9ECE6A"/>
+          <w:sz w:val="21"/>
+          <w:szCs w:val="21"/>
+        </w:rPr>
+        <w:t>/</w:t>
+      </w:r>
+      <w:proofErr w:type="spellStart"/>
+      <w:r>
+        <w:rPr>
+          <w:rFonts w:ascii="Consolas" w:eastAsia="Times New Roman" w:hAnsi="Consolas" w:cs="Times New Roman"/>
+          <w:color w:val="9ECE6A"/>
+          <w:sz w:val="21"/>
+          <w:szCs w:val="21"/>
+        </w:rPr>
+        <w:t>postgres_data</w:t>
+      </w:r>
+      <w:proofErr w:type="spellEnd"/>
+      <w:r>
+        <w:rPr>
+          <w:rFonts w:ascii="Consolas" w:eastAsia="Times New Roman" w:hAnsi="Consolas" w:cs="Times New Roman"/>
+          <w:color w:val="9ECE6A"/>
+          <w:sz w:val="21"/>
+          <w:szCs w:val="21"/>
+        </w:rPr>
+        <w:t>:/var/lib/</w:t>
+      </w:r>
+      <w:proofErr w:type="spellStart"/>
+      <w:r>
+        <w:rPr>
+          <w:rFonts w:ascii="Consolas" w:eastAsia="Times New Roman" w:hAnsi="Consolas" w:cs="Times New Roman"/>
+          <w:color w:val="9ECE6A"/>
+          <w:sz w:val="21"/>
+          <w:szCs w:val="21"/>
+        </w:rPr>
+        <w:t>postgresql</w:t>
+      </w:r>
+      <w:proofErr w:type="spellEnd"/>
+      <w:r>
+        <w:rPr>
+          <w:rFonts w:ascii="Consolas" w:eastAsia="Times New Roman" w:hAnsi="Consolas" w:cs="Times New Roman"/>
+          <w:color w:val="9ECE6A"/>
+          <w:sz w:val="21"/>
+          <w:szCs w:val="21"/>
+        </w:rPr>
+        <w:t>/data</w:t>
+      </w:r>
+    </w:p>
+    <w:p>
+      <w:pPr>
+        <w:ind w:firstLine="0"/>
+        <w:rPr>
+          <w:rFonts w:ascii="Consolas" w:eastAsia="Times New Roman" w:hAnsi="Consolas" w:cs="Times New Roman"/>
+          <w:color w:val="auto"/>
+          <w:sz w:val="21"/>
+          <w:szCs w:val="21"/>
+        </w:rPr>
+      </w:pPr>
+    </w:p>
+    <w:p>
+      <w:pPr>
+        <w:ind w:firstLine="0"/>
+        <w:rPr>
+          <w:rFonts w:ascii="Consolas" w:eastAsia="Times New Roman" w:hAnsi="Consolas" w:cs="Times New Roman"/>
+          <w:color w:val="auto"/>
+          <w:sz w:val="21"/>
+          <w:szCs w:val="21"/>
+          <w:lang w:val="es-ES"/>
+        </w:rPr>
+      </w:pPr>
+      <w:r>
+        <w:rPr>
+          <w:rFonts w:ascii="Consolas" w:eastAsia="Times New Roman" w:hAnsi="Consolas" w:cs="Times New Roman"/>
+          <w:color w:val="auto"/>
+          <w:sz w:val="21"/>
+          <w:szCs w:val="21"/>
+          <w:lang w:val="es-ES"/>
+        </w:rPr>
+        <w:t>Inicializamos el contenedor con</w:t>
+      </w:r>
+      <w:r>
+        <w:rPr>
+          <w:rFonts w:ascii="Consolas" w:eastAsia="Times New Roman" w:hAnsi="Consolas" w:cs="Times New Roman"/>
+          <w:color w:val="auto"/>
+          <w:sz w:val="21"/>
+          <w:szCs w:val="21"/>
+          <w:lang w:val="es-ES"/>
+        </w:rPr>
+        <w:t xml:space="preserve">: </w:t>
+      </w:r>
+      <w:proofErr w:type="spellStart"/>
+      <w:r>
+        <w:rPr>
+          <w:rFonts w:ascii="Consolas" w:eastAsia="Times New Roman" w:hAnsi="Consolas" w:cs="Times New Roman"/>
+          <w:color w:val="auto"/>
+          <w:sz w:val="21"/>
+          <w:szCs w:val="21"/>
+          <w:lang w:val="es-ES"/>
+        </w:rPr>
+        <w:t>docker-compose</w:t>
+      </w:r>
+      <w:proofErr w:type="spellEnd"/>
+      <w:r>
+        <w:rPr>
+          <w:rFonts w:ascii="Consolas" w:eastAsia="Times New Roman" w:hAnsi="Consolas" w:cs="Times New Roman"/>
+          <w:color w:val="auto"/>
+          <w:sz w:val="21"/>
+          <w:szCs w:val="21"/>
+          <w:lang w:val="es-ES"/>
+        </w:rPr>
+        <w:t xml:space="preserve"> up -d</w:t>
+      </w:r>
+    </w:p>
+    <w:p>
+      <w:pPr>
+        <w:ind w:firstLine="0"/>
+        <w:rPr>
+          <w:rFonts w:ascii="Consolas" w:eastAsia="Times New Roman" w:hAnsi="Consolas" w:cs="Times New Roman"/>
+          <w:color w:val="auto"/>
+          <w:sz w:val="21"/>
+          <w:szCs w:val="21"/>
+          <w:lang w:val="es-ES"/>
+        </w:rPr>
+      </w:pPr>
+      <w:r>
+        <w:rPr>
+          <w:rFonts w:ascii="Consolas" w:eastAsia="Times New Roman" w:hAnsi="Consolas" w:cs="Times New Roman"/>
+          <w:color w:val="auto"/>
+          <w:sz w:val="21"/>
+          <w:szCs w:val="21"/>
+          <w:lang w:val="es-ES"/>
+        </w:rPr>
+        <w:t xml:space="preserve">Y luego realizamos los comandos para crear migraciones con </w:t>
+      </w:r>
+      <w:proofErr w:type="spellStart"/>
+      <w:r>
+        <w:rPr>
+          <w:rFonts w:ascii="Consolas" w:eastAsia="Times New Roman" w:hAnsi="Consolas" w:cs="Times New Roman"/>
+          <w:color w:val="auto"/>
+          <w:sz w:val="21"/>
+          <w:szCs w:val="21"/>
+          <w:lang w:val="es-ES"/>
+        </w:rPr>
+        <w:t>type</w:t>
+      </w:r>
+      <w:proofErr w:type="spellEnd"/>
+      <w:r>
+        <w:rPr>
+          <w:rFonts w:ascii="Consolas" w:eastAsia="Times New Roman" w:hAnsi="Consolas" w:cs="Times New Roman"/>
+          <w:color w:val="auto"/>
+          <w:sz w:val="21"/>
+          <w:szCs w:val="21"/>
+          <w:lang w:val="es-ES"/>
+        </w:rPr>
+        <w:t xml:space="preserve"> </w:t>
+      </w:r>
+      <w:proofErr w:type="spellStart"/>
+      <w:r>
+        <w:rPr>
+          <w:rFonts w:ascii="Consolas" w:eastAsia="Times New Roman" w:hAnsi="Consolas" w:cs="Times New Roman"/>
+          <w:color w:val="auto"/>
+          <w:sz w:val="21"/>
+          <w:szCs w:val="21"/>
+          <w:lang w:val="es-ES"/>
+        </w:rPr>
+        <w:t>orm</w:t>
+      </w:r>
+      <w:proofErr w:type="spellEnd"/>
+    </w:p>
+    <w:p>
+      <w:pPr>
+        <w:ind w:firstLine="0"/>
+        <w:rPr>
+          <w:rFonts w:ascii="Consolas" w:eastAsia="Times New Roman" w:hAnsi="Consolas" w:cs="Times New Roman"/>
+          <w:color w:val="auto"/>
+          <w:sz w:val="21"/>
+          <w:szCs w:val="21"/>
+          <w:lang w:val="es-ES"/>
+        </w:rPr>
+      </w:pPr>
+      <w:r>
+        <w:rPr>
+          <w:rFonts w:ascii="Consolas" w:eastAsia="Times New Roman" w:hAnsi="Consolas" w:cs="Times New Roman"/>
+          <w:color w:val="auto"/>
+          <w:sz w:val="21"/>
+          <w:szCs w:val="21"/>
+          <w:lang w:val="es-ES"/>
+        </w:rPr>
+        <w:t xml:space="preserve">Colocamos los comandos en </w:t>
+      </w:r>
+      <w:proofErr w:type="spellStart"/>
+      <w:r>
+        <w:rPr>
+          <w:rFonts w:ascii="Consolas" w:eastAsia="Times New Roman" w:hAnsi="Consolas" w:cs="Times New Roman"/>
+          <w:color w:val="auto"/>
+          <w:sz w:val="21"/>
+          <w:szCs w:val="21"/>
+          <w:lang w:val="es-ES"/>
+        </w:rPr>
+        <w:t>packejson</w:t>
+      </w:r>
+      <w:proofErr w:type="spellEnd"/>
+    </w:p>
+    <w:p>
+      <w:pPr>
+        <w:shd w:val="clear" w:color="auto" w:fill="1A1B26"/>
+        <w:spacing w:after="0" w:line="285" w:lineRule="atLeast"/>
+        <w:ind w:firstLine="0"/>
+        <w:rPr>
+          <w:rFonts w:ascii="Consolas" w:eastAsia="Times New Roman" w:hAnsi="Consolas" w:cs="Times New Roman"/>
+          <w:color w:val="C0CAF5"/>
+          <w:sz w:val="21"/>
+          <w:szCs w:val="21"/>
+        </w:rPr>
+      </w:pPr>
+      <w:r>
+        <w:rPr>
+          <w:rFonts w:ascii="Consolas" w:eastAsia="Times New Roman" w:hAnsi="Consolas" w:cs="Times New Roman"/>
+          <w:color w:val="C0CAF5"/>
+          <w:sz w:val="21"/>
+          <w:szCs w:val="21"/>
+        </w:rPr>
+        <w:t>    "</w:t>
+      </w:r>
+      <w:proofErr w:type="spellStart"/>
+      <w:r>
+        <w:rPr>
+          <w:rFonts w:ascii="Consolas" w:eastAsia="Times New Roman" w:hAnsi="Consolas" w:cs="Times New Roman"/>
+          <w:color w:val="7DCFFF"/>
+          <w:sz w:val="21"/>
+          <w:szCs w:val="21"/>
+        </w:rPr>
+        <w:t>typeorm</w:t>
+      </w:r>
+      <w:proofErr w:type="spellEnd"/>
+      <w:r>
+        <w:rPr>
+          <w:rFonts w:ascii="Consolas" w:eastAsia="Times New Roman" w:hAnsi="Consolas" w:cs="Times New Roman"/>
+          <w:color w:val="C0CAF5"/>
+          <w:sz w:val="21"/>
+          <w:szCs w:val="21"/>
+        </w:rPr>
+        <w:t>": "</w:t>
+      </w:r>
+      <w:proofErr w:type="spellStart"/>
+      <w:r>
+        <w:rPr>
+          <w:rFonts w:ascii="Consolas" w:eastAsia="Times New Roman" w:hAnsi="Consolas" w:cs="Times New Roman"/>
+          <w:color w:val="9ECE6A"/>
+          <w:sz w:val="21"/>
+          <w:szCs w:val="21"/>
+        </w:rPr>
+        <w:t>ts</w:t>
+      </w:r>
+      <w:proofErr w:type="spellEnd"/>
+      <w:r>
+        <w:rPr>
+          <w:rFonts w:ascii="Consolas" w:eastAsia="Times New Roman" w:hAnsi="Consolas" w:cs="Times New Roman"/>
+          <w:color w:val="9ECE6A"/>
+          <w:sz w:val="21"/>
+          <w:szCs w:val="21"/>
+        </w:rPr>
+        <w:t>-</w:t>
+      </w:r>
+      <w:proofErr w:type="gramStart"/>
+      <w:r>
+        <w:rPr>
+          <w:rFonts w:ascii="Consolas" w:eastAsia="Times New Roman" w:hAnsi="Consolas" w:cs="Times New Roman"/>
+          <w:color w:val="9ECE6A"/>
+          <w:sz w:val="21"/>
+          <w:szCs w:val="21"/>
+        </w:rPr>
+        <w:t>node .</w:t>
+      </w:r>
+      <w:proofErr w:type="gramEnd"/>
+      <w:r>
+        <w:rPr>
+          <w:rFonts w:ascii="Consolas" w:eastAsia="Times New Roman" w:hAnsi="Consolas" w:cs="Times New Roman"/>
+          <w:color w:val="9ECE6A"/>
+          <w:sz w:val="21"/>
+          <w:szCs w:val="21"/>
+        </w:rPr>
+        <w:t>/</w:t>
+      </w:r>
+      <w:proofErr w:type="spellStart"/>
+      <w:r>
+        <w:rPr>
+          <w:rFonts w:ascii="Consolas" w:eastAsia="Times New Roman" w:hAnsi="Consolas" w:cs="Times New Roman"/>
+          <w:color w:val="9ECE6A"/>
+          <w:sz w:val="21"/>
+          <w:szCs w:val="21"/>
+        </w:rPr>
+        <w:t>node_modules</w:t>
+      </w:r>
+      <w:proofErr w:type="spellEnd"/>
+      <w:r>
+        <w:rPr>
+          <w:rFonts w:ascii="Consolas" w:eastAsia="Times New Roman" w:hAnsi="Consolas" w:cs="Times New Roman"/>
+          <w:color w:val="9ECE6A"/>
+          <w:sz w:val="21"/>
+          <w:szCs w:val="21"/>
+        </w:rPr>
+        <w:t>/</w:t>
+      </w:r>
+      <w:proofErr w:type="spellStart"/>
+      <w:r>
+        <w:rPr>
+          <w:rFonts w:ascii="Consolas" w:eastAsia="Times New Roman" w:hAnsi="Consolas" w:cs="Times New Roman"/>
+          <w:color w:val="9ECE6A"/>
+          <w:sz w:val="21"/>
+          <w:szCs w:val="21"/>
+        </w:rPr>
+        <w:t>typeorm</w:t>
+      </w:r>
+      <w:proofErr w:type="spellEnd"/>
+      <w:r>
+        <w:rPr>
+          <w:rFonts w:ascii="Consolas" w:eastAsia="Times New Roman" w:hAnsi="Consolas" w:cs="Times New Roman"/>
+          <w:color w:val="9ECE6A"/>
+          <w:sz w:val="21"/>
+          <w:szCs w:val="21"/>
+        </w:rPr>
+        <w:t>/cli</w:t>
+      </w:r>
+      <w:r>
+        <w:rPr>
+          <w:rFonts w:ascii="Consolas" w:eastAsia="Times New Roman" w:hAnsi="Consolas" w:cs="Times New Roman"/>
+          <w:color w:val="C0CAF5"/>
+          <w:sz w:val="21"/>
+          <w:szCs w:val="21"/>
+        </w:rPr>
+        <w:t>",</w:t>
+      </w:r>
+    </w:p>
+    <w:p>
+      <w:pPr>
+        <w:shd w:val="clear" w:color="auto" w:fill="1A1B26"/>
+        <w:spacing w:after="0" w:line="285" w:lineRule="atLeast"/>
+        <w:ind w:firstLine="0"/>
+        <w:rPr>
+          <w:rFonts w:ascii="Consolas" w:eastAsia="Times New Roman" w:hAnsi="Consolas" w:cs="Times New Roman"/>
+          <w:color w:val="C0CAF5"/>
+          <w:sz w:val="21"/>
+          <w:szCs w:val="21"/>
+        </w:rPr>
+      </w:pPr>
+      <w:r>
+        <w:rPr>
+          <w:rFonts w:ascii="Consolas" w:eastAsia="Times New Roman" w:hAnsi="Consolas" w:cs="Times New Roman"/>
+          <w:color w:val="C0CAF5"/>
+          <w:sz w:val="21"/>
+          <w:szCs w:val="21"/>
+        </w:rPr>
+        <w:t>    "</w:t>
+      </w:r>
+      <w:proofErr w:type="spellStart"/>
+      <w:proofErr w:type="gramStart"/>
+      <w:r>
+        <w:rPr>
+          <w:rFonts w:ascii="Consolas" w:eastAsia="Times New Roman" w:hAnsi="Consolas" w:cs="Times New Roman"/>
+          <w:color w:val="7DCFFF"/>
+          <w:sz w:val="21"/>
+          <w:szCs w:val="21"/>
+        </w:rPr>
+        <w:t>migration:run</w:t>
+      </w:r>
+      <w:proofErr w:type="spellEnd"/>
+      <w:proofErr w:type="gramEnd"/>
+      <w:r>
+        <w:rPr>
+          <w:rFonts w:ascii="Consolas" w:eastAsia="Times New Roman" w:hAnsi="Consolas" w:cs="Times New Roman"/>
+          <w:color w:val="C0CAF5"/>
+          <w:sz w:val="21"/>
+          <w:szCs w:val="21"/>
+        </w:rPr>
+        <w:t>": "</w:t>
+      </w:r>
+      <w:proofErr w:type="spellStart"/>
+      <w:r>
+        <w:rPr>
+          <w:rFonts w:ascii="Consolas" w:eastAsia="Times New Roman" w:hAnsi="Consolas" w:cs="Times New Roman"/>
+          <w:color w:val="9ECE6A"/>
+          <w:sz w:val="21"/>
+          <w:szCs w:val="21"/>
+        </w:rPr>
+        <w:t>npm</w:t>
+      </w:r>
+      <w:proofErr w:type="spellEnd"/>
+      <w:r>
+        <w:rPr>
+          <w:rFonts w:ascii="Consolas" w:eastAsia="Times New Roman" w:hAnsi="Consolas" w:cs="Times New Roman"/>
+          <w:color w:val="9ECE6A"/>
+          <w:sz w:val="21"/>
+          <w:szCs w:val="21"/>
+        </w:rPr>
+        <w:t xml:space="preserve"> run </w:t>
+      </w:r>
+      <w:proofErr w:type="spellStart"/>
+      <w:r>
+        <w:rPr>
+          <w:rFonts w:ascii="Consolas" w:eastAsia="Times New Roman" w:hAnsi="Consolas" w:cs="Times New Roman"/>
+          <w:color w:val="9ECE6A"/>
+          <w:sz w:val="21"/>
+          <w:szCs w:val="21"/>
+        </w:rPr>
+        <w:t>typeorm</w:t>
+      </w:r>
+      <w:proofErr w:type="spellEnd"/>
+      <w:r>
+        <w:rPr>
+          <w:rFonts w:ascii="Consolas" w:eastAsia="Times New Roman" w:hAnsi="Consolas" w:cs="Times New Roman"/>
+          <w:color w:val="9ECE6A"/>
+          <w:sz w:val="21"/>
+          <w:szCs w:val="21"/>
+        </w:rPr>
+        <w:t xml:space="preserve"> </w:t>
+      </w:r>
+      <w:proofErr w:type="spellStart"/>
+      <w:r>
+        <w:rPr>
+          <w:rFonts w:ascii="Consolas" w:eastAsia="Times New Roman" w:hAnsi="Consolas" w:cs="Times New Roman"/>
+          <w:color w:val="9ECE6A"/>
+          <w:sz w:val="21"/>
+          <w:szCs w:val="21"/>
+        </w:rPr>
+        <w:t>migration:run</w:t>
+      </w:r>
+      <w:proofErr w:type="spellEnd"/>
+      <w:r>
+        <w:rPr>
+          <w:rFonts w:ascii="Consolas" w:eastAsia="Times New Roman" w:hAnsi="Consolas" w:cs="Times New Roman"/>
+          <w:color w:val="9ECE6A"/>
+          <w:sz w:val="21"/>
+          <w:szCs w:val="21"/>
+        </w:rPr>
+        <w:t xml:space="preserve"> -- -d ./</w:t>
+      </w:r>
+      <w:proofErr w:type="spellStart"/>
+      <w:r>
+        <w:rPr>
+          <w:rFonts w:ascii="Consolas" w:eastAsia="Times New Roman" w:hAnsi="Consolas" w:cs="Times New Roman"/>
+          <w:color w:val="9ECE6A"/>
+          <w:sz w:val="21"/>
+          <w:szCs w:val="21"/>
+        </w:rPr>
+        <w:t>typeorm.config.ts</w:t>
+      </w:r>
+      <w:proofErr w:type="spellEnd"/>
+      <w:r>
+        <w:rPr>
+          <w:rFonts w:ascii="Consolas" w:eastAsia="Times New Roman" w:hAnsi="Consolas" w:cs="Times New Roman"/>
+          <w:color w:val="C0CAF5"/>
+          <w:sz w:val="21"/>
+          <w:szCs w:val="21"/>
+        </w:rPr>
+        <w:t>",</w:t>
+      </w:r>
+    </w:p>
+    <w:p>
+      <w:pPr>
+        <w:shd w:val="clear" w:color="auto" w:fill="1A1B26"/>
+        <w:spacing w:after="0" w:line="285" w:lineRule="atLeast"/>
+        <w:ind w:firstLine="0"/>
+        <w:rPr>
+          <w:rFonts w:ascii="Consolas" w:eastAsia="Times New Roman" w:hAnsi="Consolas" w:cs="Times New Roman"/>
+          <w:color w:val="C0CAF5"/>
+          <w:sz w:val="21"/>
+          <w:szCs w:val="21"/>
+        </w:rPr>
+      </w:pPr>
+      <w:r>
+        <w:rPr>
+          <w:rFonts w:ascii="Consolas" w:eastAsia="Times New Roman" w:hAnsi="Consolas" w:cs="Times New Roman"/>
+          <w:color w:val="C0CAF5"/>
+          <w:sz w:val="21"/>
+          <w:szCs w:val="21"/>
+        </w:rPr>
+        <w:t>    "</w:t>
+      </w:r>
+      <w:proofErr w:type="spellStart"/>
+      <w:proofErr w:type="gramStart"/>
+      <w:r>
+        <w:rPr>
+          <w:rFonts w:ascii="Consolas" w:eastAsia="Times New Roman" w:hAnsi="Consolas" w:cs="Times New Roman"/>
+          <w:color w:val="7DCFFF"/>
+          <w:sz w:val="21"/>
+          <w:szCs w:val="21"/>
+        </w:rPr>
+        <w:t>migration:generate</w:t>
+      </w:r>
+      <w:proofErr w:type="spellEnd"/>
+      <w:proofErr w:type="gramEnd"/>
+      <w:r>
+        <w:rPr>
+          <w:rFonts w:ascii="Consolas" w:eastAsia="Times New Roman" w:hAnsi="Consolas" w:cs="Times New Roman"/>
+          <w:color w:val="C0CAF5"/>
+          <w:sz w:val="21"/>
+          <w:szCs w:val="21"/>
+        </w:rPr>
+        <w:t>": "</w:t>
+      </w:r>
+      <w:proofErr w:type="spellStart"/>
+      <w:r>
+        <w:rPr>
+          <w:rFonts w:ascii="Consolas" w:eastAsia="Times New Roman" w:hAnsi="Consolas" w:cs="Times New Roman"/>
+          <w:color w:val="9ECE6A"/>
+          <w:sz w:val="21"/>
+          <w:szCs w:val="21"/>
+        </w:rPr>
+        <w:t>npm</w:t>
+      </w:r>
+      <w:proofErr w:type="spellEnd"/>
+      <w:r>
+        <w:rPr>
+          <w:rFonts w:ascii="Consolas" w:eastAsia="Times New Roman" w:hAnsi="Consolas" w:cs="Times New Roman"/>
+          <w:color w:val="9ECE6A"/>
+          <w:sz w:val="21"/>
+          <w:szCs w:val="21"/>
+        </w:rPr>
+        <w:t xml:space="preserve"> run </w:t>
+      </w:r>
+      <w:proofErr w:type="spellStart"/>
+      <w:r>
+        <w:rPr>
+          <w:rFonts w:ascii="Consolas" w:eastAsia="Times New Roman" w:hAnsi="Consolas" w:cs="Times New Roman"/>
+          <w:color w:val="9ECE6A"/>
+          <w:sz w:val="21"/>
+          <w:szCs w:val="21"/>
+        </w:rPr>
+        <w:t>typeorm</w:t>
+      </w:r>
+      <w:proofErr w:type="spellEnd"/>
+      <w:r>
+        <w:rPr>
+          <w:rFonts w:ascii="Consolas" w:eastAsia="Times New Roman" w:hAnsi="Consolas" w:cs="Times New Roman"/>
+          <w:color w:val="9ECE6A"/>
+          <w:sz w:val="21"/>
+          <w:szCs w:val="21"/>
+        </w:rPr>
+        <w:t xml:space="preserve"> -- -d ./</w:t>
+      </w:r>
+      <w:proofErr w:type="spellStart"/>
+      <w:r>
+        <w:rPr>
+          <w:rFonts w:ascii="Consolas" w:eastAsia="Times New Roman" w:hAnsi="Consolas" w:cs="Times New Roman"/>
+          <w:color w:val="9ECE6A"/>
+          <w:sz w:val="21"/>
+          <w:szCs w:val="21"/>
+        </w:rPr>
+        <w:t>typeorm.config.ts</w:t>
+      </w:r>
+      <w:proofErr w:type="spellEnd"/>
+      <w:r>
+        <w:rPr>
+          <w:rFonts w:ascii="Consolas" w:eastAsia="Times New Roman" w:hAnsi="Consolas" w:cs="Times New Roman"/>
+          <w:color w:val="9ECE6A"/>
+          <w:sz w:val="21"/>
+          <w:szCs w:val="21"/>
+        </w:rPr>
+        <w:t xml:space="preserve"> </w:t>
+      </w:r>
+      <w:proofErr w:type="spellStart"/>
+      <w:r>
+        <w:rPr>
+          <w:rFonts w:ascii="Consolas" w:eastAsia="Times New Roman" w:hAnsi="Consolas" w:cs="Times New Roman"/>
+          <w:color w:val="9ECE6A"/>
+          <w:sz w:val="21"/>
+          <w:szCs w:val="21"/>
+        </w:rPr>
+        <w:t>migration:generate</w:t>
+      </w:r>
+      <w:proofErr w:type="spellEnd"/>
+      <w:r>
+        <w:rPr>
+          <w:rFonts w:ascii="Consolas" w:eastAsia="Times New Roman" w:hAnsi="Consolas" w:cs="Times New Roman"/>
+          <w:color w:val="9ECE6A"/>
+          <w:sz w:val="21"/>
+          <w:szCs w:val="21"/>
+        </w:rPr>
+        <w:t xml:space="preserve"> ./</w:t>
+      </w:r>
+      <w:proofErr w:type="spellStart"/>
+      <w:r>
+        <w:rPr>
+          <w:rFonts w:ascii="Consolas" w:eastAsia="Times New Roman" w:hAnsi="Consolas" w:cs="Times New Roman"/>
+          <w:color w:val="9ECE6A"/>
+          <w:sz w:val="21"/>
+          <w:szCs w:val="21"/>
+        </w:rPr>
+        <w:t>src</w:t>
+      </w:r>
+      <w:proofErr w:type="spellEnd"/>
+      <w:r>
+        <w:rPr>
+          <w:rFonts w:ascii="Consolas" w:eastAsia="Times New Roman" w:hAnsi="Consolas" w:cs="Times New Roman"/>
+          <w:color w:val="9ECE6A"/>
+          <w:sz w:val="21"/>
+          <w:szCs w:val="21"/>
+        </w:rPr>
+        <w:t>/database/migrations/%</w:t>
+      </w:r>
+      <w:proofErr w:type="spellStart"/>
+      <w:r>
+        <w:rPr>
+          <w:rFonts w:ascii="Consolas" w:eastAsia="Times New Roman" w:hAnsi="Consolas" w:cs="Times New Roman"/>
+          <w:color w:val="9ECE6A"/>
+          <w:sz w:val="21"/>
+          <w:szCs w:val="21"/>
+        </w:rPr>
+        <w:t>npm_config_name</w:t>
+      </w:r>
+      <w:proofErr w:type="spellEnd"/>
+      <w:r>
+        <w:rPr>
+          <w:rFonts w:ascii="Consolas" w:eastAsia="Times New Roman" w:hAnsi="Consolas" w:cs="Times New Roman"/>
+          <w:color w:val="9ECE6A"/>
+          <w:sz w:val="21"/>
+          <w:szCs w:val="21"/>
+        </w:rPr>
+        <w:t>%</w:t>
+      </w:r>
+      <w:r>
+        <w:rPr>
+          <w:rFonts w:ascii="Consolas" w:eastAsia="Times New Roman" w:hAnsi="Consolas" w:cs="Times New Roman"/>
+          <w:color w:val="C0CAF5"/>
+          <w:sz w:val="21"/>
+          <w:szCs w:val="21"/>
+        </w:rPr>
+        <w:t>",</w:t>
+      </w:r>
+    </w:p>
+    <w:p>
+      <w:pPr>
+        <w:shd w:val="clear" w:color="auto" w:fill="1A1B26"/>
+        <w:spacing w:after="0" w:line="285" w:lineRule="atLeast"/>
+        <w:ind w:firstLine="0"/>
+        <w:rPr>
+          <w:rFonts w:ascii="Consolas" w:eastAsia="Times New Roman" w:hAnsi="Consolas" w:cs="Times New Roman"/>
+          <w:color w:val="C0CAF5"/>
+          <w:sz w:val="21"/>
+          <w:szCs w:val="21"/>
+        </w:rPr>
+      </w:pPr>
+      <w:r>
+        <w:rPr>
+          <w:rFonts w:ascii="Consolas" w:eastAsia="Times New Roman" w:hAnsi="Consolas" w:cs="Times New Roman"/>
+          <w:color w:val="C0CAF5"/>
+          <w:sz w:val="21"/>
+          <w:szCs w:val="21"/>
+        </w:rPr>
+        <w:t>    "</w:t>
+      </w:r>
+      <w:proofErr w:type="spellStart"/>
+      <w:proofErr w:type="gramStart"/>
+      <w:r>
+        <w:rPr>
+          <w:rFonts w:ascii="Consolas" w:eastAsia="Times New Roman" w:hAnsi="Consolas" w:cs="Times New Roman"/>
+          <w:color w:val="7DCFFF"/>
+          <w:sz w:val="21"/>
+          <w:szCs w:val="21"/>
+        </w:rPr>
+        <w:t>migration:create</w:t>
+      </w:r>
+      <w:proofErr w:type="spellEnd"/>
+      <w:proofErr w:type="gramEnd"/>
+      <w:r>
+        <w:rPr>
+          <w:rFonts w:ascii="Consolas" w:eastAsia="Times New Roman" w:hAnsi="Consolas" w:cs="Times New Roman"/>
+          <w:color w:val="C0CAF5"/>
+          <w:sz w:val="21"/>
+          <w:szCs w:val="21"/>
+        </w:rPr>
+        <w:t>": "</w:t>
+      </w:r>
+      <w:proofErr w:type="spellStart"/>
+      <w:r>
+        <w:rPr>
+          <w:rFonts w:ascii="Consolas" w:eastAsia="Times New Roman" w:hAnsi="Consolas" w:cs="Times New Roman"/>
+          <w:color w:val="9ECE6A"/>
+          <w:sz w:val="21"/>
+          <w:szCs w:val="21"/>
+        </w:rPr>
+        <w:t>npm</w:t>
+      </w:r>
+      <w:proofErr w:type="spellEnd"/>
+      <w:r>
+        <w:rPr>
+          <w:rFonts w:ascii="Consolas" w:eastAsia="Times New Roman" w:hAnsi="Consolas" w:cs="Times New Roman"/>
+          <w:color w:val="9ECE6A"/>
+          <w:sz w:val="21"/>
+          <w:szCs w:val="21"/>
+        </w:rPr>
+        <w:t xml:space="preserve"> run </w:t>
+      </w:r>
+      <w:proofErr w:type="spellStart"/>
+      <w:r>
+        <w:rPr>
+          <w:rFonts w:ascii="Consolas" w:eastAsia="Times New Roman" w:hAnsi="Consolas" w:cs="Times New Roman"/>
+          <w:color w:val="9ECE6A"/>
+          <w:sz w:val="21"/>
+          <w:szCs w:val="21"/>
+        </w:rPr>
+        <w:t>typeorm</w:t>
+      </w:r>
+      <w:proofErr w:type="spellEnd"/>
+      <w:r>
+        <w:rPr>
+          <w:rFonts w:ascii="Consolas" w:eastAsia="Times New Roman" w:hAnsi="Consolas" w:cs="Times New Roman"/>
+          <w:color w:val="9ECE6A"/>
+          <w:sz w:val="21"/>
+          <w:szCs w:val="21"/>
+        </w:rPr>
+        <w:t xml:space="preserve"> -- </w:t>
+      </w:r>
+      <w:proofErr w:type="spellStart"/>
+      <w:r>
+        <w:rPr>
+          <w:rFonts w:ascii="Consolas" w:eastAsia="Times New Roman" w:hAnsi="Consolas" w:cs="Times New Roman"/>
+          <w:color w:val="9ECE6A"/>
+          <w:sz w:val="21"/>
+          <w:szCs w:val="21"/>
+        </w:rPr>
+        <w:t>migration:create</w:t>
+      </w:r>
+      <w:proofErr w:type="spellEnd"/>
+      <w:r>
+        <w:rPr>
+          <w:rFonts w:ascii="Consolas" w:eastAsia="Times New Roman" w:hAnsi="Consolas" w:cs="Times New Roman"/>
+          <w:color w:val="9ECE6A"/>
+          <w:sz w:val="21"/>
+          <w:szCs w:val="21"/>
+        </w:rPr>
+        <w:t xml:space="preserve"> ./</w:t>
+      </w:r>
+      <w:proofErr w:type="spellStart"/>
+      <w:r>
+        <w:rPr>
+          <w:rFonts w:ascii="Consolas" w:eastAsia="Times New Roman" w:hAnsi="Consolas" w:cs="Times New Roman"/>
+          <w:color w:val="9ECE6A"/>
+          <w:sz w:val="21"/>
+          <w:szCs w:val="21"/>
+        </w:rPr>
+        <w:t>src</w:t>
+      </w:r>
+      <w:proofErr w:type="spellEnd"/>
+      <w:r>
+        <w:rPr>
+          <w:rFonts w:ascii="Consolas" w:eastAsia="Times New Roman" w:hAnsi="Consolas" w:cs="Times New Roman"/>
+          <w:color w:val="9ECE6A"/>
+          <w:sz w:val="21"/>
+          <w:szCs w:val="21"/>
+        </w:rPr>
+        <w:t>/database/migrations/%</w:t>
+      </w:r>
+      <w:proofErr w:type="spellStart"/>
+      <w:r>
+        <w:rPr>
+          <w:rFonts w:ascii="Consolas" w:eastAsia="Times New Roman" w:hAnsi="Consolas" w:cs="Times New Roman"/>
+          <w:color w:val="9ECE6A"/>
+          <w:sz w:val="21"/>
+          <w:szCs w:val="21"/>
+        </w:rPr>
+        <w:t>npm_config_name</w:t>
+      </w:r>
+      <w:proofErr w:type="spellEnd"/>
+      <w:r>
+        <w:rPr>
+          <w:rFonts w:ascii="Consolas" w:eastAsia="Times New Roman" w:hAnsi="Consolas" w:cs="Times New Roman"/>
+          <w:color w:val="9ECE6A"/>
+          <w:sz w:val="21"/>
+          <w:szCs w:val="21"/>
+        </w:rPr>
+        <w:t>%</w:t>
+      </w:r>
+      <w:r>
+        <w:rPr>
+          <w:rFonts w:ascii="Consolas" w:eastAsia="Times New Roman" w:hAnsi="Consolas" w:cs="Times New Roman"/>
+          <w:color w:val="C0CAF5"/>
+          <w:sz w:val="21"/>
+          <w:szCs w:val="21"/>
+        </w:rPr>
+        <w:t>",</w:t>
+      </w:r>
+    </w:p>
+    <w:p>
+      <w:pPr>
+        <w:shd w:val="clear" w:color="auto" w:fill="1A1B26"/>
+        <w:spacing w:after="0" w:line="285" w:lineRule="atLeast"/>
+        <w:ind w:firstLine="0"/>
+        <w:rPr>
+          <w:rFonts w:ascii="Consolas" w:eastAsia="Times New Roman" w:hAnsi="Consolas" w:cs="Times New Roman"/>
+          <w:color w:val="C0CAF5"/>
+          <w:sz w:val="21"/>
+          <w:szCs w:val="21"/>
+        </w:rPr>
+      </w:pPr>
+      <w:r>
+        <w:rPr>
+          <w:rFonts w:ascii="Consolas" w:eastAsia="Times New Roman" w:hAnsi="Consolas" w:cs="Times New Roman"/>
+          <w:color w:val="C0CAF5"/>
+          <w:sz w:val="21"/>
+          <w:szCs w:val="21"/>
+        </w:rPr>
+        <w:t>    "</w:t>
+      </w:r>
+      <w:proofErr w:type="spellStart"/>
+      <w:proofErr w:type="gramStart"/>
+      <w:r>
+        <w:rPr>
+          <w:rFonts w:ascii="Consolas" w:eastAsia="Times New Roman" w:hAnsi="Consolas" w:cs="Times New Roman"/>
+          <w:color w:val="7DCFFF"/>
+          <w:sz w:val="21"/>
+          <w:szCs w:val="21"/>
+        </w:rPr>
+        <w:t>migration:revert</w:t>
+      </w:r>
+      <w:proofErr w:type="spellEnd"/>
+      <w:proofErr w:type="gramEnd"/>
+      <w:r>
+        <w:rPr>
+          <w:rFonts w:ascii="Consolas" w:eastAsia="Times New Roman" w:hAnsi="Consolas" w:cs="Times New Roman"/>
+          <w:color w:val="C0CAF5"/>
+          <w:sz w:val="21"/>
+          <w:szCs w:val="21"/>
+        </w:rPr>
+        <w:t>": "</w:t>
+      </w:r>
+      <w:proofErr w:type="spellStart"/>
+      <w:r>
+        <w:rPr>
+          <w:rFonts w:ascii="Consolas" w:eastAsia="Times New Roman" w:hAnsi="Consolas" w:cs="Times New Roman"/>
+          <w:color w:val="9ECE6A"/>
+          <w:sz w:val="21"/>
+          <w:szCs w:val="21"/>
+        </w:rPr>
+        <w:t>npm</w:t>
+      </w:r>
+      <w:proofErr w:type="spellEnd"/>
+      <w:r>
+        <w:rPr>
+          <w:rFonts w:ascii="Consolas" w:eastAsia="Times New Roman" w:hAnsi="Consolas" w:cs="Times New Roman"/>
+          <w:color w:val="9ECE6A"/>
+          <w:sz w:val="21"/>
+          <w:szCs w:val="21"/>
+        </w:rPr>
+        <w:t xml:space="preserve"> run </w:t>
+      </w:r>
+      <w:proofErr w:type="spellStart"/>
+      <w:r>
+        <w:rPr>
+          <w:rFonts w:ascii="Consolas" w:eastAsia="Times New Roman" w:hAnsi="Consolas" w:cs="Times New Roman"/>
+          <w:color w:val="9ECE6A"/>
+          <w:sz w:val="21"/>
+          <w:szCs w:val="21"/>
+        </w:rPr>
+        <w:t>typeorm</w:t>
+      </w:r>
+      <w:proofErr w:type="spellEnd"/>
+      <w:r>
+        <w:rPr>
+          <w:rFonts w:ascii="Consolas" w:eastAsia="Times New Roman" w:hAnsi="Consolas" w:cs="Times New Roman"/>
+          <w:color w:val="9ECE6A"/>
+          <w:sz w:val="21"/>
+          <w:szCs w:val="21"/>
+        </w:rPr>
+        <w:t xml:space="preserve"> -- -d ./</w:t>
+      </w:r>
+      <w:proofErr w:type="spellStart"/>
+      <w:r>
+        <w:rPr>
+          <w:rFonts w:ascii="Consolas" w:eastAsia="Times New Roman" w:hAnsi="Consolas" w:cs="Times New Roman"/>
+          <w:color w:val="9ECE6A"/>
+          <w:sz w:val="21"/>
+          <w:szCs w:val="21"/>
+        </w:rPr>
+        <w:t>typeorm.config.ts</w:t>
+      </w:r>
+      <w:proofErr w:type="spellEnd"/>
+      <w:r>
+        <w:rPr>
+          <w:rFonts w:ascii="Consolas" w:eastAsia="Times New Roman" w:hAnsi="Consolas" w:cs="Times New Roman"/>
+          <w:color w:val="9ECE6A"/>
+          <w:sz w:val="21"/>
+          <w:szCs w:val="21"/>
+        </w:rPr>
+        <w:t xml:space="preserve"> </w:t>
+      </w:r>
+      <w:proofErr w:type="spellStart"/>
+      <w:r>
+        <w:rPr>
+          <w:rFonts w:ascii="Consolas" w:eastAsia="Times New Roman" w:hAnsi="Consolas" w:cs="Times New Roman"/>
+          <w:color w:val="9ECE6A"/>
+          <w:sz w:val="21"/>
+          <w:szCs w:val="21"/>
+        </w:rPr>
+        <w:t>migration:revert</w:t>
+      </w:r>
+      <w:proofErr w:type="spellEnd"/>
+      <w:r>
+        <w:rPr>
+          <w:rFonts w:ascii="Consolas" w:eastAsia="Times New Roman" w:hAnsi="Consolas" w:cs="Times New Roman"/>
+          <w:color w:val="C0CAF5"/>
+          <w:sz w:val="21"/>
+          <w:szCs w:val="21"/>
+        </w:rPr>
+        <w:t>"</w:t>
+      </w:r>
+    </w:p>
+    <w:p>
+      <w:pPr>
+        <w:ind w:firstLine="0"/>
+        <w:rPr>
+          <w:rFonts w:ascii="Consolas" w:eastAsia="Times New Roman" w:hAnsi="Consolas" w:cs="Times New Roman"/>
+          <w:color w:val="auto"/>
+          <w:sz w:val="21"/>
+          <w:szCs w:val="21"/>
+        </w:rPr>
+      </w:pPr>
+    </w:p>
+    <w:p>
+      <w:pPr>
+        <w:ind w:firstLine="0"/>
+        <w:rPr>
+          <w:rFonts w:ascii="Consolas" w:eastAsia="Times New Roman" w:hAnsi="Consolas" w:cs="Times New Roman"/>
+          <w:b/>
+          <w:bCs/>
+          <w:color w:val="auto"/>
+          <w:sz w:val="21"/>
+          <w:szCs w:val="21"/>
+          <w:lang w:val="es-ES"/>
+        </w:rPr>
+      </w:pPr>
+      <w:r>
+        <w:rPr>
+          <w:rFonts w:ascii="Consolas" w:eastAsia="Times New Roman" w:hAnsi="Consolas" w:cs="Times New Roman"/>
+          <w:color w:val="auto"/>
+          <w:sz w:val="21"/>
+          <w:szCs w:val="21"/>
+          <w:lang w:val="es-ES"/>
+        </w:rPr>
+        <w:t xml:space="preserve">Luego instalamos </w:t>
+      </w:r>
+      <w:proofErr w:type="spellStart"/>
+      <w:r>
+        <w:rPr>
+          <w:rFonts w:ascii="Consolas" w:eastAsia="Times New Roman" w:hAnsi="Consolas" w:cs="Times New Roman"/>
+          <w:color w:val="auto"/>
+          <w:sz w:val="21"/>
+          <w:szCs w:val="21"/>
+          <w:lang w:val="es-ES"/>
+        </w:rPr>
+        <w:t>typeorm</w:t>
+      </w:r>
+      <w:proofErr w:type="spellEnd"/>
+      <w:r>
+        <w:rPr>
+          <w:rFonts w:ascii="Consolas" w:eastAsia="Times New Roman" w:hAnsi="Consolas" w:cs="Times New Roman"/>
+          <w:color w:val="auto"/>
+          <w:sz w:val="21"/>
+          <w:szCs w:val="21"/>
+          <w:lang w:val="es-ES"/>
+        </w:rPr>
+        <w:t xml:space="preserve"> con</w:t>
+      </w:r>
+      <w:r>
+        <w:rPr>
+          <w:rFonts w:ascii="Consolas" w:eastAsia="Times New Roman" w:hAnsi="Consolas" w:cs="Times New Roman"/>
+          <w:color w:val="auto"/>
+          <w:sz w:val="21"/>
+          <w:szCs w:val="21"/>
+          <w:lang w:val="es-ES"/>
+        </w:rPr>
+        <w:t xml:space="preserve">: </w:t>
+      </w:r>
+      <w:proofErr w:type="spellStart"/>
+      <w:r>
+        <w:rPr>
+          <w:rFonts w:ascii="Consolas" w:eastAsia="Times New Roman" w:hAnsi="Consolas" w:cs="Times New Roman"/>
+          <w:b/>
+          <w:bCs/>
+          <w:color w:val="auto"/>
+          <w:sz w:val="21"/>
+          <w:szCs w:val="21"/>
+          <w:lang w:val="es-ES"/>
+        </w:rPr>
+        <w:t>yarn</w:t>
+      </w:r>
+      <w:proofErr w:type="spellEnd"/>
+      <w:r>
+        <w:rPr>
+          <w:rFonts w:ascii="Consolas" w:eastAsia="Times New Roman" w:hAnsi="Consolas" w:cs="Times New Roman"/>
+          <w:b/>
+          <w:bCs/>
+          <w:color w:val="auto"/>
+          <w:sz w:val="21"/>
+          <w:szCs w:val="21"/>
+          <w:lang w:val="es-ES"/>
+        </w:rPr>
+        <w:t xml:space="preserve"> </w:t>
+      </w:r>
+      <w:proofErr w:type="spellStart"/>
+      <w:r>
+        <w:rPr>
+          <w:rFonts w:ascii="Consolas" w:eastAsia="Times New Roman" w:hAnsi="Consolas" w:cs="Times New Roman"/>
+          <w:b/>
+          <w:bCs/>
+          <w:color w:val="auto"/>
+          <w:sz w:val="21"/>
+          <w:szCs w:val="21"/>
+          <w:lang w:val="es-ES"/>
+        </w:rPr>
+        <w:t>add</w:t>
+      </w:r>
+      <w:proofErr w:type="spellEnd"/>
+      <w:r>
+        <w:rPr>
+          <w:rFonts w:ascii="Consolas" w:eastAsia="Times New Roman" w:hAnsi="Consolas" w:cs="Times New Roman"/>
+          <w:b/>
+          <w:bCs/>
+          <w:color w:val="auto"/>
+          <w:sz w:val="21"/>
+          <w:szCs w:val="21"/>
+          <w:lang w:val="es-ES"/>
+        </w:rPr>
+        <w:t xml:space="preserve"> @nestjs/typeorm </w:t>
+      </w:r>
+      <w:proofErr w:type="spellStart"/>
+      <w:r>
+        <w:rPr>
+          <w:rFonts w:ascii="Consolas" w:eastAsia="Times New Roman" w:hAnsi="Consolas" w:cs="Times New Roman"/>
+          <w:b/>
+          <w:bCs/>
+          <w:color w:val="auto"/>
+          <w:sz w:val="21"/>
+          <w:szCs w:val="21"/>
+          <w:lang w:val="es-ES"/>
+        </w:rPr>
+        <w:t>typeorm</w:t>
+      </w:r>
+      <w:proofErr w:type="spellEnd"/>
+      <w:r>
+        <w:rPr>
+          <w:rFonts w:ascii="Consolas" w:eastAsia="Times New Roman" w:hAnsi="Consolas" w:cs="Times New Roman"/>
+          <w:b/>
+          <w:bCs/>
+          <w:color w:val="auto"/>
+          <w:sz w:val="21"/>
+          <w:szCs w:val="21"/>
+          <w:lang w:val="es-ES"/>
+        </w:rPr>
+        <w:t xml:space="preserve"> </w:t>
+      </w:r>
+      <w:proofErr w:type="spellStart"/>
+      <w:r>
+        <w:rPr>
+          <w:rFonts w:ascii="Consolas" w:eastAsia="Times New Roman" w:hAnsi="Consolas" w:cs="Times New Roman"/>
+          <w:b/>
+          <w:bCs/>
+          <w:color w:val="auto"/>
+          <w:sz w:val="21"/>
+          <w:szCs w:val="21"/>
+          <w:lang w:val="es-ES"/>
+        </w:rPr>
+        <w:t>pg</w:t>
+      </w:r>
+      <w:proofErr w:type="spellEnd"/>
+    </w:p>
+    <w:p>
+      <w:pPr>
+        <w:ind w:firstLine="0"/>
+        <w:rPr>
+          <w:rFonts w:ascii="Consolas" w:eastAsia="Times New Roman" w:hAnsi="Consolas" w:cs="Times New Roman"/>
+          <w:color w:val="auto"/>
+          <w:sz w:val="21"/>
+          <w:szCs w:val="21"/>
+          <w:lang w:val="es-ES"/>
+        </w:rPr>
+      </w:pPr>
+      <w:r>
+        <w:rPr>
+          <w:rFonts w:ascii="Consolas" w:eastAsia="Times New Roman" w:hAnsi="Consolas" w:cs="Times New Roman"/>
+          <w:color w:val="auto"/>
+          <w:sz w:val="21"/>
+          <w:szCs w:val="21"/>
+          <w:lang w:val="es-ES"/>
+        </w:rPr>
+        <w:t xml:space="preserve">Creamos los archivos </w:t>
+      </w:r>
+      <w:proofErr w:type="spellStart"/>
+      <w:r>
+        <w:rPr>
+          <w:rFonts w:ascii="Consolas" w:eastAsia="Times New Roman" w:hAnsi="Consolas" w:cs="Times New Roman"/>
+          <w:color w:val="auto"/>
+          <w:sz w:val="21"/>
+          <w:szCs w:val="21"/>
+          <w:lang w:val="es-ES"/>
+        </w:rPr>
+        <w:t>database</w:t>
+      </w:r>
+      <w:proofErr w:type="spellEnd"/>
+      <w:r>
+        <w:rPr>
+          <w:rFonts w:ascii="Consolas" w:eastAsia="Times New Roman" w:hAnsi="Consolas" w:cs="Times New Roman"/>
+          <w:color w:val="auto"/>
+          <w:sz w:val="21"/>
+          <w:szCs w:val="21"/>
+          <w:lang w:val="es-ES"/>
+        </w:rPr>
+        <w:t xml:space="preserve"> y allí dentro creamos el archivo </w:t>
+      </w:r>
+      <w:proofErr w:type="spellStart"/>
+      <w:r>
+        <w:rPr>
+          <w:rFonts w:ascii="Consolas" w:eastAsia="Times New Roman" w:hAnsi="Consolas" w:cs="Times New Roman"/>
+          <w:color w:val="auto"/>
+          <w:sz w:val="21"/>
+          <w:szCs w:val="21"/>
+          <w:lang w:val="es-ES"/>
+        </w:rPr>
+        <w:t>migrations</w:t>
+      </w:r>
+      <w:proofErr w:type="spellEnd"/>
+      <w:r>
+        <w:rPr>
+          <w:rFonts w:ascii="Consolas" w:eastAsia="Times New Roman" w:hAnsi="Consolas" w:cs="Times New Roman"/>
+          <w:color w:val="auto"/>
+          <w:sz w:val="21"/>
+          <w:szCs w:val="21"/>
+          <w:lang w:val="es-ES"/>
+        </w:rPr>
+        <w:t xml:space="preserve"> y luego creamos el archivo </w:t>
+      </w:r>
+      <w:proofErr w:type="spellStart"/>
+      <w:r>
+        <w:rPr>
+          <w:rFonts w:ascii="Consolas" w:eastAsia="Times New Roman" w:hAnsi="Consolas" w:cs="Times New Roman"/>
+          <w:color w:val="auto"/>
+          <w:sz w:val="21"/>
+          <w:szCs w:val="21"/>
+          <w:lang w:val="es-ES"/>
+        </w:rPr>
+        <w:t>typeorm.config.ts</w:t>
+      </w:r>
+      <w:proofErr w:type="spellEnd"/>
+      <w:r>
+        <w:rPr>
+          <w:rFonts w:ascii="Consolas" w:eastAsia="Times New Roman" w:hAnsi="Consolas" w:cs="Times New Roman"/>
+          <w:color w:val="auto"/>
+          <w:sz w:val="21"/>
+          <w:szCs w:val="21"/>
+          <w:lang w:val="es-ES"/>
+        </w:rPr>
+        <w:t xml:space="preserve"> y allí ponemos lo siguiente</w:t>
+      </w:r>
+    </w:p>
+    <w:p>
+      <w:pPr>
+        <w:shd w:val="clear" w:color="auto" w:fill="1A1B26"/>
+        <w:spacing w:after="0" w:line="285" w:lineRule="atLeast"/>
+        <w:ind w:firstLine="0"/>
+        <w:rPr>
+          <w:rFonts w:ascii="Consolas" w:eastAsia="Times New Roman" w:hAnsi="Consolas" w:cs="Times New Roman"/>
+          <w:color w:val="C0CAF5"/>
+          <w:sz w:val="21"/>
+          <w:szCs w:val="21"/>
+        </w:rPr>
+      </w:pPr>
+      <w:r>
+        <w:rPr>
+          <w:rFonts w:ascii="Consolas" w:eastAsia="Times New Roman" w:hAnsi="Consolas" w:cs="Times New Roman"/>
+          <w:color w:val="BB9AF7"/>
+          <w:sz w:val="21"/>
+          <w:szCs w:val="21"/>
+        </w:rPr>
+        <w:t>import</w:t>
+      </w:r>
+      <w:r>
+        <w:rPr>
+          <w:rFonts w:ascii="Consolas" w:eastAsia="Times New Roman" w:hAnsi="Consolas" w:cs="Times New Roman"/>
+          <w:color w:val="C0CAF5"/>
+          <w:sz w:val="21"/>
+          <w:szCs w:val="21"/>
+        </w:rPr>
+        <w:t xml:space="preserve"> {</w:t>
+      </w:r>
+      <w:proofErr w:type="spellStart"/>
+      <w:r>
+        <w:rPr>
+          <w:rFonts w:ascii="Consolas" w:eastAsia="Times New Roman" w:hAnsi="Consolas" w:cs="Times New Roman"/>
+          <w:color w:val="C0CAF5"/>
+          <w:sz w:val="21"/>
+          <w:szCs w:val="21"/>
+        </w:rPr>
+        <w:t>DataSource</w:t>
+      </w:r>
+      <w:proofErr w:type="spellEnd"/>
+      <w:r>
+        <w:rPr>
+          <w:rFonts w:ascii="Consolas" w:eastAsia="Times New Roman" w:hAnsi="Consolas" w:cs="Times New Roman"/>
+          <w:color w:val="C0CAF5"/>
+          <w:sz w:val="21"/>
+          <w:szCs w:val="21"/>
+        </w:rPr>
+        <w:t xml:space="preserve">} </w:t>
+      </w:r>
+      <w:r>
+        <w:rPr>
+          <w:rFonts w:ascii="Consolas" w:eastAsia="Times New Roman" w:hAnsi="Consolas" w:cs="Times New Roman"/>
+          <w:color w:val="BB9AF7"/>
+          <w:sz w:val="21"/>
+          <w:szCs w:val="21"/>
+        </w:rPr>
+        <w:t>from</w:t>
+      </w:r>
+      <w:r>
+        <w:rPr>
+          <w:rFonts w:ascii="Consolas" w:eastAsia="Times New Roman" w:hAnsi="Consolas" w:cs="Times New Roman"/>
+          <w:color w:val="C0CAF5"/>
+          <w:sz w:val="21"/>
+          <w:szCs w:val="21"/>
+        </w:rPr>
+        <w:t xml:space="preserve"> "</w:t>
+      </w:r>
+      <w:proofErr w:type="spellStart"/>
+      <w:r>
+        <w:rPr>
+          <w:rFonts w:ascii="Consolas" w:eastAsia="Times New Roman" w:hAnsi="Consolas" w:cs="Times New Roman"/>
+          <w:color w:val="9ECE6A"/>
+          <w:sz w:val="21"/>
+          <w:szCs w:val="21"/>
+        </w:rPr>
+        <w:t>typeorm</w:t>
+      </w:r>
+      <w:proofErr w:type="spellEnd"/>
+      <w:r>
+        <w:rPr>
+          <w:rFonts w:ascii="Consolas" w:eastAsia="Times New Roman" w:hAnsi="Consolas" w:cs="Times New Roman"/>
+          <w:color w:val="C0CAF5"/>
+          <w:sz w:val="21"/>
+          <w:szCs w:val="21"/>
+        </w:rPr>
+        <w:t>"</w:t>
+      </w:r>
+    </w:p>
+    <w:p>
+      <w:pPr>
+        <w:shd w:val="clear" w:color="auto" w:fill="1A1B26"/>
+        <w:spacing w:after="0" w:line="285" w:lineRule="atLeast"/>
+        <w:ind w:firstLine="0"/>
+        <w:rPr>
+          <w:rFonts w:ascii="Consolas" w:eastAsia="Times New Roman" w:hAnsi="Consolas" w:cs="Times New Roman"/>
+          <w:color w:val="C0CAF5"/>
+          <w:sz w:val="21"/>
+          <w:szCs w:val="21"/>
+        </w:rPr>
+      </w:pPr>
+    </w:p>
+    <w:p>
+      <w:pPr>
+        <w:shd w:val="clear" w:color="auto" w:fill="1A1B26"/>
+        <w:spacing w:after="0" w:line="285" w:lineRule="atLeast"/>
+        <w:ind w:firstLine="0"/>
+        <w:rPr>
+          <w:rFonts w:ascii="Consolas" w:eastAsia="Times New Roman" w:hAnsi="Consolas" w:cs="Times New Roman"/>
+          <w:color w:val="C0CAF5"/>
+          <w:sz w:val="21"/>
+          <w:szCs w:val="21"/>
+        </w:rPr>
+      </w:pPr>
+      <w:r>
+        <w:rPr>
+          <w:rFonts w:ascii="Consolas" w:eastAsia="Times New Roman" w:hAnsi="Consolas" w:cs="Times New Roman"/>
+          <w:color w:val="BB9AF7"/>
+          <w:sz w:val="21"/>
+          <w:szCs w:val="21"/>
+        </w:rPr>
+        <w:t>export</w:t>
+      </w:r>
+      <w:r>
+        <w:rPr>
+          <w:rFonts w:ascii="Consolas" w:eastAsia="Times New Roman" w:hAnsi="Consolas" w:cs="Times New Roman"/>
+          <w:color w:val="C0CAF5"/>
+          <w:sz w:val="21"/>
+          <w:szCs w:val="21"/>
+        </w:rPr>
+        <w:t xml:space="preserve"> </w:t>
+      </w:r>
+      <w:r>
+        <w:rPr>
+          <w:rFonts w:ascii="Consolas" w:eastAsia="Times New Roman" w:hAnsi="Consolas" w:cs="Times New Roman"/>
+          <w:color w:val="BB9AF7"/>
+          <w:sz w:val="21"/>
+          <w:szCs w:val="21"/>
+        </w:rPr>
+        <w:t>default</w:t>
+      </w:r>
+      <w:r>
+        <w:rPr>
+          <w:rFonts w:ascii="Consolas" w:eastAsia="Times New Roman" w:hAnsi="Consolas" w:cs="Times New Roman"/>
+          <w:color w:val="C0CAF5"/>
+          <w:sz w:val="21"/>
+          <w:szCs w:val="21"/>
+        </w:rPr>
+        <w:t xml:space="preserve"> </w:t>
+      </w:r>
+      <w:r>
+        <w:rPr>
+          <w:rFonts w:ascii="Consolas" w:eastAsia="Times New Roman" w:hAnsi="Consolas" w:cs="Times New Roman"/>
+          <w:color w:val="BB9AF7"/>
+          <w:sz w:val="21"/>
+          <w:szCs w:val="21"/>
+        </w:rPr>
+        <w:t>new</w:t>
+      </w:r>
+      <w:r>
+        <w:rPr>
+          <w:rFonts w:ascii="Consolas" w:eastAsia="Times New Roman" w:hAnsi="Consolas" w:cs="Times New Roman"/>
+          <w:color w:val="C0CAF5"/>
+          <w:sz w:val="21"/>
+          <w:szCs w:val="21"/>
+        </w:rPr>
+        <w:t xml:space="preserve"> </w:t>
+      </w:r>
+      <w:proofErr w:type="spellStart"/>
+      <w:proofErr w:type="gramStart"/>
+      <w:r>
+        <w:rPr>
+          <w:rFonts w:ascii="Consolas" w:eastAsia="Times New Roman" w:hAnsi="Consolas" w:cs="Times New Roman"/>
+          <w:color w:val="7AA2F7"/>
+          <w:sz w:val="21"/>
+          <w:szCs w:val="21"/>
+        </w:rPr>
+        <w:t>DataSource</w:t>
+      </w:r>
+      <w:proofErr w:type="spellEnd"/>
+      <w:r>
+        <w:rPr>
+          <w:rFonts w:ascii="Consolas" w:eastAsia="Times New Roman" w:hAnsi="Consolas" w:cs="Times New Roman"/>
+          <w:color w:val="C0CAF5"/>
+          <w:sz w:val="21"/>
+          <w:szCs w:val="21"/>
+        </w:rPr>
+        <w:t>(</w:t>
+      </w:r>
+      <w:proofErr w:type="gramEnd"/>
+      <w:r>
+        <w:rPr>
+          <w:rFonts w:ascii="Consolas" w:eastAsia="Times New Roman" w:hAnsi="Consolas" w:cs="Times New Roman"/>
+          <w:color w:val="C0CAF5"/>
+          <w:sz w:val="21"/>
+          <w:szCs w:val="21"/>
+        </w:rPr>
+        <w:t>{</w:t>
+      </w:r>
+    </w:p>
+    <w:p>
+      <w:pPr>
+        <w:shd w:val="clear" w:color="auto" w:fill="1A1B26"/>
+        <w:spacing w:after="0" w:line="285" w:lineRule="atLeast"/>
+        <w:ind w:firstLine="0"/>
+        <w:rPr>
+          <w:rFonts w:ascii="Consolas" w:eastAsia="Times New Roman" w:hAnsi="Consolas" w:cs="Times New Roman"/>
+          <w:color w:val="C0CAF5"/>
+          <w:sz w:val="21"/>
+          <w:szCs w:val="21"/>
+        </w:rPr>
+      </w:pPr>
+      <w:r>
+        <w:rPr>
+          <w:rFonts w:ascii="Consolas" w:eastAsia="Times New Roman" w:hAnsi="Consolas" w:cs="Times New Roman"/>
+          <w:color w:val="C0CAF5"/>
+          <w:sz w:val="21"/>
+          <w:szCs w:val="21"/>
+        </w:rPr>
+        <w:t>    type: '</w:t>
+      </w:r>
+      <w:proofErr w:type="spellStart"/>
+      <w:r>
+        <w:rPr>
+          <w:rFonts w:ascii="Consolas" w:eastAsia="Times New Roman" w:hAnsi="Consolas" w:cs="Times New Roman"/>
+          <w:color w:val="9ECE6A"/>
+          <w:sz w:val="21"/>
+          <w:szCs w:val="21"/>
+        </w:rPr>
+        <w:t>postgres</w:t>
+      </w:r>
+      <w:proofErr w:type="spellEnd"/>
+      <w:r>
+        <w:rPr>
+          <w:rFonts w:ascii="Consolas" w:eastAsia="Times New Roman" w:hAnsi="Consolas" w:cs="Times New Roman"/>
+          <w:color w:val="C0CAF5"/>
+          <w:sz w:val="21"/>
+          <w:szCs w:val="21"/>
+        </w:rPr>
+        <w:t>',</w:t>
+      </w:r>
+    </w:p>
+    <w:p>
+      <w:pPr>
+        <w:shd w:val="clear" w:color="auto" w:fill="1A1B26"/>
+        <w:spacing w:after="0" w:line="285" w:lineRule="atLeast"/>
+        <w:ind w:firstLine="0"/>
+        <w:rPr>
+          <w:rFonts w:ascii="Consolas" w:eastAsia="Times New Roman" w:hAnsi="Consolas" w:cs="Times New Roman"/>
+          <w:color w:val="C0CAF5"/>
+          <w:sz w:val="21"/>
+          <w:szCs w:val="21"/>
+        </w:rPr>
+      </w:pPr>
+      <w:r>
+        <w:rPr>
+          <w:rFonts w:ascii="Consolas" w:eastAsia="Times New Roman" w:hAnsi="Consolas" w:cs="Times New Roman"/>
+          <w:color w:val="C0CAF5"/>
+          <w:sz w:val="21"/>
+          <w:szCs w:val="21"/>
+        </w:rPr>
+        <w:t>    host: '</w:t>
+      </w:r>
+      <w:r>
+        <w:rPr>
+          <w:rFonts w:ascii="Consolas" w:eastAsia="Times New Roman" w:hAnsi="Consolas" w:cs="Times New Roman"/>
+          <w:color w:val="9ECE6A"/>
+          <w:sz w:val="21"/>
+          <w:szCs w:val="21"/>
+        </w:rPr>
+        <w:t>localhost</w:t>
+      </w:r>
+      <w:r>
+        <w:rPr>
+          <w:rFonts w:ascii="Consolas" w:eastAsia="Times New Roman" w:hAnsi="Consolas" w:cs="Times New Roman"/>
+          <w:color w:val="C0CAF5"/>
+          <w:sz w:val="21"/>
+          <w:szCs w:val="21"/>
+        </w:rPr>
+        <w:t>',</w:t>
+      </w:r>
+    </w:p>
+    <w:p>
+      <w:pPr>
+        <w:shd w:val="clear" w:color="auto" w:fill="1A1B26"/>
+        <w:spacing w:after="0" w:line="285" w:lineRule="atLeast"/>
+        <w:ind w:firstLine="0"/>
+        <w:rPr>
+          <w:rFonts w:ascii="Consolas" w:eastAsia="Times New Roman" w:hAnsi="Consolas" w:cs="Times New Roman"/>
+          <w:color w:val="C0CAF5"/>
+          <w:sz w:val="21"/>
+          <w:szCs w:val="21"/>
+        </w:rPr>
+      </w:pPr>
+      <w:r>
+        <w:rPr>
+          <w:rFonts w:ascii="Consolas" w:eastAsia="Times New Roman" w:hAnsi="Consolas" w:cs="Times New Roman"/>
+          <w:color w:val="C0CAF5"/>
+          <w:sz w:val="21"/>
+          <w:szCs w:val="21"/>
+        </w:rPr>
+        <w:t xml:space="preserve">    port: </w:t>
+      </w:r>
+      <w:r>
+        <w:rPr>
+          <w:rFonts w:ascii="Consolas" w:eastAsia="Times New Roman" w:hAnsi="Consolas" w:cs="Times New Roman"/>
+          <w:color w:val="FF9E64"/>
+          <w:sz w:val="21"/>
+          <w:szCs w:val="21"/>
+        </w:rPr>
+        <w:t>5434</w:t>
+      </w:r>
+      <w:r>
+        <w:rPr>
+          <w:rFonts w:ascii="Consolas" w:eastAsia="Times New Roman" w:hAnsi="Consolas" w:cs="Times New Roman"/>
+          <w:color w:val="C0CAF5"/>
+          <w:sz w:val="21"/>
+          <w:szCs w:val="21"/>
+        </w:rPr>
+        <w:t>,</w:t>
+      </w:r>
+    </w:p>
+    <w:p>
+      <w:pPr>
+        <w:shd w:val="clear" w:color="auto" w:fill="1A1B26"/>
+        <w:spacing w:after="0" w:line="285" w:lineRule="atLeast"/>
+        <w:ind w:firstLine="0"/>
+        <w:rPr>
+          <w:rFonts w:ascii="Consolas" w:eastAsia="Times New Roman" w:hAnsi="Consolas" w:cs="Times New Roman"/>
+          <w:color w:val="C0CAF5"/>
+          <w:sz w:val="21"/>
+          <w:szCs w:val="21"/>
+        </w:rPr>
+      </w:pPr>
+      <w:r>
+        <w:rPr>
+          <w:rFonts w:ascii="Consolas" w:eastAsia="Times New Roman" w:hAnsi="Consolas" w:cs="Times New Roman"/>
+          <w:color w:val="C0CAF5"/>
+          <w:sz w:val="21"/>
+          <w:szCs w:val="21"/>
+        </w:rPr>
+        <w:t>    username: '</w:t>
+      </w:r>
+      <w:proofErr w:type="spellStart"/>
+      <w:r>
+        <w:rPr>
+          <w:rFonts w:ascii="Consolas" w:eastAsia="Times New Roman" w:hAnsi="Consolas" w:cs="Times New Roman"/>
+          <w:color w:val="9ECE6A"/>
+          <w:sz w:val="21"/>
+          <w:szCs w:val="21"/>
+        </w:rPr>
+        <w:t>postgres</w:t>
+      </w:r>
+      <w:proofErr w:type="spellEnd"/>
+      <w:r>
+        <w:rPr>
+          <w:rFonts w:ascii="Consolas" w:eastAsia="Times New Roman" w:hAnsi="Consolas" w:cs="Times New Roman"/>
+          <w:color w:val="C0CAF5"/>
+          <w:sz w:val="21"/>
+          <w:szCs w:val="21"/>
+        </w:rPr>
+        <w:t>',</w:t>
+      </w:r>
+    </w:p>
+    <w:p>
+      <w:pPr>
+        <w:shd w:val="clear" w:color="auto" w:fill="1A1B26"/>
+        <w:spacing w:after="0" w:line="285" w:lineRule="atLeast"/>
+        <w:ind w:firstLine="0"/>
+        <w:rPr>
+          <w:rFonts w:ascii="Consolas" w:eastAsia="Times New Roman" w:hAnsi="Consolas" w:cs="Times New Roman"/>
+          <w:color w:val="C0CAF5"/>
+          <w:sz w:val="21"/>
+          <w:szCs w:val="21"/>
+        </w:rPr>
+      </w:pPr>
+      <w:r>
+        <w:rPr>
+          <w:rFonts w:ascii="Consolas" w:eastAsia="Times New Roman" w:hAnsi="Consolas" w:cs="Times New Roman"/>
+          <w:color w:val="C0CAF5"/>
+          <w:sz w:val="21"/>
+          <w:szCs w:val="21"/>
+        </w:rPr>
+        <w:t>    password: '</w:t>
+      </w:r>
+      <w:proofErr w:type="spellStart"/>
+      <w:r>
+        <w:rPr>
+          <w:rFonts w:ascii="Consolas" w:eastAsia="Times New Roman" w:hAnsi="Consolas" w:cs="Times New Roman"/>
+          <w:color w:val="9ECE6A"/>
+          <w:sz w:val="21"/>
+          <w:szCs w:val="21"/>
+        </w:rPr>
+        <w:t>postgresql</w:t>
+      </w:r>
+      <w:proofErr w:type="spellEnd"/>
+      <w:r>
+        <w:rPr>
+          <w:rFonts w:ascii="Consolas" w:eastAsia="Times New Roman" w:hAnsi="Consolas" w:cs="Times New Roman"/>
+          <w:color w:val="C0CAF5"/>
+          <w:sz w:val="21"/>
+          <w:szCs w:val="21"/>
+        </w:rPr>
+        <w:t>',</w:t>
+      </w:r>
+    </w:p>
+    <w:p>
+      <w:pPr>
+        <w:shd w:val="clear" w:color="auto" w:fill="1A1B26"/>
+        <w:spacing w:after="0" w:line="285" w:lineRule="atLeast"/>
+        <w:ind w:firstLine="0"/>
+        <w:rPr>
+          <w:rFonts w:ascii="Consolas" w:eastAsia="Times New Roman" w:hAnsi="Consolas" w:cs="Times New Roman"/>
+          <w:color w:val="C0CAF5"/>
+          <w:sz w:val="21"/>
+          <w:szCs w:val="21"/>
+        </w:rPr>
+      </w:pPr>
+      <w:r>
+        <w:rPr>
+          <w:rFonts w:ascii="Consolas" w:eastAsia="Times New Roman" w:hAnsi="Consolas" w:cs="Times New Roman"/>
+          <w:color w:val="C0CAF5"/>
+          <w:sz w:val="21"/>
+          <w:szCs w:val="21"/>
+        </w:rPr>
+        <w:t>    database: '</w:t>
+      </w:r>
+      <w:proofErr w:type="spellStart"/>
+      <w:r>
+        <w:rPr>
+          <w:rFonts w:ascii="Consolas" w:eastAsia="Times New Roman" w:hAnsi="Consolas" w:cs="Times New Roman"/>
+          <w:color w:val="9ECE6A"/>
+          <w:sz w:val="21"/>
+          <w:szCs w:val="21"/>
+        </w:rPr>
+        <w:t>bd_inventario</w:t>
+      </w:r>
+      <w:proofErr w:type="spellEnd"/>
+      <w:r>
+        <w:rPr>
+          <w:rFonts w:ascii="Consolas" w:eastAsia="Times New Roman" w:hAnsi="Consolas" w:cs="Times New Roman"/>
+          <w:color w:val="C0CAF5"/>
+          <w:sz w:val="21"/>
+          <w:szCs w:val="21"/>
+        </w:rPr>
+        <w:t>',</w:t>
+      </w:r>
+    </w:p>
+    <w:p>
+      <w:pPr>
+        <w:shd w:val="clear" w:color="auto" w:fill="1A1B26"/>
+        <w:spacing w:after="0" w:line="285" w:lineRule="atLeast"/>
+        <w:ind w:firstLine="0"/>
+        <w:rPr>
+          <w:rFonts w:ascii="Consolas" w:eastAsia="Times New Roman" w:hAnsi="Consolas" w:cs="Times New Roman"/>
+          <w:color w:val="C0CAF5"/>
+          <w:sz w:val="21"/>
+          <w:szCs w:val="21"/>
+        </w:rPr>
+      </w:pPr>
+      <w:r>
+        <w:rPr>
+          <w:rFonts w:ascii="Consolas" w:eastAsia="Times New Roman" w:hAnsi="Consolas" w:cs="Times New Roman"/>
+          <w:color w:val="C0CAF5"/>
+          <w:sz w:val="21"/>
+          <w:szCs w:val="21"/>
+        </w:rPr>
+        <w:t xml:space="preserve">    </w:t>
+      </w:r>
+      <w:proofErr w:type="gramStart"/>
+      <w:r>
+        <w:rPr>
+          <w:rFonts w:ascii="Consolas" w:eastAsia="Times New Roman" w:hAnsi="Consolas" w:cs="Times New Roman"/>
+          <w:color w:val="C0CAF5"/>
+          <w:sz w:val="21"/>
+          <w:szCs w:val="21"/>
+        </w:rPr>
+        <w:t>entities:[</w:t>
+      </w:r>
+      <w:proofErr w:type="gramEnd"/>
+      <w:r>
+        <w:rPr>
+          <w:rFonts w:ascii="Consolas" w:eastAsia="Times New Roman" w:hAnsi="Consolas" w:cs="Times New Roman"/>
+          <w:color w:val="C0CAF5"/>
+          <w:sz w:val="21"/>
+          <w:szCs w:val="21"/>
+        </w:rPr>
+        <w:t>'</w:t>
+      </w:r>
+      <w:proofErr w:type="spellStart"/>
+      <w:r>
+        <w:rPr>
+          <w:rFonts w:ascii="Consolas" w:eastAsia="Times New Roman" w:hAnsi="Consolas" w:cs="Times New Roman"/>
+          <w:color w:val="9ECE6A"/>
+          <w:sz w:val="21"/>
+          <w:szCs w:val="21"/>
+        </w:rPr>
+        <w:t>src</w:t>
+      </w:r>
+      <w:proofErr w:type="spellEnd"/>
+      <w:r>
+        <w:rPr>
+          <w:rFonts w:ascii="Consolas" w:eastAsia="Times New Roman" w:hAnsi="Consolas" w:cs="Times New Roman"/>
+          <w:color w:val="9ECE6A"/>
+          <w:sz w:val="21"/>
+          <w:szCs w:val="21"/>
+        </w:rPr>
+        <w:t>/**/.</w:t>
+      </w:r>
+      <w:proofErr w:type="spellStart"/>
+      <w:r>
+        <w:rPr>
+          <w:rFonts w:ascii="Consolas" w:eastAsia="Times New Roman" w:hAnsi="Consolas" w:cs="Times New Roman"/>
+          <w:color w:val="9ECE6A"/>
+          <w:sz w:val="21"/>
+          <w:szCs w:val="21"/>
+        </w:rPr>
+        <w:t>entity.ts</w:t>
+      </w:r>
+      <w:proofErr w:type="spellEnd"/>
+      <w:r>
+        <w:rPr>
+          <w:rFonts w:ascii="Consolas" w:eastAsia="Times New Roman" w:hAnsi="Consolas" w:cs="Times New Roman"/>
+          <w:color w:val="C0CAF5"/>
+          <w:sz w:val="21"/>
+          <w:szCs w:val="21"/>
+        </w:rPr>
+        <w:t>'],</w:t>
+      </w:r>
+    </w:p>
+    <w:p>
+      <w:pPr>
+        <w:shd w:val="clear" w:color="auto" w:fill="1A1B26"/>
+        <w:spacing w:after="0" w:line="285" w:lineRule="atLeast"/>
+        <w:ind w:firstLine="0"/>
+        <w:rPr>
+          <w:rFonts w:ascii="Consolas" w:eastAsia="Times New Roman" w:hAnsi="Consolas" w:cs="Times New Roman"/>
+          <w:color w:val="C0CAF5"/>
+          <w:sz w:val="21"/>
+          <w:szCs w:val="21"/>
+        </w:rPr>
+      </w:pPr>
+      <w:r>
+        <w:rPr>
+          <w:rFonts w:ascii="Consolas" w:eastAsia="Times New Roman" w:hAnsi="Consolas" w:cs="Times New Roman"/>
+          <w:color w:val="C0CAF5"/>
+          <w:sz w:val="21"/>
+          <w:szCs w:val="21"/>
+        </w:rPr>
+        <w:t xml:space="preserve">    </w:t>
+      </w:r>
+      <w:proofErr w:type="gramStart"/>
+      <w:r>
+        <w:rPr>
+          <w:rFonts w:ascii="Consolas" w:eastAsia="Times New Roman" w:hAnsi="Consolas" w:cs="Times New Roman"/>
+          <w:color w:val="C0CAF5"/>
+          <w:sz w:val="21"/>
+          <w:szCs w:val="21"/>
+        </w:rPr>
+        <w:t>migrations:[</w:t>
+      </w:r>
+      <w:proofErr w:type="gramEnd"/>
+      <w:r>
+        <w:rPr>
+          <w:rFonts w:ascii="Consolas" w:eastAsia="Times New Roman" w:hAnsi="Consolas" w:cs="Times New Roman"/>
+          <w:color w:val="C0CAF5"/>
+          <w:sz w:val="21"/>
+          <w:szCs w:val="21"/>
+        </w:rPr>
+        <w:t>'</w:t>
+      </w:r>
+      <w:proofErr w:type="spellStart"/>
+      <w:r>
+        <w:rPr>
+          <w:rFonts w:ascii="Consolas" w:eastAsia="Times New Roman" w:hAnsi="Consolas" w:cs="Times New Roman"/>
+          <w:color w:val="9ECE6A"/>
+          <w:sz w:val="21"/>
+          <w:szCs w:val="21"/>
+        </w:rPr>
+        <w:t>src</w:t>
+      </w:r>
+      <w:proofErr w:type="spellEnd"/>
+      <w:r>
+        <w:rPr>
+          <w:rFonts w:ascii="Consolas" w:eastAsia="Times New Roman" w:hAnsi="Consolas" w:cs="Times New Roman"/>
+          <w:color w:val="9ECE6A"/>
+          <w:sz w:val="21"/>
+          <w:szCs w:val="21"/>
+        </w:rPr>
+        <w:t>/database/migrations/*.</w:t>
+      </w:r>
+      <w:proofErr w:type="spellStart"/>
+      <w:r>
+        <w:rPr>
+          <w:rFonts w:ascii="Consolas" w:eastAsia="Times New Roman" w:hAnsi="Consolas" w:cs="Times New Roman"/>
+          <w:color w:val="9ECE6A"/>
+          <w:sz w:val="21"/>
+          <w:szCs w:val="21"/>
+        </w:rPr>
+        <w:t>ts</w:t>
+      </w:r>
+      <w:proofErr w:type="spellEnd"/>
+      <w:r>
+        <w:rPr>
+          <w:rFonts w:ascii="Consolas" w:eastAsia="Times New Roman" w:hAnsi="Consolas" w:cs="Times New Roman"/>
+          <w:color w:val="C0CAF5"/>
+          <w:sz w:val="21"/>
+          <w:szCs w:val="21"/>
+        </w:rPr>
+        <w:t>']</w:t>
+      </w:r>
+    </w:p>
+    <w:p>
+      <w:pPr>
+        <w:shd w:val="clear" w:color="auto" w:fill="1A1B26"/>
+        <w:spacing w:after="0" w:line="285" w:lineRule="atLeast"/>
+        <w:ind w:firstLine="0"/>
+        <w:rPr>
+          <w:rFonts w:ascii="Consolas" w:eastAsia="Times New Roman" w:hAnsi="Consolas" w:cs="Times New Roman"/>
+          <w:color w:val="C0CAF5"/>
+          <w:sz w:val="21"/>
+          <w:szCs w:val="21"/>
+        </w:rPr>
+      </w:pPr>
+      <w:r>
+        <w:rPr>
+          <w:rFonts w:ascii="Consolas" w:eastAsia="Times New Roman" w:hAnsi="Consolas" w:cs="Times New Roman"/>
+          <w:color w:val="C0CAF5"/>
+          <w:sz w:val="21"/>
+          <w:szCs w:val="21"/>
+        </w:rPr>
+        <w:t>});</w:t>
+      </w:r>
+    </w:p>
+    <w:p>
+      <w:pPr>
+        <w:ind w:firstLine="0"/>
+        <w:rPr>
+          <w:rFonts w:ascii="Consolas" w:eastAsia="Times New Roman" w:hAnsi="Consolas" w:cs="Times New Roman"/>
+          <w:color w:val="auto"/>
+          <w:sz w:val="21"/>
+          <w:szCs w:val="21"/>
+          <w:lang w:val="es-ES"/>
+        </w:rPr>
+      </w:pPr>
+      <w:r>
+        <w:rPr>
+          <w:rFonts w:ascii="Consolas" w:eastAsia="Times New Roman" w:hAnsi="Consolas" w:cs="Times New Roman"/>
+          <w:color w:val="auto"/>
+          <w:sz w:val="21"/>
+          <w:szCs w:val="21"/>
+          <w:lang w:val="es-ES"/>
+        </w:rPr>
+        <w:br/>
+      </w:r>
+    </w:p>
+    <w:p>
+      <w:pPr>
+        <w:ind w:firstLine="0"/>
+        <w:rPr>
+          <w:rFonts w:ascii="Consolas" w:eastAsia="Times New Roman" w:hAnsi="Consolas" w:cs="Times New Roman"/>
+          <w:color w:val="auto"/>
+          <w:sz w:val="21"/>
+          <w:szCs w:val="21"/>
+          <w:lang w:val="es-ES"/>
+        </w:rPr>
+      </w:pPr>
     </w:p>
     <w:sectPr>
       <w:pgSz w:w="12240" w:h="15840"/>

</xml_diff>

<commit_message>
feature: se realizaso la tabla de user, y el archivo de conexion
</commit_message>
<xml_diff>
--- a/PASOS PARA REALIZAR EL BACKEND DE NODE NEST.docx
+++ b/PASOS PARA REALIZAR EL BACKEND DE NODE NEST.docx
@@ -831,7 +831,6 @@
         <w:rPr>
           <w:b/>
           <w:bCs/>
-          <w:lang w:val="es-ES"/>
         </w:rPr>
       </w:pPr>
       <w:r>
@@ -840,41 +839,12 @@
         </w:rPr>
         <w:t xml:space="preserve"> </w:t>
       </w:r>
-      <w:proofErr w:type="spellStart"/>
       <w:r>
         <w:rPr>
           <w:b/>
           <w:bCs/>
-          <w:lang w:val="es-ES"/>
-        </w:rPr>
-        <w:t>yarn</w:t>
-      </w:r>
-      <w:proofErr w:type="spellEnd"/>
-      <w:r>
-        <w:rPr>
-          <w:b/>
-          <w:bCs/>
-          <w:lang w:val="es-ES"/>
-        </w:rPr>
-        <w:t xml:space="preserve"> </w:t>
-      </w:r>
-      <w:proofErr w:type="spellStart"/>
-      <w:r>
-        <w:rPr>
-          <w:b/>
-          <w:bCs/>
-          <w:lang w:val="es-ES"/>
-        </w:rPr>
-        <w:t>add</w:t>
-      </w:r>
-      <w:proofErr w:type="spellEnd"/>
-      <w:r>
-        <w:rPr>
-          <w:b/>
-          <w:bCs/>
-          <w:lang w:val="es-ES"/>
-        </w:rPr>
-        <w:t xml:space="preserve"> @nestjs/swagger</w:t>
+        </w:rPr>
+        <w:t>yarn add @nestjs/swagger</w:t>
       </w:r>
     </w:p>
     <w:p>
@@ -1058,7 +1028,6 @@
           <w:color w:val="C0CAF5"/>
           <w:sz w:val="21"/>
           <w:szCs w:val="21"/>
-          <w:lang w:val="es-ES"/>
         </w:rPr>
       </w:pPr>
       <w:r>
@@ -1077,7 +1046,6 @@
           <w:color w:val="C0CAF5"/>
           <w:sz w:val="21"/>
           <w:szCs w:val="21"/>
-          <w:lang w:val="es-ES"/>
         </w:rPr>
         <w:t>.</w:t>
       </w:r>
@@ -1088,7 +1056,6 @@
           <w:color w:val="7AA2F7"/>
           <w:sz w:val="21"/>
           <w:szCs w:val="21"/>
-          <w:lang w:val="es-ES"/>
         </w:rPr>
         <w:t>setDescription</w:t>
       </w:r>
@@ -1100,7 +1067,6 @@
           <w:color w:val="C0CAF5"/>
           <w:sz w:val="21"/>
           <w:szCs w:val="21"/>
-          <w:lang w:val="es-ES"/>
         </w:rPr>
         <w:t>('</w:t>
       </w:r>
@@ -1110,7 +1076,6 @@
           <w:color w:val="9ECE6A"/>
           <w:sz w:val="21"/>
           <w:szCs w:val="21"/>
-          <w:lang w:val="es-ES"/>
         </w:rPr>
         <w:t xml:space="preserve">es una </w:t>
       </w:r>
@@ -1121,7 +1086,6 @@
           <w:color w:val="9ECE6A"/>
           <w:sz w:val="21"/>
           <w:szCs w:val="21"/>
-          <w:lang w:val="es-ES"/>
         </w:rPr>
         <w:t>pagina</w:t>
       </w:r>
@@ -1132,7 +1096,6 @@
           <w:color w:val="9ECE6A"/>
           <w:sz w:val="21"/>
           <w:szCs w:val="21"/>
-          <w:lang w:val="es-ES"/>
         </w:rPr>
         <w:t xml:space="preserve"> de taller</w:t>
       </w:r>
@@ -1142,7 +1105,6 @@
           <w:color w:val="C0CAF5"/>
           <w:sz w:val="21"/>
           <w:szCs w:val="21"/>
-          <w:lang w:val="es-ES"/>
         </w:rPr>
         <w:t>')</w:t>
       </w:r>
@@ -1165,7 +1127,6 @@
           <w:color w:val="C0CAF5"/>
           <w:sz w:val="21"/>
           <w:szCs w:val="21"/>
-          <w:lang w:val="es-ES"/>
         </w:rPr>
         <w:t xml:space="preserve">    </w:t>
       </w:r>
@@ -1793,18 +1754,7 @@
           <w:sz w:val="21"/>
           <w:szCs w:val="21"/>
         </w:rPr>
-        <w:t>yarn add @nestjs/</w:t>
-      </w:r>
-      <w:r>
-        <w:rPr>
-          <w:rFonts w:ascii="Consolas" w:eastAsia="Times New Roman" w:hAnsi="Consolas" w:cs="Times New Roman"/>
-          <w:b/>
-          <w:bCs/>
-          <w:color w:val="auto"/>
-          <w:sz w:val="21"/>
-          <w:szCs w:val="21"/>
-        </w:rPr>
-        <w:t>class-validator class-transformer</w:t>
+        <w:t>yarn add @nestjs/class-validator class-transformer</w:t>
       </w:r>
     </w:p>
     <w:p>
@@ -2155,7 +2105,7 @@
           <w:sz w:val="21"/>
           <w:szCs w:val="21"/>
         </w:rPr>
-        <w:t>postgres</w:t>
+        <w:t>db</w:t>
       </w:r>
       <w:proofErr w:type="spellEnd"/>
       <w:r>
@@ -2683,61 +2633,80 @@
           <w:color w:val="auto"/>
           <w:sz w:val="21"/>
           <w:szCs w:val="21"/>
-        </w:rPr>
-      </w:pPr>
-    </w:p>
-    <w:p>
-      <w:pPr>
-        <w:ind w:firstLine="0"/>
-        <w:rPr>
-          <w:rFonts w:ascii="Consolas" w:eastAsia="Times New Roman" w:hAnsi="Consolas" w:cs="Times New Roman"/>
-          <w:color w:val="auto"/>
-          <w:sz w:val="21"/>
-          <w:szCs w:val="21"/>
-          <w:lang w:val="es-ES"/>
-        </w:rPr>
-      </w:pPr>
-      <w:r>
-        <w:rPr>
-          <w:rFonts w:ascii="Consolas" w:eastAsia="Times New Roman" w:hAnsi="Consolas" w:cs="Times New Roman"/>
-          <w:color w:val="auto"/>
-          <w:sz w:val="21"/>
-          <w:szCs w:val="21"/>
-          <w:lang w:val="es-ES"/>
-        </w:rPr>
-        <w:t>Inicializamos el contenedor con</w:t>
-      </w:r>
-      <w:r>
-        <w:rPr>
-          <w:rFonts w:ascii="Consolas" w:eastAsia="Times New Roman" w:hAnsi="Consolas" w:cs="Times New Roman"/>
-          <w:color w:val="auto"/>
-          <w:sz w:val="21"/>
-          <w:szCs w:val="21"/>
-          <w:lang w:val="es-ES"/>
-        </w:rPr>
-        <w:t xml:space="preserve">: </w:t>
-      </w:r>
-      <w:proofErr w:type="spellStart"/>
-      <w:r>
-        <w:rPr>
-          <w:rFonts w:ascii="Consolas" w:eastAsia="Times New Roman" w:hAnsi="Consolas" w:cs="Times New Roman"/>
-          <w:color w:val="auto"/>
-          <w:sz w:val="21"/>
-          <w:szCs w:val="21"/>
-          <w:lang w:val="es-ES"/>
-        </w:rPr>
-        <w:t>docker-compose</w:t>
-      </w:r>
-      <w:proofErr w:type="spellEnd"/>
-      <w:r>
-        <w:rPr>
-          <w:rFonts w:ascii="Consolas" w:eastAsia="Times New Roman" w:hAnsi="Consolas" w:cs="Times New Roman"/>
-          <w:color w:val="auto"/>
-          <w:sz w:val="21"/>
-          <w:szCs w:val="21"/>
-          <w:lang w:val="es-ES"/>
-        </w:rPr>
-        <w:t xml:space="preserve"> up -d</w:t>
+          <w:u w:val="single"/>
+        </w:rPr>
+      </w:pPr>
+    </w:p>
+    <w:p>
+      <w:pPr>
+        <w:ind w:firstLine="0"/>
+        <w:rPr>
+          <w:rFonts w:ascii="Consolas" w:eastAsia="Times New Roman" w:hAnsi="Consolas" w:cs="Times New Roman"/>
+          <w:color w:val="auto"/>
+          <w:sz w:val="21"/>
+          <w:szCs w:val="21"/>
+        </w:rPr>
+      </w:pPr>
+      <w:proofErr w:type="spellStart"/>
+      <w:r>
+        <w:rPr>
+          <w:rFonts w:ascii="Consolas" w:eastAsia="Times New Roman" w:hAnsi="Consolas" w:cs="Times New Roman"/>
+          <w:color w:val="auto"/>
+          <w:sz w:val="21"/>
+          <w:szCs w:val="21"/>
+        </w:rPr>
+        <w:t>Inicializamos</w:t>
+      </w:r>
+      <w:proofErr w:type="spellEnd"/>
+      <w:r>
+        <w:rPr>
+          <w:rFonts w:ascii="Consolas" w:eastAsia="Times New Roman" w:hAnsi="Consolas" w:cs="Times New Roman"/>
+          <w:color w:val="auto"/>
+          <w:sz w:val="21"/>
+          <w:szCs w:val="21"/>
+        </w:rPr>
+        <w:t xml:space="preserve"> </w:t>
+      </w:r>
+      <w:proofErr w:type="spellStart"/>
+      <w:r>
+        <w:rPr>
+          <w:rFonts w:ascii="Consolas" w:eastAsia="Times New Roman" w:hAnsi="Consolas" w:cs="Times New Roman"/>
+          <w:color w:val="auto"/>
+          <w:sz w:val="21"/>
+          <w:szCs w:val="21"/>
+        </w:rPr>
+        <w:t>el</w:t>
+      </w:r>
+      <w:proofErr w:type="spellEnd"/>
+      <w:r>
+        <w:rPr>
+          <w:rFonts w:ascii="Consolas" w:eastAsia="Times New Roman" w:hAnsi="Consolas" w:cs="Times New Roman"/>
+          <w:color w:val="auto"/>
+          <w:sz w:val="21"/>
+          <w:szCs w:val="21"/>
+        </w:rPr>
+        <w:t xml:space="preserve"> </w:t>
+      </w:r>
+      <w:proofErr w:type="spellStart"/>
+      <w:r>
+        <w:rPr>
+          <w:rFonts w:ascii="Consolas" w:eastAsia="Times New Roman" w:hAnsi="Consolas" w:cs="Times New Roman"/>
+          <w:color w:val="auto"/>
+          <w:sz w:val="21"/>
+          <w:szCs w:val="21"/>
+          <w:u w:val="single"/>
+        </w:rPr>
+        <w:t>contenedor</w:t>
+      </w:r>
+      <w:proofErr w:type="spellEnd"/>
+      <w:r>
+        <w:rPr>
+          <w:rFonts w:ascii="Consolas" w:eastAsia="Times New Roman" w:hAnsi="Consolas" w:cs="Times New Roman"/>
+          <w:color w:val="auto"/>
+          <w:sz w:val="21"/>
+          <w:szCs w:val="21"/>
+        </w:rPr>
+        <w:t xml:space="preserve"> con: docker-compose up -d</w:t>
       </w:r>
     </w:p>
     <w:p>
@@ -2849,7 +2818,16 @@
           <w:sz w:val="21"/>
           <w:szCs w:val="21"/>
         </w:rPr>
-        <w:t>    "</w:t>
+        <w:t xml:space="preserve">    </w:t>
+      </w:r>
+      <w:r>
+        <w:rPr>
+          <w:rFonts w:ascii="Consolas" w:eastAsia="Times New Roman" w:hAnsi="Consolas" w:cs="Times New Roman"/>
+          <w:color w:val="C0CAF5"/>
+          <w:sz w:val="21"/>
+          <w:szCs w:val="21"/>
+        </w:rPr>
+        <w:t>"</w:t>
       </w:r>
       <w:proofErr w:type="spellStart"/>
       <w:r>
@@ -3166,7 +3144,67 @@
           <w:sz w:val="21"/>
           <w:szCs w:val="21"/>
         </w:rPr>
-        <w:t xml:space="preserve"> -- -d ./</w:t>
+        <w:t xml:space="preserve"> -- </w:t>
+      </w:r>
+      <w:proofErr w:type="spellStart"/>
+      <w:r>
+        <w:rPr>
+          <w:rFonts w:ascii="Consolas" w:eastAsia="Times New Roman" w:hAnsi="Consolas" w:cs="Times New Roman"/>
+          <w:color w:val="9ECE6A"/>
+          <w:sz w:val="21"/>
+          <w:szCs w:val="21"/>
+        </w:rPr>
+        <w:t>migration:generate</w:t>
+      </w:r>
+      <w:proofErr w:type="spellEnd"/>
+      <w:r>
+        <w:rPr>
+          <w:rFonts w:ascii="Consolas" w:eastAsia="Times New Roman" w:hAnsi="Consolas" w:cs="Times New Roman"/>
+          <w:color w:val="9ECE6A"/>
+          <w:sz w:val="21"/>
+          <w:szCs w:val="21"/>
+        </w:rPr>
+        <w:t xml:space="preserve"> ./</w:t>
+      </w:r>
+      <w:proofErr w:type="spellStart"/>
+      <w:r>
+        <w:rPr>
+          <w:rFonts w:ascii="Consolas" w:eastAsia="Times New Roman" w:hAnsi="Consolas" w:cs="Times New Roman"/>
+          <w:color w:val="9ECE6A"/>
+          <w:sz w:val="21"/>
+          <w:szCs w:val="21"/>
+        </w:rPr>
+        <w:t>src</w:t>
+      </w:r>
+      <w:proofErr w:type="spellEnd"/>
+      <w:r>
+        <w:rPr>
+          <w:rFonts w:ascii="Consolas" w:eastAsia="Times New Roman" w:hAnsi="Consolas" w:cs="Times New Roman"/>
+          <w:color w:val="9ECE6A"/>
+          <w:sz w:val="21"/>
+          <w:szCs w:val="21"/>
+        </w:rPr>
+        <w:t>/database/migrations/%</w:t>
+      </w:r>
+      <w:proofErr w:type="spellStart"/>
+      <w:r>
+        <w:rPr>
+          <w:rFonts w:ascii="Consolas" w:eastAsia="Times New Roman" w:hAnsi="Consolas" w:cs="Times New Roman"/>
+          <w:color w:val="9ECE6A"/>
+          <w:sz w:val="21"/>
+          <w:szCs w:val="21"/>
+        </w:rPr>
+        <w:t>npm_config_name</w:t>
+      </w:r>
+      <w:proofErr w:type="spellEnd"/>
+      <w:r>
+        <w:rPr>
+          <w:rFonts w:ascii="Consolas" w:eastAsia="Times New Roman" w:hAnsi="Consolas" w:cs="Times New Roman"/>
+          <w:color w:val="9ECE6A"/>
+          <w:sz w:val="21"/>
+          <w:szCs w:val="21"/>
+        </w:rPr>
+        <w:t>% -d ./</w:t>
       </w:r>
       <w:proofErr w:type="spellStart"/>
       <w:r>
@@ -3179,75 +3217,6 @@
         <w:t>typeorm.config.ts</w:t>
       </w:r>
       <w:proofErr w:type="spellEnd"/>
-      <w:r>
-        <w:rPr>
-          <w:rFonts w:ascii="Consolas" w:eastAsia="Times New Roman" w:hAnsi="Consolas" w:cs="Times New Roman"/>
-          <w:color w:val="9ECE6A"/>
-          <w:sz w:val="21"/>
-          <w:szCs w:val="21"/>
-        </w:rPr>
-        <w:t xml:space="preserve"> </w:t>
-      </w:r>
-      <w:proofErr w:type="spellStart"/>
-      <w:r>
-        <w:rPr>
-          <w:rFonts w:ascii="Consolas" w:eastAsia="Times New Roman" w:hAnsi="Consolas" w:cs="Times New Roman"/>
-          <w:color w:val="9ECE6A"/>
-          <w:sz w:val="21"/>
-          <w:szCs w:val="21"/>
-        </w:rPr>
-        <w:t>migration:generate</w:t>
-      </w:r>
-      <w:proofErr w:type="spellEnd"/>
-      <w:r>
-        <w:rPr>
-          <w:rFonts w:ascii="Consolas" w:eastAsia="Times New Roman" w:hAnsi="Consolas" w:cs="Times New Roman"/>
-          <w:color w:val="9ECE6A"/>
-          <w:sz w:val="21"/>
-          <w:szCs w:val="21"/>
-        </w:rPr>
-        <w:t xml:space="preserve"> ./</w:t>
-      </w:r>
-      <w:proofErr w:type="spellStart"/>
-      <w:r>
-        <w:rPr>
-          <w:rFonts w:ascii="Consolas" w:eastAsia="Times New Roman" w:hAnsi="Consolas" w:cs="Times New Roman"/>
-          <w:color w:val="9ECE6A"/>
-          <w:sz w:val="21"/>
-          <w:szCs w:val="21"/>
-        </w:rPr>
-        <w:t>src</w:t>
-      </w:r>
-      <w:proofErr w:type="spellEnd"/>
-      <w:r>
-        <w:rPr>
-          <w:rFonts w:ascii="Consolas" w:eastAsia="Times New Roman" w:hAnsi="Consolas" w:cs="Times New Roman"/>
-          <w:color w:val="9ECE6A"/>
-          <w:sz w:val="21"/>
-          <w:szCs w:val="21"/>
-        </w:rPr>
-        <w:t>/database/migrations/%</w:t>
-      </w:r>
-      <w:proofErr w:type="spellStart"/>
-      <w:r>
-        <w:rPr>
-          <w:rFonts w:ascii="Consolas" w:eastAsia="Times New Roman" w:hAnsi="Consolas" w:cs="Times New Roman"/>
-          <w:color w:val="9ECE6A"/>
-          <w:sz w:val="21"/>
-          <w:szCs w:val="21"/>
-        </w:rPr>
-        <w:t>npm_config_name</w:t>
-      </w:r>
-      <w:proofErr w:type="spellEnd"/>
-      <w:r>
-        <w:rPr>
-          <w:rFonts w:ascii="Consolas" w:eastAsia="Times New Roman" w:hAnsi="Consolas" w:cs="Times New Roman"/>
-          <w:color w:val="9ECE6A"/>
-          <w:sz w:val="21"/>
-          <w:szCs w:val="21"/>
-        </w:rPr>
-        <w:t>%</w:t>
-      </w:r>
       <w:r>
         <w:rPr>
           <w:rFonts w:ascii="Consolas" w:eastAsia="Times New Roman" w:hAnsi="Consolas" w:cs="Times New Roman"/>
@@ -3713,7 +3682,59 @@
           <w:szCs w:val="21"/>
           <w:lang w:val="es-ES"/>
         </w:rPr>
-        <w:t xml:space="preserve">Creamos los archivos </w:t>
+        <w:t>Creamos</w:t>
+      </w:r>
+      <w:r>
+        <w:rPr>
+          <w:rFonts w:ascii="Consolas" w:eastAsia="Times New Roman" w:hAnsi="Consolas" w:cs="Times New Roman"/>
+          <w:color w:val="auto"/>
+          <w:sz w:val="21"/>
+          <w:szCs w:val="21"/>
+          <w:lang w:val="es-ES"/>
+        </w:rPr>
+        <w:t xml:space="preserve"> en la carpeta </w:t>
+      </w:r>
+      <w:proofErr w:type="spellStart"/>
+      <w:r>
+        <w:rPr>
+          <w:rFonts w:ascii="Consolas" w:eastAsia="Times New Roman" w:hAnsi="Consolas" w:cs="Times New Roman"/>
+          <w:color w:val="auto"/>
+          <w:sz w:val="21"/>
+          <w:szCs w:val="21"/>
+          <w:lang w:val="es-ES"/>
+        </w:rPr>
+        <w:t>src</w:t>
+      </w:r>
+      <w:proofErr w:type="spellEnd"/>
+      <w:r>
+        <w:rPr>
+          <w:rFonts w:ascii="Consolas" w:eastAsia="Times New Roman" w:hAnsi="Consolas" w:cs="Times New Roman"/>
+          <w:color w:val="auto"/>
+          <w:sz w:val="21"/>
+          <w:szCs w:val="21"/>
+          <w:lang w:val="es-ES"/>
+        </w:rPr>
+        <w:t>/</w:t>
+      </w:r>
+      <w:r>
+        <w:rPr>
+          <w:rFonts w:ascii="Consolas" w:eastAsia="Times New Roman" w:hAnsi="Consolas" w:cs="Times New Roman"/>
+          <w:color w:val="auto"/>
+          <w:sz w:val="21"/>
+          <w:szCs w:val="21"/>
+          <w:lang w:val="es-ES"/>
+        </w:rPr>
+        <w:t xml:space="preserve"> los archivos </w:t>
+      </w:r>
+      <w:r>
+        <w:rPr>
+          <w:rFonts w:ascii="Consolas" w:eastAsia="Times New Roman" w:hAnsi="Consolas" w:cs="Times New Roman"/>
+          <w:color w:val="auto"/>
+          <w:sz w:val="21"/>
+          <w:szCs w:val="21"/>
+          <w:lang w:val="es-ES"/>
+        </w:rPr>
+        <w:t>/</w:t>
       </w:r>
       <w:proofErr w:type="spellStart"/>
       <w:r>
@@ -3737,6 +3758,16 @@
         </w:rPr>
         <w:t xml:space="preserve"> y allí dentro creamos el archivo </w:t>
       </w:r>
+      <w:r>
+        <w:rPr>
+          <w:rFonts w:ascii="Consolas" w:eastAsia="Times New Roman" w:hAnsi="Consolas" w:cs="Times New Roman"/>
+          <w:color w:val="auto"/>
+          <w:sz w:val="21"/>
+          <w:szCs w:val="21"/>
+          <w:lang w:val="es-ES"/>
+        </w:rPr>
+        <w:t>/</w:t>
+      </w:r>
       <w:proofErr w:type="spellStart"/>
       <w:r>
         <w:rPr>
@@ -3749,15 +3780,99 @@
         <w:t>migrations</w:t>
       </w:r>
       <w:proofErr w:type="spellEnd"/>
-      <w:r>
-        <w:rPr>
-          <w:rFonts w:ascii="Consolas" w:eastAsia="Times New Roman" w:hAnsi="Consolas" w:cs="Times New Roman"/>
-          <w:color w:val="auto"/>
-          <w:sz w:val="21"/>
-          <w:szCs w:val="21"/>
-          <w:lang w:val="es-ES"/>
-        </w:rPr>
-        <w:t xml:space="preserve"> y luego creamos el archivo </w:t>
+    </w:p>
+    <w:p>
+      <w:pPr>
+        <w:ind w:firstLine="0"/>
+        <w:rPr>
+          <w:rFonts w:ascii="Consolas" w:eastAsia="Times New Roman" w:hAnsi="Consolas" w:cs="Times New Roman"/>
+          <w:color w:val="auto"/>
+          <w:sz w:val="21"/>
+          <w:szCs w:val="21"/>
+          <w:lang w:val="es-ES"/>
+        </w:rPr>
+      </w:pPr>
+      <w:r>
+        <w:rPr>
+          <w:rFonts w:ascii="Consolas" w:eastAsia="Times New Roman" w:hAnsi="Consolas" w:cs="Times New Roman"/>
+          <w:color w:val="auto"/>
+          <w:sz w:val="21"/>
+          <w:szCs w:val="21"/>
+          <w:lang w:val="es-ES"/>
+        </w:rPr>
+        <w:t>L</w:t>
+      </w:r>
+      <w:r>
+        <w:rPr>
+          <w:rFonts w:ascii="Consolas" w:eastAsia="Times New Roman" w:hAnsi="Consolas" w:cs="Times New Roman"/>
+          <w:color w:val="auto"/>
+          <w:sz w:val="21"/>
+          <w:szCs w:val="21"/>
+          <w:lang w:val="es-ES"/>
+        </w:rPr>
+        <w:t>uego creamos e</w:t>
+      </w:r>
+      <w:r>
+        <w:rPr>
+          <w:rFonts w:ascii="Consolas" w:eastAsia="Times New Roman" w:hAnsi="Consolas" w:cs="Times New Roman"/>
+          <w:color w:val="auto"/>
+          <w:sz w:val="21"/>
+          <w:szCs w:val="21"/>
+          <w:lang w:val="es-ES"/>
+        </w:rPr>
+        <w:t>n la</w:t>
+      </w:r>
+      <w:r>
+        <w:rPr>
+          <w:rFonts w:ascii="Consolas" w:eastAsia="Times New Roman" w:hAnsi="Consolas" w:cs="Times New Roman"/>
+          <w:color w:val="auto"/>
+          <w:sz w:val="21"/>
+          <w:szCs w:val="21"/>
+          <w:lang w:val="es-ES"/>
+        </w:rPr>
+        <w:t xml:space="preserve"> </w:t>
+      </w:r>
+      <w:r>
+        <w:rPr>
+          <w:rFonts w:ascii="Consolas" w:eastAsia="Times New Roman" w:hAnsi="Consolas" w:cs="Times New Roman"/>
+          <w:color w:val="auto"/>
+          <w:sz w:val="21"/>
+          <w:szCs w:val="21"/>
+          <w:lang w:val="es-ES"/>
+        </w:rPr>
+        <w:t xml:space="preserve">carpeta </w:t>
+      </w:r>
+      <w:proofErr w:type="spellStart"/>
+      <w:r>
+        <w:rPr>
+          <w:rFonts w:ascii="Consolas" w:eastAsia="Times New Roman" w:hAnsi="Consolas" w:cs="Times New Roman"/>
+          <w:color w:val="auto"/>
+          <w:sz w:val="21"/>
+          <w:szCs w:val="21"/>
+          <w:lang w:val="es-ES"/>
+        </w:rPr>
+        <w:t>raiz</w:t>
+      </w:r>
+      <w:proofErr w:type="spellEnd"/>
+      <w:r>
+        <w:rPr>
+          <w:rFonts w:ascii="Consolas" w:eastAsia="Times New Roman" w:hAnsi="Consolas" w:cs="Times New Roman"/>
+          <w:color w:val="auto"/>
+          <w:sz w:val="21"/>
+          <w:szCs w:val="21"/>
+          <w:lang w:val="es-ES"/>
+        </w:rPr>
+        <w:t xml:space="preserve"> </w:t>
+      </w:r>
+      <w:r>
+        <w:rPr>
+          <w:rFonts w:ascii="Consolas" w:eastAsia="Times New Roman" w:hAnsi="Consolas" w:cs="Times New Roman"/>
+          <w:color w:val="auto"/>
+          <w:sz w:val="21"/>
+          <w:szCs w:val="21"/>
+          <w:lang w:val="es-ES"/>
+        </w:rPr>
+        <w:t xml:space="preserve">el archivo </w:t>
       </w:r>
       <w:proofErr w:type="spellStart"/>
       <w:r>
@@ -4289,7 +4404,7 @@
           <w:sz w:val="21"/>
           <w:szCs w:val="21"/>
         </w:rPr>
-        <w:t>/**/.</w:t>
+        <w:t>/**/*.</w:t>
       </w:r>
       <w:proofErr w:type="spellStart"/>
       <w:r>
@@ -4437,13 +4552,3419 @@
         </w:rPr>
         <w:br/>
       </w:r>
-    </w:p>
-    <w:p>
-      <w:pPr>
-        <w:ind w:firstLine="0"/>
-        <w:rPr>
-          <w:rFonts w:ascii="Consolas" w:eastAsia="Times New Roman" w:hAnsi="Consolas" w:cs="Times New Roman"/>
-          <w:color w:val="auto"/>
+      <w:r>
+        <w:rPr>
+          <w:rFonts w:ascii="Consolas" w:eastAsia="Times New Roman" w:hAnsi="Consolas" w:cs="Times New Roman"/>
+          <w:color w:val="auto"/>
+          <w:sz w:val="21"/>
+          <w:szCs w:val="21"/>
+          <w:lang w:val="es-ES"/>
+        </w:rPr>
+        <w:t>Comandos para hacer las migraciones</w:t>
+      </w:r>
+    </w:p>
+    <w:p>
+      <w:pPr>
+        <w:ind w:firstLine="0"/>
+        <w:rPr>
+          <w:rFonts w:ascii="Consolas" w:eastAsia="Times New Roman" w:hAnsi="Consolas" w:cs="Times New Roman"/>
+          <w:color w:val="auto"/>
+          <w:sz w:val="21"/>
+          <w:szCs w:val="21"/>
+          <w:lang w:val="es-ES"/>
+        </w:rPr>
+      </w:pPr>
+      <w:r>
+        <w:rPr>
+          <w:rFonts w:ascii="Consolas" w:eastAsia="Times New Roman" w:hAnsi="Consolas" w:cs="Times New Roman"/>
+          <w:color w:val="auto"/>
+          <w:sz w:val="21"/>
+          <w:szCs w:val="21"/>
+          <w:lang w:val="es-ES"/>
+        </w:rPr>
+        <w:t>Para crear una migración sin datos</w:t>
+      </w:r>
+    </w:p>
+    <w:p>
+      <w:pPr>
+        <w:ind w:firstLine="0"/>
+        <w:rPr>
+          <w:rFonts w:ascii="Consolas" w:eastAsia="Times New Roman" w:hAnsi="Consolas" w:cs="Times New Roman"/>
+          <w:color w:val="auto"/>
+          <w:sz w:val="21"/>
+          <w:szCs w:val="21"/>
+          <w:lang w:val="es-ES"/>
+        </w:rPr>
+      </w:pPr>
+      <w:proofErr w:type="spellStart"/>
+      <w:r>
+        <w:rPr>
+          <w:rFonts w:ascii="Consolas" w:eastAsia="Times New Roman" w:hAnsi="Consolas" w:cs="Times New Roman"/>
+          <w:color w:val="auto"/>
+          <w:sz w:val="21"/>
+          <w:szCs w:val="21"/>
+          <w:lang w:val="es-ES"/>
+        </w:rPr>
+        <w:t>nmp</w:t>
+      </w:r>
+      <w:proofErr w:type="spellEnd"/>
+      <w:r>
+        <w:rPr>
+          <w:rFonts w:ascii="Consolas" w:eastAsia="Times New Roman" w:hAnsi="Consolas" w:cs="Times New Roman"/>
+          <w:color w:val="auto"/>
+          <w:sz w:val="21"/>
+          <w:szCs w:val="21"/>
+          <w:lang w:val="es-ES"/>
+        </w:rPr>
+        <w:t xml:space="preserve"> run </w:t>
+      </w:r>
+      <w:proofErr w:type="spellStart"/>
+      <w:proofErr w:type="gramStart"/>
+      <w:r>
+        <w:rPr>
+          <w:rFonts w:ascii="Consolas" w:eastAsia="Times New Roman" w:hAnsi="Consolas" w:cs="Times New Roman"/>
+          <w:color w:val="auto"/>
+          <w:sz w:val="21"/>
+          <w:szCs w:val="21"/>
+          <w:lang w:val="es-ES"/>
+        </w:rPr>
+        <w:t>migration:</w:t>
+      </w:r>
+      <w:r>
+        <w:rPr>
+          <w:rFonts w:ascii="Consolas" w:eastAsia="Times New Roman" w:hAnsi="Consolas" w:cs="Times New Roman"/>
+          <w:color w:val="auto"/>
+          <w:sz w:val="21"/>
+          <w:szCs w:val="21"/>
+          <w:lang w:val="es-ES"/>
+        </w:rPr>
+        <w:t>generate</w:t>
+      </w:r>
+      <w:proofErr w:type="spellEnd"/>
+      <w:proofErr w:type="gramEnd"/>
+      <w:r>
+        <w:rPr>
+          <w:rFonts w:ascii="Consolas" w:eastAsia="Times New Roman" w:hAnsi="Consolas" w:cs="Times New Roman"/>
+          <w:color w:val="auto"/>
+          <w:sz w:val="21"/>
+          <w:szCs w:val="21"/>
+          <w:lang w:val="es-ES"/>
+        </w:rPr>
+        <w:t xml:space="preserve"> --</w:t>
+      </w:r>
+      <w:proofErr w:type="spellStart"/>
+      <w:r>
+        <w:rPr>
+          <w:rFonts w:ascii="Consolas" w:eastAsia="Times New Roman" w:hAnsi="Consolas" w:cs="Times New Roman"/>
+          <w:color w:val="auto"/>
+          <w:sz w:val="21"/>
+          <w:szCs w:val="21"/>
+          <w:lang w:val="es-ES"/>
+        </w:rPr>
+        <w:t>name</w:t>
+      </w:r>
+      <w:proofErr w:type="spellEnd"/>
+      <w:r>
+        <w:rPr>
+          <w:rFonts w:ascii="Consolas" w:eastAsia="Times New Roman" w:hAnsi="Consolas" w:cs="Times New Roman"/>
+          <w:color w:val="auto"/>
+          <w:sz w:val="21"/>
+          <w:szCs w:val="21"/>
+          <w:lang w:val="es-ES"/>
+        </w:rPr>
+        <w:t>=</w:t>
+      </w:r>
+      <w:proofErr w:type="spellStart"/>
+      <w:r>
+        <w:rPr>
+          <w:rFonts w:ascii="Consolas" w:eastAsia="Times New Roman" w:hAnsi="Consolas" w:cs="Times New Roman"/>
+          <w:color w:val="auto"/>
+          <w:sz w:val="21"/>
+          <w:szCs w:val="21"/>
+          <w:lang w:val="es-ES"/>
+        </w:rPr>
+        <w:t>elnombredemigracio</w:t>
+      </w:r>
+      <w:r>
+        <w:rPr>
+          <w:rFonts w:ascii="Consolas" w:eastAsia="Times New Roman" w:hAnsi="Consolas" w:cs="Times New Roman"/>
+          <w:color w:val="auto"/>
+          <w:sz w:val="21"/>
+          <w:szCs w:val="21"/>
+          <w:lang w:val="es-ES"/>
+        </w:rPr>
+        <w:t>n</w:t>
+      </w:r>
+      <w:proofErr w:type="spellEnd"/>
+    </w:p>
+    <w:p>
+      <w:pPr>
+        <w:ind w:firstLine="0"/>
+        <w:rPr>
+          <w:rFonts w:ascii="Consolas" w:eastAsia="Times New Roman" w:hAnsi="Consolas" w:cs="Times New Roman"/>
+          <w:color w:val="auto"/>
+          <w:sz w:val="21"/>
+          <w:szCs w:val="21"/>
+          <w:lang w:val="es-ES"/>
+        </w:rPr>
+      </w:pPr>
+      <w:r>
+        <w:rPr>
+          <w:rFonts w:ascii="Consolas" w:eastAsia="Times New Roman" w:hAnsi="Consolas" w:cs="Times New Roman"/>
+          <w:color w:val="auto"/>
+          <w:sz w:val="21"/>
+          <w:szCs w:val="21"/>
+          <w:lang w:val="es-ES"/>
+        </w:rPr>
+        <w:lastRenderedPageBreak/>
+        <w:t xml:space="preserve">Para crear una migración a partir de un </w:t>
+      </w:r>
+      <w:proofErr w:type="spellStart"/>
+      <w:r>
+        <w:rPr>
+          <w:rFonts w:ascii="Consolas" w:eastAsia="Times New Roman" w:hAnsi="Consolas" w:cs="Times New Roman"/>
+          <w:color w:val="auto"/>
+          <w:sz w:val="21"/>
+          <w:szCs w:val="21"/>
+          <w:lang w:val="es-ES"/>
+        </w:rPr>
+        <w:t>entiti</w:t>
+      </w:r>
+      <w:proofErr w:type="spellEnd"/>
+    </w:p>
+    <w:p>
+      <w:pPr>
+        <w:ind w:firstLine="0"/>
+        <w:rPr>
+          <w:rFonts w:ascii="Consolas" w:eastAsia="Times New Roman" w:hAnsi="Consolas" w:cs="Times New Roman"/>
+          <w:b/>
+          <w:bCs/>
+          <w:color w:val="auto"/>
+          <w:sz w:val="21"/>
+          <w:szCs w:val="21"/>
+          <w:lang w:val="es-ES"/>
+        </w:rPr>
+      </w:pPr>
+      <w:proofErr w:type="spellStart"/>
+      <w:r>
+        <w:rPr>
+          <w:rFonts w:ascii="Consolas" w:eastAsia="Times New Roman" w:hAnsi="Consolas" w:cs="Times New Roman"/>
+          <w:b/>
+          <w:bCs/>
+          <w:color w:val="auto"/>
+          <w:sz w:val="21"/>
+          <w:szCs w:val="21"/>
+          <w:lang w:val="es-ES"/>
+        </w:rPr>
+        <w:t>nmp</w:t>
+      </w:r>
+      <w:proofErr w:type="spellEnd"/>
+      <w:r>
+        <w:rPr>
+          <w:rFonts w:ascii="Consolas" w:eastAsia="Times New Roman" w:hAnsi="Consolas" w:cs="Times New Roman"/>
+          <w:b/>
+          <w:bCs/>
+          <w:color w:val="auto"/>
+          <w:sz w:val="21"/>
+          <w:szCs w:val="21"/>
+          <w:lang w:val="es-ES"/>
+        </w:rPr>
+        <w:t xml:space="preserve"> run </w:t>
+      </w:r>
+      <w:proofErr w:type="spellStart"/>
+      <w:proofErr w:type="gramStart"/>
+      <w:r>
+        <w:rPr>
+          <w:rFonts w:ascii="Consolas" w:eastAsia="Times New Roman" w:hAnsi="Consolas" w:cs="Times New Roman"/>
+          <w:b/>
+          <w:bCs/>
+          <w:color w:val="auto"/>
+          <w:sz w:val="21"/>
+          <w:szCs w:val="21"/>
+          <w:lang w:val="es-ES"/>
+        </w:rPr>
+        <w:t>migration:</w:t>
+      </w:r>
+      <w:r>
+        <w:rPr>
+          <w:rFonts w:ascii="Consolas" w:eastAsia="Times New Roman" w:hAnsi="Consolas" w:cs="Times New Roman"/>
+          <w:b/>
+          <w:bCs/>
+          <w:color w:val="auto"/>
+          <w:sz w:val="21"/>
+          <w:szCs w:val="21"/>
+          <w:lang w:val="es-ES"/>
+        </w:rPr>
+        <w:t>create</w:t>
+      </w:r>
+      <w:proofErr w:type="spellEnd"/>
+      <w:proofErr w:type="gramEnd"/>
+      <w:r>
+        <w:rPr>
+          <w:rFonts w:ascii="Consolas" w:eastAsia="Times New Roman" w:hAnsi="Consolas" w:cs="Times New Roman"/>
+          <w:b/>
+          <w:bCs/>
+          <w:color w:val="auto"/>
+          <w:sz w:val="21"/>
+          <w:szCs w:val="21"/>
+          <w:lang w:val="es-ES"/>
+        </w:rPr>
+        <w:t xml:space="preserve"> –</w:t>
+      </w:r>
+      <w:proofErr w:type="spellStart"/>
+      <w:r>
+        <w:rPr>
+          <w:rFonts w:ascii="Consolas" w:eastAsia="Times New Roman" w:hAnsi="Consolas" w:cs="Times New Roman"/>
+          <w:b/>
+          <w:bCs/>
+          <w:color w:val="auto"/>
+          <w:sz w:val="21"/>
+          <w:szCs w:val="21"/>
+          <w:lang w:val="es-ES"/>
+        </w:rPr>
+        <w:t>name</w:t>
+      </w:r>
+      <w:proofErr w:type="spellEnd"/>
+      <w:r>
+        <w:rPr>
+          <w:rFonts w:ascii="Consolas" w:eastAsia="Times New Roman" w:hAnsi="Consolas" w:cs="Times New Roman"/>
+          <w:b/>
+          <w:bCs/>
+          <w:color w:val="auto"/>
+          <w:sz w:val="21"/>
+          <w:szCs w:val="21"/>
+          <w:lang w:val="es-ES"/>
+        </w:rPr>
+        <w:t>=</w:t>
+      </w:r>
+      <w:proofErr w:type="spellStart"/>
+      <w:r>
+        <w:rPr>
+          <w:rFonts w:ascii="Consolas" w:eastAsia="Times New Roman" w:hAnsi="Consolas" w:cs="Times New Roman"/>
+          <w:b/>
+          <w:bCs/>
+          <w:color w:val="auto"/>
+          <w:sz w:val="21"/>
+          <w:szCs w:val="21"/>
+          <w:lang w:val="es-ES"/>
+        </w:rPr>
+        <w:t>elnombredemigracion</w:t>
+      </w:r>
+      <w:proofErr w:type="spellEnd"/>
+    </w:p>
+    <w:p>
+      <w:pPr>
+        <w:ind w:firstLine="0"/>
+        <w:rPr>
+          <w:rFonts w:ascii="Consolas" w:eastAsia="Times New Roman" w:hAnsi="Consolas" w:cs="Times New Roman"/>
+          <w:color w:val="auto"/>
+          <w:sz w:val="21"/>
+          <w:szCs w:val="21"/>
+          <w:lang w:val="es-ES"/>
+        </w:rPr>
+      </w:pPr>
+      <w:r>
+        <w:rPr>
+          <w:rFonts w:ascii="Consolas" w:eastAsia="Times New Roman" w:hAnsi="Consolas" w:cs="Times New Roman"/>
+          <w:color w:val="auto"/>
+          <w:sz w:val="21"/>
+          <w:szCs w:val="21"/>
+          <w:lang w:val="es-ES"/>
+        </w:rPr>
+        <w:t>para hacer correr las m</w:t>
+      </w:r>
+      <w:r>
+        <w:rPr>
+          <w:rFonts w:ascii="Consolas" w:eastAsia="Times New Roman" w:hAnsi="Consolas" w:cs="Times New Roman"/>
+          <w:color w:val="auto"/>
+          <w:sz w:val="21"/>
+          <w:szCs w:val="21"/>
+          <w:lang w:val="es-ES"/>
+        </w:rPr>
+        <w:t>igraciones</w:t>
+      </w:r>
+    </w:p>
+    <w:p>
+      <w:pPr>
+        <w:ind w:firstLine="0"/>
+        <w:rPr>
+          <w:rFonts w:ascii="Consolas" w:eastAsia="Times New Roman" w:hAnsi="Consolas" w:cs="Times New Roman"/>
+          <w:b/>
+          <w:bCs/>
+          <w:color w:val="auto"/>
+          <w:sz w:val="21"/>
+          <w:szCs w:val="21"/>
+          <w:lang w:val="es-ES"/>
+        </w:rPr>
+      </w:pPr>
+      <w:proofErr w:type="spellStart"/>
+      <w:r>
+        <w:rPr>
+          <w:rFonts w:ascii="Consolas" w:eastAsia="Times New Roman" w:hAnsi="Consolas" w:cs="Times New Roman"/>
+          <w:b/>
+          <w:bCs/>
+          <w:color w:val="auto"/>
+          <w:sz w:val="21"/>
+          <w:szCs w:val="21"/>
+          <w:lang w:val="es-ES"/>
+        </w:rPr>
+        <w:t>npm</w:t>
+      </w:r>
+      <w:proofErr w:type="spellEnd"/>
+      <w:r>
+        <w:rPr>
+          <w:rFonts w:ascii="Consolas" w:eastAsia="Times New Roman" w:hAnsi="Consolas" w:cs="Times New Roman"/>
+          <w:b/>
+          <w:bCs/>
+          <w:color w:val="auto"/>
+          <w:sz w:val="21"/>
+          <w:szCs w:val="21"/>
+          <w:lang w:val="es-ES"/>
+        </w:rPr>
+        <w:t xml:space="preserve"> run </w:t>
+      </w:r>
+      <w:proofErr w:type="spellStart"/>
+      <w:proofErr w:type="gramStart"/>
+      <w:r>
+        <w:rPr>
+          <w:rFonts w:ascii="Consolas" w:eastAsia="Times New Roman" w:hAnsi="Consolas" w:cs="Times New Roman"/>
+          <w:b/>
+          <w:bCs/>
+          <w:color w:val="auto"/>
+          <w:sz w:val="21"/>
+          <w:szCs w:val="21"/>
+          <w:lang w:val="es-ES"/>
+        </w:rPr>
+        <w:t>migration:run</w:t>
+      </w:r>
+      <w:proofErr w:type="spellEnd"/>
+      <w:proofErr w:type="gramEnd"/>
+    </w:p>
+    <w:p>
+      <w:pPr>
+        <w:ind w:firstLine="0"/>
+        <w:rPr>
+          <w:rFonts w:ascii="Consolas" w:eastAsia="Times New Roman" w:hAnsi="Consolas" w:cs="Times New Roman"/>
+          <w:color w:val="auto"/>
+          <w:sz w:val="21"/>
+          <w:szCs w:val="21"/>
+          <w:lang w:val="es-ES"/>
+        </w:rPr>
+      </w:pPr>
+      <w:r>
+        <w:rPr>
+          <w:rFonts w:ascii="Consolas" w:eastAsia="Times New Roman" w:hAnsi="Consolas" w:cs="Times New Roman"/>
+          <w:color w:val="auto"/>
+          <w:sz w:val="21"/>
+          <w:szCs w:val="21"/>
+          <w:lang w:val="es-ES"/>
+        </w:rPr>
+        <w:t>para hacer deshacer una migración</w:t>
+      </w:r>
+    </w:p>
+    <w:p>
+      <w:pPr>
+        <w:ind w:firstLine="0"/>
+        <w:rPr>
+          <w:rFonts w:ascii="Consolas" w:eastAsia="Times New Roman" w:hAnsi="Consolas" w:cs="Times New Roman"/>
+          <w:color w:val="auto"/>
+          <w:sz w:val="21"/>
+          <w:szCs w:val="21"/>
+          <w:lang w:val="es-ES"/>
+        </w:rPr>
+      </w:pPr>
+      <w:proofErr w:type="spellStart"/>
+      <w:r>
+        <w:rPr>
+          <w:rFonts w:ascii="Consolas" w:eastAsia="Times New Roman" w:hAnsi="Consolas" w:cs="Times New Roman"/>
+          <w:b/>
+          <w:bCs/>
+          <w:color w:val="auto"/>
+          <w:sz w:val="21"/>
+          <w:szCs w:val="21"/>
+          <w:lang w:val="es-ES"/>
+        </w:rPr>
+        <w:t>npm</w:t>
+      </w:r>
+      <w:proofErr w:type="spellEnd"/>
+      <w:r>
+        <w:rPr>
+          <w:rFonts w:ascii="Consolas" w:eastAsia="Times New Roman" w:hAnsi="Consolas" w:cs="Times New Roman"/>
+          <w:b/>
+          <w:bCs/>
+          <w:color w:val="auto"/>
+          <w:sz w:val="21"/>
+          <w:szCs w:val="21"/>
+          <w:lang w:val="es-ES"/>
+        </w:rPr>
+        <w:t xml:space="preserve"> run </w:t>
+      </w:r>
+      <w:proofErr w:type="spellStart"/>
+      <w:proofErr w:type="gramStart"/>
+      <w:r>
+        <w:rPr>
+          <w:rFonts w:ascii="Consolas" w:eastAsia="Times New Roman" w:hAnsi="Consolas" w:cs="Times New Roman"/>
+          <w:b/>
+          <w:bCs/>
+          <w:color w:val="auto"/>
+          <w:sz w:val="21"/>
+          <w:szCs w:val="21"/>
+          <w:lang w:val="es-ES"/>
+        </w:rPr>
+        <w:t>migration:revert</w:t>
+      </w:r>
+      <w:proofErr w:type="spellEnd"/>
+      <w:proofErr w:type="gramEnd"/>
+      <w:r>
+        <w:rPr>
+          <w:rFonts w:ascii="Consolas" w:eastAsia="Times New Roman" w:hAnsi="Consolas" w:cs="Times New Roman"/>
+          <w:b/>
+          <w:bCs/>
+          <w:color w:val="auto"/>
+          <w:sz w:val="21"/>
+          <w:szCs w:val="21"/>
+          <w:lang w:val="es-ES"/>
+        </w:rPr>
+        <w:br/>
+      </w:r>
+      <w:r>
+        <w:rPr>
+          <w:rFonts w:ascii="Consolas" w:eastAsia="Times New Roman" w:hAnsi="Consolas" w:cs="Times New Roman"/>
+          <w:color w:val="auto"/>
+          <w:sz w:val="21"/>
+          <w:szCs w:val="21"/>
+          <w:lang w:val="es-ES"/>
+        </w:rPr>
+        <w:t>Luego probamos lo</w:t>
+      </w:r>
+      <w:r>
+        <w:rPr>
+          <w:rFonts w:ascii="Consolas" w:eastAsia="Times New Roman" w:hAnsi="Consolas" w:cs="Times New Roman"/>
+          <w:color w:val="auto"/>
+          <w:sz w:val="21"/>
+          <w:szCs w:val="21"/>
+          <w:lang w:val="es-ES"/>
+        </w:rPr>
+        <w:t>s comandos y no nos tiene que dar error</w:t>
+      </w:r>
+    </w:p>
+    <w:p>
+      <w:pPr>
+        <w:ind w:firstLine="0"/>
+        <w:rPr>
+          <w:rFonts w:ascii="Consolas" w:eastAsia="Times New Roman" w:hAnsi="Consolas" w:cs="Times New Roman"/>
+          <w:color w:val="auto"/>
+          <w:sz w:val="21"/>
+          <w:szCs w:val="21"/>
+          <w:lang w:val="es-ES"/>
+        </w:rPr>
+      </w:pPr>
+      <w:r>
+        <w:rPr>
+          <w:rFonts w:ascii="Consolas" w:eastAsia="Times New Roman" w:hAnsi="Consolas" w:cs="Times New Roman"/>
+          <w:color w:val="auto"/>
+          <w:sz w:val="21"/>
+          <w:szCs w:val="21"/>
+          <w:lang w:val="es-ES"/>
+        </w:rPr>
+        <w:t xml:space="preserve">y seguidamente utilizamos el gestor de base de datos de </w:t>
+      </w:r>
+      <w:proofErr w:type="spellStart"/>
+      <w:r>
+        <w:rPr>
+          <w:rFonts w:ascii="Consolas" w:eastAsia="Times New Roman" w:hAnsi="Consolas" w:cs="Times New Roman"/>
+          <w:color w:val="auto"/>
+          <w:sz w:val="21"/>
+          <w:szCs w:val="21"/>
+          <w:lang w:val="es-ES"/>
+        </w:rPr>
+        <w:t>dbeaver</w:t>
+      </w:r>
+      <w:proofErr w:type="spellEnd"/>
+    </w:p>
+    <w:p>
+      <w:pPr>
+        <w:ind w:firstLine="0"/>
+        <w:rPr>
+          <w:rFonts w:ascii="Consolas" w:eastAsia="Times New Roman" w:hAnsi="Consolas" w:cs="Times New Roman"/>
+          <w:color w:val="auto"/>
+          <w:sz w:val="21"/>
+          <w:szCs w:val="21"/>
+          <w:lang w:val="es-ES"/>
+        </w:rPr>
+      </w:pPr>
+    </w:p>
+    <w:p>
+      <w:pPr>
+        <w:pStyle w:val="Ttulo1"/>
+        <w:rPr>
+          <w:rFonts w:eastAsia="Times New Roman"/>
+          <w:lang w:val="es-ES"/>
+        </w:rPr>
+      </w:pPr>
+      <w:r>
+        <w:rPr>
+          <w:rFonts w:eastAsia="Times New Roman"/>
+          <w:lang w:val="es-ES"/>
+        </w:rPr>
+        <w:t>Crear modules</w:t>
+      </w:r>
+    </w:p>
+    <w:p>
+      <w:pPr>
+        <w:rPr>
+          <w:rFonts w:ascii="Consolas" w:hAnsi="Consolas"/>
+          <w:b/>
+          <w:bCs/>
+          <w:lang w:val="es-ES"/>
+        </w:rPr>
+      </w:pPr>
+      <w:r>
+        <w:rPr>
+          <w:rFonts w:ascii="Consolas" w:hAnsi="Consolas"/>
+          <w:lang w:val="es-ES"/>
+        </w:rPr>
+        <w:t xml:space="preserve">Creamos la carpeta con el comando </w:t>
+      </w:r>
+      <w:proofErr w:type="spellStart"/>
+      <w:r>
+        <w:rPr>
+          <w:rFonts w:ascii="Consolas" w:hAnsi="Consolas"/>
+          <w:b/>
+          <w:bCs/>
+          <w:lang w:val="es-ES"/>
+        </w:rPr>
+        <w:t>nest</w:t>
+      </w:r>
+      <w:proofErr w:type="spellEnd"/>
+      <w:r>
+        <w:rPr>
+          <w:rFonts w:ascii="Consolas" w:hAnsi="Consolas"/>
+          <w:b/>
+          <w:bCs/>
+          <w:lang w:val="es-ES"/>
+        </w:rPr>
+        <w:t xml:space="preserve"> g res modules/</w:t>
+      </w:r>
+      <w:proofErr w:type="spellStart"/>
+      <w:r>
+        <w:rPr>
+          <w:rFonts w:ascii="Consolas" w:hAnsi="Consolas"/>
+          <w:b/>
+          <w:bCs/>
+          <w:lang w:val="es-ES"/>
+        </w:rPr>
+        <w:t>users</w:t>
+      </w:r>
+      <w:proofErr w:type="spellEnd"/>
+    </w:p>
+    <w:p>
+      <w:pPr>
+        <w:rPr>
+          <w:rFonts w:ascii="Consolas" w:hAnsi="Consolas"/>
+          <w:lang w:val="es-ES"/>
+        </w:rPr>
+      </w:pPr>
+      <w:r>
+        <w:rPr>
+          <w:rFonts w:ascii="Consolas" w:hAnsi="Consolas"/>
+          <w:lang w:val="es-ES"/>
+        </w:rPr>
+        <w:t xml:space="preserve">Damos </w:t>
+      </w:r>
+      <w:proofErr w:type="spellStart"/>
+      <w:r>
+        <w:rPr>
+          <w:rFonts w:ascii="Consolas" w:hAnsi="Consolas"/>
+          <w:lang w:val="es-ES"/>
+        </w:rPr>
+        <w:t>enter</w:t>
+      </w:r>
+      <w:proofErr w:type="spellEnd"/>
+      <w:r>
+        <w:rPr>
+          <w:rFonts w:ascii="Consolas" w:hAnsi="Consolas"/>
+          <w:lang w:val="es-ES"/>
+        </w:rPr>
+        <w:t xml:space="preserve"> en </w:t>
+      </w:r>
+      <w:proofErr w:type="spellStart"/>
+      <w:r>
+        <w:rPr>
+          <w:rFonts w:ascii="Consolas" w:hAnsi="Consolas"/>
+          <w:lang w:val="es-ES"/>
+        </w:rPr>
+        <w:t>rest</w:t>
+      </w:r>
+      <w:proofErr w:type="spellEnd"/>
+      <w:r>
+        <w:rPr>
+          <w:rFonts w:ascii="Consolas" w:hAnsi="Consolas"/>
+          <w:lang w:val="es-ES"/>
+        </w:rPr>
+        <w:t xml:space="preserve"> api y luego yes</w:t>
+      </w:r>
+    </w:p>
+    <w:p>
+      <w:pPr>
+        <w:rPr>
+          <w:rFonts w:ascii="Consolas" w:hAnsi="Consolas"/>
+          <w:lang w:val="es-ES"/>
+        </w:rPr>
+      </w:pPr>
+      <w:r>
+        <w:rPr>
+          <w:rFonts w:ascii="Consolas" w:hAnsi="Consolas"/>
+          <w:lang w:val="es-ES"/>
+        </w:rPr>
+        <w:t xml:space="preserve">Miramos el archivo, seguidamente el la carpeta </w:t>
+      </w:r>
+      <w:proofErr w:type="spellStart"/>
+      <w:r>
+        <w:rPr>
+          <w:rFonts w:ascii="Consolas" w:hAnsi="Consolas"/>
+          <w:lang w:val="es-ES"/>
+        </w:rPr>
+        <w:t>entities</w:t>
+      </w:r>
+      <w:proofErr w:type="spellEnd"/>
+      <w:r>
+        <w:rPr>
+          <w:rFonts w:ascii="Consolas" w:hAnsi="Consolas"/>
+          <w:lang w:val="es-ES"/>
+        </w:rPr>
+        <w:t xml:space="preserve"> el en archivo </w:t>
+      </w:r>
+      <w:proofErr w:type="spellStart"/>
+      <w:proofErr w:type="gramStart"/>
+      <w:r>
+        <w:rPr>
+          <w:rFonts w:ascii="Consolas" w:hAnsi="Consolas"/>
+          <w:lang w:val="es-ES"/>
+        </w:rPr>
+        <w:t>user.entity</w:t>
+      </w:r>
+      <w:proofErr w:type="gramEnd"/>
+      <w:r>
+        <w:rPr>
+          <w:rFonts w:ascii="Consolas" w:hAnsi="Consolas"/>
+          <w:lang w:val="es-ES"/>
+        </w:rPr>
+        <w:t>.ts</w:t>
+      </w:r>
+      <w:proofErr w:type="spellEnd"/>
+      <w:r>
+        <w:rPr>
+          <w:rFonts w:ascii="Consolas" w:hAnsi="Consolas"/>
+          <w:lang w:val="es-ES"/>
+        </w:rPr>
+        <w:t xml:space="preserve"> </w:t>
+      </w:r>
+      <w:proofErr w:type="spellStart"/>
+      <w:r>
+        <w:rPr>
+          <w:rFonts w:ascii="Consolas" w:hAnsi="Consolas"/>
+          <w:lang w:val="es-ES"/>
+        </w:rPr>
+        <w:t>cramos</w:t>
+      </w:r>
+      <w:proofErr w:type="spellEnd"/>
+      <w:r>
+        <w:rPr>
+          <w:rFonts w:ascii="Consolas" w:hAnsi="Consolas"/>
+          <w:lang w:val="es-ES"/>
+        </w:rPr>
+        <w:t xml:space="preserve"> los campos de la base de datos</w:t>
+      </w:r>
+    </w:p>
+    <w:p>
+      <w:pPr>
+        <w:shd w:val="clear" w:color="auto" w:fill="1A1B26"/>
+        <w:spacing w:after="0" w:line="285" w:lineRule="atLeast"/>
+        <w:ind w:firstLine="0"/>
+        <w:rPr>
+          <w:rFonts w:ascii="Consolas" w:eastAsia="Times New Roman" w:hAnsi="Consolas" w:cs="Times New Roman"/>
+          <w:color w:val="C0CAF5"/>
+          <w:sz w:val="21"/>
+          <w:szCs w:val="21"/>
+        </w:rPr>
+      </w:pPr>
+      <w:r>
+        <w:rPr>
+          <w:rFonts w:ascii="Consolas" w:eastAsia="Times New Roman" w:hAnsi="Consolas" w:cs="Times New Roman"/>
+          <w:color w:val="BB9AF7"/>
+          <w:sz w:val="21"/>
+          <w:szCs w:val="21"/>
+        </w:rPr>
+        <w:t>import</w:t>
+      </w:r>
+      <w:r>
+        <w:rPr>
+          <w:rFonts w:ascii="Consolas" w:eastAsia="Times New Roman" w:hAnsi="Consolas" w:cs="Times New Roman"/>
+          <w:color w:val="C0CAF5"/>
+          <w:sz w:val="21"/>
+          <w:szCs w:val="21"/>
+        </w:rPr>
+        <w:t xml:space="preserve"> </w:t>
+      </w:r>
+      <w:proofErr w:type="gramStart"/>
+      <w:r>
+        <w:rPr>
+          <w:rFonts w:ascii="Consolas" w:eastAsia="Times New Roman" w:hAnsi="Consolas" w:cs="Times New Roman"/>
+          <w:color w:val="C0CAF5"/>
+          <w:sz w:val="21"/>
+          <w:szCs w:val="21"/>
+        </w:rPr>
+        <w:t>{ Column</w:t>
+      </w:r>
+      <w:proofErr w:type="gramEnd"/>
+      <w:r>
+        <w:rPr>
+          <w:rFonts w:ascii="Consolas" w:eastAsia="Times New Roman" w:hAnsi="Consolas" w:cs="Times New Roman"/>
+          <w:color w:val="C0CAF5"/>
+          <w:sz w:val="21"/>
+          <w:szCs w:val="21"/>
+        </w:rPr>
+        <w:t xml:space="preserve">, Entity, </w:t>
+      </w:r>
+      <w:proofErr w:type="spellStart"/>
+      <w:r>
+        <w:rPr>
+          <w:rFonts w:ascii="Consolas" w:eastAsia="Times New Roman" w:hAnsi="Consolas" w:cs="Times New Roman"/>
+          <w:color w:val="C0CAF5"/>
+          <w:sz w:val="21"/>
+          <w:szCs w:val="21"/>
+        </w:rPr>
+        <w:t>PrimaryGeneratedColumn</w:t>
+      </w:r>
+      <w:proofErr w:type="spellEnd"/>
+      <w:r>
+        <w:rPr>
+          <w:rFonts w:ascii="Consolas" w:eastAsia="Times New Roman" w:hAnsi="Consolas" w:cs="Times New Roman"/>
+          <w:color w:val="C0CAF5"/>
+          <w:sz w:val="21"/>
+          <w:szCs w:val="21"/>
+        </w:rPr>
+        <w:t xml:space="preserve"> } </w:t>
+      </w:r>
+      <w:r>
+        <w:rPr>
+          <w:rFonts w:ascii="Consolas" w:eastAsia="Times New Roman" w:hAnsi="Consolas" w:cs="Times New Roman"/>
+          <w:color w:val="BB9AF7"/>
+          <w:sz w:val="21"/>
+          <w:szCs w:val="21"/>
+        </w:rPr>
+        <w:t>from</w:t>
+      </w:r>
+      <w:r>
+        <w:rPr>
+          <w:rFonts w:ascii="Consolas" w:eastAsia="Times New Roman" w:hAnsi="Consolas" w:cs="Times New Roman"/>
+          <w:color w:val="C0CAF5"/>
+          <w:sz w:val="21"/>
+          <w:szCs w:val="21"/>
+        </w:rPr>
+        <w:t xml:space="preserve"> "</w:t>
+      </w:r>
+      <w:proofErr w:type="spellStart"/>
+      <w:r>
+        <w:rPr>
+          <w:rFonts w:ascii="Consolas" w:eastAsia="Times New Roman" w:hAnsi="Consolas" w:cs="Times New Roman"/>
+          <w:color w:val="9ECE6A"/>
+          <w:sz w:val="21"/>
+          <w:szCs w:val="21"/>
+        </w:rPr>
+        <w:t>typeorm</w:t>
+      </w:r>
+      <w:proofErr w:type="spellEnd"/>
+      <w:r>
+        <w:rPr>
+          <w:rFonts w:ascii="Consolas" w:eastAsia="Times New Roman" w:hAnsi="Consolas" w:cs="Times New Roman"/>
+          <w:color w:val="C0CAF5"/>
+          <w:sz w:val="21"/>
+          <w:szCs w:val="21"/>
+        </w:rPr>
+        <w:t>";</w:t>
+      </w:r>
+    </w:p>
+    <w:p>
+      <w:pPr>
+        <w:shd w:val="clear" w:color="auto" w:fill="1A1B26"/>
+        <w:spacing w:after="0" w:line="285" w:lineRule="atLeast"/>
+        <w:ind w:firstLine="0"/>
+        <w:rPr>
+          <w:rFonts w:ascii="Consolas" w:eastAsia="Times New Roman" w:hAnsi="Consolas" w:cs="Times New Roman"/>
+          <w:color w:val="C0CAF5"/>
+          <w:sz w:val="21"/>
+          <w:szCs w:val="21"/>
+        </w:rPr>
+      </w:pPr>
+    </w:p>
+    <w:p>
+      <w:pPr>
+        <w:shd w:val="clear" w:color="auto" w:fill="1A1B26"/>
+        <w:spacing w:after="0" w:line="285" w:lineRule="atLeast"/>
+        <w:ind w:firstLine="0"/>
+        <w:rPr>
+          <w:rFonts w:ascii="Consolas" w:eastAsia="Times New Roman" w:hAnsi="Consolas" w:cs="Times New Roman"/>
+          <w:color w:val="C0CAF5"/>
+          <w:sz w:val="21"/>
+          <w:szCs w:val="21"/>
+        </w:rPr>
+      </w:pPr>
+      <w:r>
+        <w:rPr>
+          <w:rFonts w:ascii="Consolas" w:eastAsia="Times New Roman" w:hAnsi="Consolas" w:cs="Times New Roman"/>
+          <w:color w:val="C0CAF5"/>
+          <w:sz w:val="21"/>
+          <w:szCs w:val="21"/>
+        </w:rPr>
+        <w:t>@</w:t>
+      </w:r>
+      <w:proofErr w:type="gramStart"/>
+      <w:r>
+        <w:rPr>
+          <w:rFonts w:ascii="Consolas" w:eastAsia="Times New Roman" w:hAnsi="Consolas" w:cs="Times New Roman"/>
+          <w:color w:val="7AA2F7"/>
+          <w:sz w:val="21"/>
+          <w:szCs w:val="21"/>
+        </w:rPr>
+        <w:t>Entity</w:t>
+      </w:r>
+      <w:r>
+        <w:rPr>
+          <w:rFonts w:ascii="Consolas" w:eastAsia="Times New Roman" w:hAnsi="Consolas" w:cs="Times New Roman"/>
+          <w:color w:val="C0CAF5"/>
+          <w:sz w:val="21"/>
+          <w:szCs w:val="21"/>
+        </w:rPr>
+        <w:t>(</w:t>
+      </w:r>
+      <w:proofErr w:type="gramEnd"/>
+      <w:r>
+        <w:rPr>
+          <w:rFonts w:ascii="Consolas" w:eastAsia="Times New Roman" w:hAnsi="Consolas" w:cs="Times New Roman"/>
+          <w:color w:val="C0CAF5"/>
+          <w:sz w:val="21"/>
+          <w:szCs w:val="21"/>
+        </w:rPr>
+        <w:t>)</w:t>
+      </w:r>
+    </w:p>
+    <w:p>
+      <w:pPr>
+        <w:shd w:val="clear" w:color="auto" w:fill="1A1B26"/>
+        <w:spacing w:after="0" w:line="285" w:lineRule="atLeast"/>
+        <w:ind w:firstLine="0"/>
+        <w:rPr>
+          <w:rFonts w:ascii="Consolas" w:eastAsia="Times New Roman" w:hAnsi="Consolas" w:cs="Times New Roman"/>
+          <w:color w:val="C0CAF5"/>
+          <w:sz w:val="21"/>
+          <w:szCs w:val="21"/>
+        </w:rPr>
+      </w:pPr>
+      <w:r>
+        <w:rPr>
+          <w:rFonts w:ascii="Consolas" w:eastAsia="Times New Roman" w:hAnsi="Consolas" w:cs="Times New Roman"/>
+          <w:color w:val="BB9AF7"/>
+          <w:sz w:val="21"/>
+          <w:szCs w:val="21"/>
+        </w:rPr>
+        <w:t>export</w:t>
+      </w:r>
+      <w:r>
+        <w:rPr>
+          <w:rFonts w:ascii="Consolas" w:eastAsia="Times New Roman" w:hAnsi="Consolas" w:cs="Times New Roman"/>
+          <w:color w:val="C0CAF5"/>
+          <w:sz w:val="21"/>
+          <w:szCs w:val="21"/>
+        </w:rPr>
+        <w:t xml:space="preserve"> </w:t>
+      </w:r>
+      <w:r>
+        <w:rPr>
+          <w:rFonts w:ascii="Consolas" w:eastAsia="Times New Roman" w:hAnsi="Consolas" w:cs="Times New Roman"/>
+          <w:color w:val="BB9AF7"/>
+          <w:sz w:val="21"/>
+          <w:szCs w:val="21"/>
+        </w:rPr>
+        <w:t>class</w:t>
+      </w:r>
+      <w:r>
+        <w:rPr>
+          <w:rFonts w:ascii="Consolas" w:eastAsia="Times New Roman" w:hAnsi="Consolas" w:cs="Times New Roman"/>
+          <w:color w:val="C0CAF5"/>
+          <w:sz w:val="21"/>
+          <w:szCs w:val="21"/>
+        </w:rPr>
+        <w:t xml:space="preserve"> </w:t>
+      </w:r>
+      <w:r>
+        <w:rPr>
+          <w:rFonts w:ascii="Consolas" w:eastAsia="Times New Roman" w:hAnsi="Consolas" w:cs="Times New Roman"/>
+          <w:color w:val="7DCFFF"/>
+          <w:sz w:val="21"/>
+          <w:szCs w:val="21"/>
+        </w:rPr>
+        <w:t>User</w:t>
+      </w:r>
+      <w:r>
+        <w:rPr>
+          <w:rFonts w:ascii="Consolas" w:eastAsia="Times New Roman" w:hAnsi="Consolas" w:cs="Times New Roman"/>
+          <w:color w:val="C0CAF5"/>
+          <w:sz w:val="21"/>
+          <w:szCs w:val="21"/>
+        </w:rPr>
+        <w:t xml:space="preserve"> {</w:t>
+      </w:r>
+    </w:p>
+    <w:p>
+      <w:pPr>
+        <w:shd w:val="clear" w:color="auto" w:fill="1A1B26"/>
+        <w:spacing w:after="0" w:line="285" w:lineRule="atLeast"/>
+        <w:ind w:firstLine="0"/>
+        <w:rPr>
+          <w:rFonts w:ascii="Consolas" w:eastAsia="Times New Roman" w:hAnsi="Consolas" w:cs="Times New Roman"/>
+          <w:color w:val="C0CAF5"/>
+          <w:sz w:val="21"/>
+          <w:szCs w:val="21"/>
+        </w:rPr>
+      </w:pPr>
+    </w:p>
+    <w:p>
+      <w:pPr>
+        <w:shd w:val="clear" w:color="auto" w:fill="1A1B26"/>
+        <w:spacing w:after="0" w:line="285" w:lineRule="atLeast"/>
+        <w:ind w:firstLine="0"/>
+        <w:rPr>
+          <w:rFonts w:ascii="Consolas" w:eastAsia="Times New Roman" w:hAnsi="Consolas" w:cs="Times New Roman"/>
+          <w:color w:val="C0CAF5"/>
+          <w:sz w:val="21"/>
+          <w:szCs w:val="21"/>
+        </w:rPr>
+      </w:pPr>
+      <w:r>
+        <w:rPr>
+          <w:rFonts w:ascii="Consolas" w:eastAsia="Times New Roman" w:hAnsi="Consolas" w:cs="Times New Roman"/>
+          <w:color w:val="C0CAF5"/>
+          <w:sz w:val="21"/>
+          <w:szCs w:val="21"/>
+        </w:rPr>
+        <w:t>    @</w:t>
+      </w:r>
+      <w:r>
+        <w:rPr>
+          <w:rFonts w:ascii="Consolas" w:eastAsia="Times New Roman" w:hAnsi="Consolas" w:cs="Times New Roman"/>
+          <w:color w:val="7AA2F7"/>
+          <w:sz w:val="21"/>
+          <w:szCs w:val="21"/>
+        </w:rPr>
+        <w:t>PrimaryGeneratedColumn</w:t>
+      </w:r>
+      <w:r>
+        <w:rPr>
+          <w:rFonts w:ascii="Consolas" w:eastAsia="Times New Roman" w:hAnsi="Consolas" w:cs="Times New Roman"/>
+          <w:color w:val="C0CAF5"/>
+          <w:sz w:val="21"/>
+          <w:szCs w:val="21"/>
+        </w:rPr>
+        <w:t>('</w:t>
+      </w:r>
+      <w:r>
+        <w:rPr>
+          <w:rFonts w:ascii="Consolas" w:eastAsia="Times New Roman" w:hAnsi="Consolas" w:cs="Times New Roman"/>
+          <w:color w:val="9ECE6A"/>
+          <w:sz w:val="21"/>
+          <w:szCs w:val="21"/>
+        </w:rPr>
+        <w:t>uuid</w:t>
+      </w:r>
+      <w:r>
+        <w:rPr>
+          <w:rFonts w:ascii="Consolas" w:eastAsia="Times New Roman" w:hAnsi="Consolas" w:cs="Times New Roman"/>
+          <w:color w:val="C0CAF5"/>
+          <w:sz w:val="21"/>
+          <w:szCs w:val="21"/>
+        </w:rPr>
+        <w:t>')</w:t>
+      </w:r>
+    </w:p>
+    <w:p>
+      <w:pPr>
+        <w:shd w:val="clear" w:color="auto" w:fill="1A1B26"/>
+        <w:spacing w:after="0" w:line="285" w:lineRule="atLeast"/>
+        <w:ind w:firstLine="0"/>
+        <w:rPr>
+          <w:rFonts w:ascii="Consolas" w:eastAsia="Times New Roman" w:hAnsi="Consolas" w:cs="Times New Roman"/>
+          <w:color w:val="C0CAF5"/>
+          <w:sz w:val="21"/>
+          <w:szCs w:val="21"/>
+        </w:rPr>
+      </w:pPr>
+      <w:r>
+        <w:rPr>
+          <w:rFonts w:ascii="Consolas" w:eastAsia="Times New Roman" w:hAnsi="Consolas" w:cs="Times New Roman"/>
+          <w:color w:val="C0CAF5"/>
+          <w:sz w:val="21"/>
+          <w:szCs w:val="21"/>
+        </w:rPr>
+        <w:t>    id</w:t>
+      </w:r>
+      <w:r>
+        <w:rPr>
+          <w:rFonts w:ascii="Consolas" w:eastAsia="Times New Roman" w:hAnsi="Consolas" w:cs="Times New Roman"/>
+          <w:color w:val="BB9AF7"/>
+          <w:sz w:val="21"/>
+          <w:szCs w:val="21"/>
+        </w:rPr>
+        <w:t>:</w:t>
+      </w:r>
+      <w:r>
+        <w:rPr>
+          <w:rFonts w:ascii="Consolas" w:eastAsia="Times New Roman" w:hAnsi="Consolas" w:cs="Times New Roman"/>
+          <w:color w:val="C0CAF5"/>
+          <w:sz w:val="21"/>
+          <w:szCs w:val="21"/>
+        </w:rPr>
+        <w:t xml:space="preserve"> string;</w:t>
+      </w:r>
+    </w:p>
+    <w:p>
+      <w:pPr>
+        <w:shd w:val="clear" w:color="auto" w:fill="1A1B26"/>
+        <w:spacing w:after="0" w:line="285" w:lineRule="atLeast"/>
+        <w:ind w:firstLine="0"/>
+        <w:rPr>
+          <w:rFonts w:ascii="Consolas" w:eastAsia="Times New Roman" w:hAnsi="Consolas" w:cs="Times New Roman"/>
+          <w:color w:val="C0CAF5"/>
+          <w:sz w:val="21"/>
+          <w:szCs w:val="21"/>
+        </w:rPr>
+      </w:pPr>
+    </w:p>
+    <w:p>
+      <w:pPr>
+        <w:shd w:val="clear" w:color="auto" w:fill="1A1B26"/>
+        <w:spacing w:after="0" w:line="285" w:lineRule="atLeast"/>
+        <w:ind w:firstLine="0"/>
+        <w:rPr>
+          <w:rFonts w:ascii="Consolas" w:eastAsia="Times New Roman" w:hAnsi="Consolas" w:cs="Times New Roman"/>
+          <w:color w:val="C0CAF5"/>
+          <w:sz w:val="21"/>
+          <w:szCs w:val="21"/>
+        </w:rPr>
+      </w:pPr>
+      <w:r>
+        <w:rPr>
+          <w:rFonts w:ascii="Consolas" w:eastAsia="Times New Roman" w:hAnsi="Consolas" w:cs="Times New Roman"/>
+          <w:color w:val="C0CAF5"/>
+          <w:sz w:val="21"/>
+          <w:szCs w:val="21"/>
+        </w:rPr>
+        <w:t>    @</w:t>
+      </w:r>
+      <w:proofErr w:type="gramStart"/>
+      <w:r>
+        <w:rPr>
+          <w:rFonts w:ascii="Consolas" w:eastAsia="Times New Roman" w:hAnsi="Consolas" w:cs="Times New Roman"/>
+          <w:color w:val="7AA2F7"/>
+          <w:sz w:val="21"/>
+          <w:szCs w:val="21"/>
+        </w:rPr>
+        <w:t>Column</w:t>
+      </w:r>
+      <w:r>
+        <w:rPr>
+          <w:rFonts w:ascii="Consolas" w:eastAsia="Times New Roman" w:hAnsi="Consolas" w:cs="Times New Roman"/>
+          <w:color w:val="C0CAF5"/>
+          <w:sz w:val="21"/>
+          <w:szCs w:val="21"/>
+        </w:rPr>
+        <w:t>(</w:t>
+      </w:r>
+      <w:proofErr w:type="gramEnd"/>
+      <w:r>
+        <w:rPr>
+          <w:rFonts w:ascii="Consolas" w:eastAsia="Times New Roman" w:hAnsi="Consolas" w:cs="Times New Roman"/>
+          <w:color w:val="C0CAF5"/>
+          <w:sz w:val="21"/>
+          <w:szCs w:val="21"/>
+        </w:rPr>
+        <w:t xml:space="preserve">{unique: </w:t>
+      </w:r>
+      <w:r>
+        <w:rPr>
+          <w:rFonts w:ascii="Consolas" w:eastAsia="Times New Roman" w:hAnsi="Consolas" w:cs="Times New Roman"/>
+          <w:color w:val="FF9E64"/>
+          <w:sz w:val="21"/>
+          <w:szCs w:val="21"/>
+        </w:rPr>
+        <w:t>true</w:t>
+      </w:r>
+      <w:r>
+        <w:rPr>
+          <w:rFonts w:ascii="Consolas" w:eastAsia="Times New Roman" w:hAnsi="Consolas" w:cs="Times New Roman"/>
+          <w:color w:val="C0CAF5"/>
+          <w:sz w:val="21"/>
+          <w:szCs w:val="21"/>
+        </w:rPr>
+        <w:t>})</w:t>
+      </w:r>
+    </w:p>
+    <w:p>
+      <w:pPr>
+        <w:shd w:val="clear" w:color="auto" w:fill="1A1B26"/>
+        <w:spacing w:after="0" w:line="285" w:lineRule="atLeast"/>
+        <w:ind w:firstLine="0"/>
+        <w:rPr>
+          <w:rFonts w:ascii="Consolas" w:eastAsia="Times New Roman" w:hAnsi="Consolas" w:cs="Times New Roman"/>
+          <w:color w:val="C0CAF5"/>
+          <w:sz w:val="21"/>
+          <w:szCs w:val="21"/>
+        </w:rPr>
+      </w:pPr>
+      <w:r>
+        <w:rPr>
+          <w:rFonts w:ascii="Consolas" w:eastAsia="Times New Roman" w:hAnsi="Consolas" w:cs="Times New Roman"/>
+          <w:color w:val="C0CAF5"/>
+          <w:sz w:val="21"/>
+          <w:szCs w:val="21"/>
+        </w:rPr>
+        <w:t>    username</w:t>
+      </w:r>
+      <w:r>
+        <w:rPr>
+          <w:rFonts w:ascii="Consolas" w:eastAsia="Times New Roman" w:hAnsi="Consolas" w:cs="Times New Roman"/>
+          <w:color w:val="BB9AF7"/>
+          <w:sz w:val="21"/>
+          <w:szCs w:val="21"/>
+        </w:rPr>
+        <w:t>:</w:t>
+      </w:r>
+      <w:r>
+        <w:rPr>
+          <w:rFonts w:ascii="Consolas" w:eastAsia="Times New Roman" w:hAnsi="Consolas" w:cs="Times New Roman"/>
+          <w:color w:val="C0CAF5"/>
+          <w:sz w:val="21"/>
+          <w:szCs w:val="21"/>
+        </w:rPr>
+        <w:t xml:space="preserve"> string;</w:t>
+      </w:r>
+    </w:p>
+    <w:p>
+      <w:pPr>
+        <w:shd w:val="clear" w:color="auto" w:fill="1A1B26"/>
+        <w:spacing w:after="0" w:line="285" w:lineRule="atLeast"/>
+        <w:ind w:firstLine="0"/>
+        <w:rPr>
+          <w:rFonts w:ascii="Consolas" w:eastAsia="Times New Roman" w:hAnsi="Consolas" w:cs="Times New Roman"/>
+          <w:color w:val="C0CAF5"/>
+          <w:sz w:val="21"/>
+          <w:szCs w:val="21"/>
+        </w:rPr>
+      </w:pPr>
+    </w:p>
+    <w:p>
+      <w:pPr>
+        <w:shd w:val="clear" w:color="auto" w:fill="1A1B26"/>
+        <w:spacing w:after="0" w:line="285" w:lineRule="atLeast"/>
+        <w:ind w:firstLine="0"/>
+        <w:rPr>
+          <w:rFonts w:ascii="Consolas" w:eastAsia="Times New Roman" w:hAnsi="Consolas" w:cs="Times New Roman"/>
+          <w:color w:val="C0CAF5"/>
+          <w:sz w:val="21"/>
+          <w:szCs w:val="21"/>
+        </w:rPr>
+      </w:pPr>
+      <w:r>
+        <w:rPr>
+          <w:rFonts w:ascii="Consolas" w:eastAsia="Times New Roman" w:hAnsi="Consolas" w:cs="Times New Roman"/>
+          <w:color w:val="C0CAF5"/>
+          <w:sz w:val="21"/>
+          <w:szCs w:val="21"/>
+        </w:rPr>
+        <w:t>    @</w:t>
+      </w:r>
+      <w:proofErr w:type="gramStart"/>
+      <w:r>
+        <w:rPr>
+          <w:rFonts w:ascii="Consolas" w:eastAsia="Times New Roman" w:hAnsi="Consolas" w:cs="Times New Roman"/>
+          <w:color w:val="7AA2F7"/>
+          <w:sz w:val="21"/>
+          <w:szCs w:val="21"/>
+        </w:rPr>
+        <w:t>Column</w:t>
+      </w:r>
+      <w:r>
+        <w:rPr>
+          <w:rFonts w:ascii="Consolas" w:eastAsia="Times New Roman" w:hAnsi="Consolas" w:cs="Times New Roman"/>
+          <w:color w:val="C0CAF5"/>
+          <w:sz w:val="21"/>
+          <w:szCs w:val="21"/>
+        </w:rPr>
+        <w:t>(</w:t>
+      </w:r>
+      <w:proofErr w:type="gramEnd"/>
+      <w:r>
+        <w:rPr>
+          <w:rFonts w:ascii="Consolas" w:eastAsia="Times New Roman" w:hAnsi="Consolas" w:cs="Times New Roman"/>
+          <w:color w:val="C0CAF5"/>
+          <w:sz w:val="21"/>
+          <w:szCs w:val="21"/>
+        </w:rPr>
+        <w:t xml:space="preserve">{unique: </w:t>
+      </w:r>
+      <w:r>
+        <w:rPr>
+          <w:rFonts w:ascii="Consolas" w:eastAsia="Times New Roman" w:hAnsi="Consolas" w:cs="Times New Roman"/>
+          <w:color w:val="FF9E64"/>
+          <w:sz w:val="21"/>
+          <w:szCs w:val="21"/>
+        </w:rPr>
+        <w:t>true</w:t>
+      </w:r>
+      <w:r>
+        <w:rPr>
+          <w:rFonts w:ascii="Consolas" w:eastAsia="Times New Roman" w:hAnsi="Consolas" w:cs="Times New Roman"/>
+          <w:color w:val="C0CAF5"/>
+          <w:sz w:val="21"/>
+          <w:szCs w:val="21"/>
+        </w:rPr>
+        <w:t>})</w:t>
+      </w:r>
+    </w:p>
+    <w:p>
+      <w:pPr>
+        <w:shd w:val="clear" w:color="auto" w:fill="1A1B26"/>
+        <w:spacing w:after="0" w:line="285" w:lineRule="atLeast"/>
+        <w:ind w:firstLine="0"/>
+        <w:rPr>
+          <w:rFonts w:ascii="Consolas" w:eastAsia="Times New Roman" w:hAnsi="Consolas" w:cs="Times New Roman"/>
+          <w:color w:val="C0CAF5"/>
+          <w:sz w:val="21"/>
+          <w:szCs w:val="21"/>
+        </w:rPr>
+      </w:pPr>
+      <w:r>
+        <w:rPr>
+          <w:rFonts w:ascii="Consolas" w:eastAsia="Times New Roman" w:hAnsi="Consolas" w:cs="Times New Roman"/>
+          <w:color w:val="C0CAF5"/>
+          <w:sz w:val="21"/>
+          <w:szCs w:val="21"/>
+        </w:rPr>
+        <w:t>    email</w:t>
+      </w:r>
+      <w:r>
+        <w:rPr>
+          <w:rFonts w:ascii="Consolas" w:eastAsia="Times New Roman" w:hAnsi="Consolas" w:cs="Times New Roman"/>
+          <w:color w:val="BB9AF7"/>
+          <w:sz w:val="21"/>
+          <w:szCs w:val="21"/>
+        </w:rPr>
+        <w:t>:</w:t>
+      </w:r>
+      <w:r>
+        <w:rPr>
+          <w:rFonts w:ascii="Consolas" w:eastAsia="Times New Roman" w:hAnsi="Consolas" w:cs="Times New Roman"/>
+          <w:color w:val="C0CAF5"/>
+          <w:sz w:val="21"/>
+          <w:szCs w:val="21"/>
+        </w:rPr>
+        <w:t xml:space="preserve"> string;</w:t>
+      </w:r>
+    </w:p>
+    <w:p>
+      <w:pPr>
+        <w:shd w:val="clear" w:color="auto" w:fill="1A1B26"/>
+        <w:spacing w:after="0" w:line="285" w:lineRule="atLeast"/>
+        <w:ind w:firstLine="0"/>
+        <w:rPr>
+          <w:rFonts w:ascii="Consolas" w:eastAsia="Times New Roman" w:hAnsi="Consolas" w:cs="Times New Roman"/>
+          <w:color w:val="C0CAF5"/>
+          <w:sz w:val="21"/>
+          <w:szCs w:val="21"/>
+        </w:rPr>
+      </w:pPr>
+      <w:r>
+        <w:rPr>
+          <w:rFonts w:ascii="Consolas" w:eastAsia="Times New Roman" w:hAnsi="Consolas" w:cs="Times New Roman"/>
+          <w:color w:val="C0CAF5"/>
+          <w:sz w:val="21"/>
+          <w:szCs w:val="21"/>
+        </w:rPr>
+        <w:t>    @</w:t>
+      </w:r>
+      <w:proofErr w:type="gramStart"/>
+      <w:r>
+        <w:rPr>
+          <w:rFonts w:ascii="Consolas" w:eastAsia="Times New Roman" w:hAnsi="Consolas" w:cs="Times New Roman"/>
+          <w:color w:val="7AA2F7"/>
+          <w:sz w:val="21"/>
+          <w:szCs w:val="21"/>
+        </w:rPr>
+        <w:t>Column</w:t>
+      </w:r>
+      <w:r>
+        <w:rPr>
+          <w:rFonts w:ascii="Consolas" w:eastAsia="Times New Roman" w:hAnsi="Consolas" w:cs="Times New Roman"/>
+          <w:color w:val="C0CAF5"/>
+          <w:sz w:val="21"/>
+          <w:szCs w:val="21"/>
+        </w:rPr>
+        <w:t>(</w:t>
+      </w:r>
+      <w:proofErr w:type="gramEnd"/>
+      <w:r>
+        <w:rPr>
+          <w:rFonts w:ascii="Consolas" w:eastAsia="Times New Roman" w:hAnsi="Consolas" w:cs="Times New Roman"/>
+          <w:color w:val="C0CAF5"/>
+          <w:sz w:val="21"/>
+          <w:szCs w:val="21"/>
+        </w:rPr>
+        <w:t>)</w:t>
+      </w:r>
+    </w:p>
+    <w:p>
+      <w:pPr>
+        <w:shd w:val="clear" w:color="auto" w:fill="1A1B26"/>
+        <w:spacing w:after="0" w:line="285" w:lineRule="atLeast"/>
+        <w:ind w:firstLine="0"/>
+        <w:rPr>
+          <w:rFonts w:ascii="Consolas" w:eastAsia="Times New Roman" w:hAnsi="Consolas" w:cs="Times New Roman"/>
+          <w:color w:val="C0CAF5"/>
+          <w:sz w:val="21"/>
+          <w:szCs w:val="21"/>
+        </w:rPr>
+      </w:pPr>
+      <w:r>
+        <w:rPr>
+          <w:rFonts w:ascii="Consolas" w:eastAsia="Times New Roman" w:hAnsi="Consolas" w:cs="Times New Roman"/>
+          <w:color w:val="C0CAF5"/>
+          <w:sz w:val="21"/>
+          <w:szCs w:val="21"/>
+        </w:rPr>
+        <w:t>    password</w:t>
+      </w:r>
+      <w:r>
+        <w:rPr>
+          <w:rFonts w:ascii="Consolas" w:eastAsia="Times New Roman" w:hAnsi="Consolas" w:cs="Times New Roman"/>
+          <w:color w:val="BB9AF7"/>
+          <w:sz w:val="21"/>
+          <w:szCs w:val="21"/>
+        </w:rPr>
+        <w:t>:</w:t>
+      </w:r>
+      <w:r>
+        <w:rPr>
+          <w:rFonts w:ascii="Consolas" w:eastAsia="Times New Roman" w:hAnsi="Consolas" w:cs="Times New Roman"/>
+          <w:color w:val="C0CAF5"/>
+          <w:sz w:val="21"/>
+          <w:szCs w:val="21"/>
+        </w:rPr>
+        <w:t xml:space="preserve"> string</w:t>
+      </w:r>
+    </w:p>
+    <w:p>
+      <w:pPr>
+        <w:shd w:val="clear" w:color="auto" w:fill="1A1B26"/>
+        <w:spacing w:after="0" w:line="285" w:lineRule="atLeast"/>
+        <w:ind w:firstLine="0"/>
+        <w:rPr>
+          <w:rFonts w:ascii="Consolas" w:eastAsia="Times New Roman" w:hAnsi="Consolas" w:cs="Times New Roman"/>
+          <w:color w:val="C0CAF5"/>
+          <w:sz w:val="21"/>
+          <w:szCs w:val="21"/>
+        </w:rPr>
+      </w:pPr>
+      <w:r>
+        <w:rPr>
+          <w:rFonts w:ascii="Consolas" w:eastAsia="Times New Roman" w:hAnsi="Consolas" w:cs="Times New Roman"/>
+          <w:color w:val="C0CAF5"/>
+          <w:sz w:val="21"/>
+          <w:szCs w:val="21"/>
+        </w:rPr>
+        <w:t>}</w:t>
+      </w:r>
+    </w:p>
+    <w:p>
+      <w:pPr>
+        <w:shd w:val="clear" w:color="auto" w:fill="1A1B26"/>
+        <w:spacing w:after="0" w:line="285" w:lineRule="atLeast"/>
+        <w:ind w:firstLine="0"/>
+        <w:rPr>
+          <w:rFonts w:ascii="Consolas" w:eastAsia="Times New Roman" w:hAnsi="Consolas" w:cs="Times New Roman"/>
+          <w:color w:val="C0CAF5"/>
+          <w:sz w:val="21"/>
+          <w:szCs w:val="21"/>
+        </w:rPr>
+      </w:pPr>
+    </w:p>
+    <w:p>
+      <w:pPr>
+        <w:rPr>
+          <w:rFonts w:ascii="Consolas" w:hAnsi="Consolas"/>
+        </w:rPr>
+      </w:pPr>
+    </w:p>
+    <w:p>
+      <w:pPr>
+        <w:rPr>
+          <w:rFonts w:ascii="Consolas" w:hAnsi="Consolas"/>
+          <w:lang w:val="es-ES"/>
+        </w:rPr>
+      </w:pPr>
+      <w:r>
+        <w:rPr>
+          <w:rFonts w:ascii="Consolas" w:hAnsi="Consolas"/>
+          <w:lang w:val="es-ES"/>
+        </w:rPr>
+        <w:t xml:space="preserve">Luego hacemos </w:t>
+      </w:r>
+      <w:r>
+        <w:rPr>
+          <w:rFonts w:ascii="Consolas" w:hAnsi="Consolas"/>
+          <w:lang w:val="es-ES"/>
+        </w:rPr>
+        <w:t xml:space="preserve">la conexión en el </w:t>
+      </w:r>
+      <w:proofErr w:type="spellStart"/>
+      <w:proofErr w:type="gramStart"/>
+      <w:r>
+        <w:rPr>
+          <w:rFonts w:ascii="Consolas" w:hAnsi="Consolas"/>
+          <w:lang w:val="es-ES"/>
+        </w:rPr>
+        <w:t>app.modules</w:t>
+      </w:r>
+      <w:proofErr w:type="gramEnd"/>
+      <w:r>
+        <w:rPr>
+          <w:rFonts w:ascii="Consolas" w:hAnsi="Consolas"/>
+          <w:lang w:val="es-ES"/>
+        </w:rPr>
+        <w:t>.ts</w:t>
+      </w:r>
+      <w:proofErr w:type="spellEnd"/>
+    </w:p>
+    <w:p>
+      <w:pPr>
+        <w:shd w:val="clear" w:color="auto" w:fill="1A1B26"/>
+        <w:spacing w:after="0" w:line="285" w:lineRule="atLeast"/>
+        <w:ind w:firstLine="0"/>
+        <w:rPr>
+          <w:rFonts w:ascii="Consolas" w:eastAsia="Times New Roman" w:hAnsi="Consolas" w:cs="Times New Roman"/>
+          <w:color w:val="C0CAF5"/>
+          <w:sz w:val="21"/>
+          <w:szCs w:val="21"/>
+        </w:rPr>
+      </w:pPr>
+      <w:r>
+        <w:rPr>
+          <w:rFonts w:ascii="Consolas" w:eastAsia="Times New Roman" w:hAnsi="Consolas" w:cs="Times New Roman"/>
+          <w:color w:val="BB9AF7"/>
+          <w:sz w:val="21"/>
+          <w:szCs w:val="21"/>
+        </w:rPr>
+        <w:lastRenderedPageBreak/>
+        <w:t>import</w:t>
+      </w:r>
+      <w:r>
+        <w:rPr>
+          <w:rFonts w:ascii="Consolas" w:eastAsia="Times New Roman" w:hAnsi="Consolas" w:cs="Times New Roman"/>
+          <w:color w:val="C0CAF5"/>
+          <w:sz w:val="21"/>
+          <w:szCs w:val="21"/>
+        </w:rPr>
+        <w:t xml:space="preserve"> </w:t>
+      </w:r>
+      <w:proofErr w:type="gramStart"/>
+      <w:r>
+        <w:rPr>
+          <w:rFonts w:ascii="Consolas" w:eastAsia="Times New Roman" w:hAnsi="Consolas" w:cs="Times New Roman"/>
+          <w:color w:val="C0CAF5"/>
+          <w:sz w:val="21"/>
+          <w:szCs w:val="21"/>
+        </w:rPr>
+        <w:t>{ Module</w:t>
+      </w:r>
+      <w:proofErr w:type="gramEnd"/>
+      <w:r>
+        <w:rPr>
+          <w:rFonts w:ascii="Consolas" w:eastAsia="Times New Roman" w:hAnsi="Consolas" w:cs="Times New Roman"/>
+          <w:color w:val="C0CAF5"/>
+          <w:sz w:val="21"/>
+          <w:szCs w:val="21"/>
+        </w:rPr>
+        <w:t xml:space="preserve"> } </w:t>
+      </w:r>
+      <w:r>
+        <w:rPr>
+          <w:rFonts w:ascii="Consolas" w:eastAsia="Times New Roman" w:hAnsi="Consolas" w:cs="Times New Roman"/>
+          <w:color w:val="BB9AF7"/>
+          <w:sz w:val="21"/>
+          <w:szCs w:val="21"/>
+        </w:rPr>
+        <w:t>from</w:t>
+      </w:r>
+      <w:r>
+        <w:rPr>
+          <w:rFonts w:ascii="Consolas" w:eastAsia="Times New Roman" w:hAnsi="Consolas" w:cs="Times New Roman"/>
+          <w:color w:val="C0CAF5"/>
+          <w:sz w:val="21"/>
+          <w:szCs w:val="21"/>
+        </w:rPr>
+        <w:t xml:space="preserve"> '</w:t>
+      </w:r>
+      <w:r>
+        <w:rPr>
+          <w:rFonts w:ascii="Consolas" w:eastAsia="Times New Roman" w:hAnsi="Consolas" w:cs="Times New Roman"/>
+          <w:color w:val="9ECE6A"/>
+          <w:sz w:val="21"/>
+          <w:szCs w:val="21"/>
+        </w:rPr>
+        <w:t>@</w:t>
+      </w:r>
+      <w:proofErr w:type="spellStart"/>
+      <w:r>
+        <w:rPr>
+          <w:rFonts w:ascii="Consolas" w:eastAsia="Times New Roman" w:hAnsi="Consolas" w:cs="Times New Roman"/>
+          <w:color w:val="9ECE6A"/>
+          <w:sz w:val="21"/>
+          <w:szCs w:val="21"/>
+        </w:rPr>
+        <w:t>nestjs</w:t>
+      </w:r>
+      <w:proofErr w:type="spellEnd"/>
+      <w:r>
+        <w:rPr>
+          <w:rFonts w:ascii="Consolas" w:eastAsia="Times New Roman" w:hAnsi="Consolas" w:cs="Times New Roman"/>
+          <w:color w:val="9ECE6A"/>
+          <w:sz w:val="21"/>
+          <w:szCs w:val="21"/>
+        </w:rPr>
+        <w:t>/common</w:t>
+      </w:r>
+      <w:r>
+        <w:rPr>
+          <w:rFonts w:ascii="Consolas" w:eastAsia="Times New Roman" w:hAnsi="Consolas" w:cs="Times New Roman"/>
+          <w:color w:val="C0CAF5"/>
+          <w:sz w:val="21"/>
+          <w:szCs w:val="21"/>
+        </w:rPr>
+        <w:t>';</w:t>
+      </w:r>
+    </w:p>
+    <w:p>
+      <w:pPr>
+        <w:shd w:val="clear" w:color="auto" w:fill="1A1B26"/>
+        <w:spacing w:after="0" w:line="285" w:lineRule="atLeast"/>
+        <w:ind w:firstLine="0"/>
+        <w:rPr>
+          <w:rFonts w:ascii="Consolas" w:eastAsia="Times New Roman" w:hAnsi="Consolas" w:cs="Times New Roman"/>
+          <w:color w:val="C0CAF5"/>
+          <w:sz w:val="21"/>
+          <w:szCs w:val="21"/>
+        </w:rPr>
+      </w:pPr>
+      <w:r>
+        <w:rPr>
+          <w:rFonts w:ascii="Consolas" w:eastAsia="Times New Roman" w:hAnsi="Consolas" w:cs="Times New Roman"/>
+          <w:color w:val="BB9AF7"/>
+          <w:sz w:val="21"/>
+          <w:szCs w:val="21"/>
+        </w:rPr>
+        <w:t>import</w:t>
+      </w:r>
+      <w:r>
+        <w:rPr>
+          <w:rFonts w:ascii="Consolas" w:eastAsia="Times New Roman" w:hAnsi="Consolas" w:cs="Times New Roman"/>
+          <w:color w:val="C0CAF5"/>
+          <w:sz w:val="21"/>
+          <w:szCs w:val="21"/>
+        </w:rPr>
+        <w:t xml:space="preserve"> </w:t>
+      </w:r>
+      <w:proofErr w:type="gramStart"/>
+      <w:r>
+        <w:rPr>
+          <w:rFonts w:ascii="Consolas" w:eastAsia="Times New Roman" w:hAnsi="Consolas" w:cs="Times New Roman"/>
+          <w:color w:val="C0CAF5"/>
+          <w:sz w:val="21"/>
+          <w:szCs w:val="21"/>
+        </w:rPr>
+        <w:t xml:space="preserve">{ </w:t>
+      </w:r>
+      <w:proofErr w:type="spellStart"/>
+      <w:r>
+        <w:rPr>
+          <w:rFonts w:ascii="Consolas" w:eastAsia="Times New Roman" w:hAnsi="Consolas" w:cs="Times New Roman"/>
+          <w:color w:val="C0CAF5"/>
+          <w:sz w:val="21"/>
+          <w:szCs w:val="21"/>
+        </w:rPr>
+        <w:t>AppController</w:t>
+      </w:r>
+      <w:proofErr w:type="spellEnd"/>
+      <w:proofErr w:type="gramEnd"/>
+      <w:r>
+        <w:rPr>
+          <w:rFonts w:ascii="Consolas" w:eastAsia="Times New Roman" w:hAnsi="Consolas" w:cs="Times New Roman"/>
+          <w:color w:val="C0CAF5"/>
+          <w:sz w:val="21"/>
+          <w:szCs w:val="21"/>
+        </w:rPr>
+        <w:t xml:space="preserve"> } </w:t>
+      </w:r>
+      <w:r>
+        <w:rPr>
+          <w:rFonts w:ascii="Consolas" w:eastAsia="Times New Roman" w:hAnsi="Consolas" w:cs="Times New Roman"/>
+          <w:color w:val="BB9AF7"/>
+          <w:sz w:val="21"/>
+          <w:szCs w:val="21"/>
+        </w:rPr>
+        <w:t>from</w:t>
+      </w:r>
+      <w:r>
+        <w:rPr>
+          <w:rFonts w:ascii="Consolas" w:eastAsia="Times New Roman" w:hAnsi="Consolas" w:cs="Times New Roman"/>
+          <w:color w:val="C0CAF5"/>
+          <w:sz w:val="21"/>
+          <w:szCs w:val="21"/>
+        </w:rPr>
+        <w:t xml:space="preserve"> '</w:t>
+      </w:r>
+      <w:r>
+        <w:rPr>
+          <w:rFonts w:ascii="Consolas" w:eastAsia="Times New Roman" w:hAnsi="Consolas" w:cs="Times New Roman"/>
+          <w:color w:val="9ECE6A"/>
+          <w:sz w:val="21"/>
+          <w:szCs w:val="21"/>
+        </w:rPr>
+        <w:t>./</w:t>
+      </w:r>
+      <w:proofErr w:type="spellStart"/>
+      <w:r>
+        <w:rPr>
+          <w:rFonts w:ascii="Consolas" w:eastAsia="Times New Roman" w:hAnsi="Consolas" w:cs="Times New Roman"/>
+          <w:color w:val="9ECE6A"/>
+          <w:sz w:val="21"/>
+          <w:szCs w:val="21"/>
+        </w:rPr>
+        <w:t>app.controller</w:t>
+      </w:r>
+      <w:proofErr w:type="spellEnd"/>
+      <w:r>
+        <w:rPr>
+          <w:rFonts w:ascii="Consolas" w:eastAsia="Times New Roman" w:hAnsi="Consolas" w:cs="Times New Roman"/>
+          <w:color w:val="C0CAF5"/>
+          <w:sz w:val="21"/>
+          <w:szCs w:val="21"/>
+        </w:rPr>
+        <w:t>';</w:t>
+      </w:r>
+    </w:p>
+    <w:p>
+      <w:pPr>
+        <w:shd w:val="clear" w:color="auto" w:fill="1A1B26"/>
+        <w:spacing w:after="0" w:line="285" w:lineRule="atLeast"/>
+        <w:ind w:firstLine="0"/>
+        <w:rPr>
+          <w:rFonts w:ascii="Consolas" w:eastAsia="Times New Roman" w:hAnsi="Consolas" w:cs="Times New Roman"/>
+          <w:color w:val="C0CAF5"/>
+          <w:sz w:val="21"/>
+          <w:szCs w:val="21"/>
+        </w:rPr>
+      </w:pPr>
+      <w:r>
+        <w:rPr>
+          <w:rFonts w:ascii="Consolas" w:eastAsia="Times New Roman" w:hAnsi="Consolas" w:cs="Times New Roman"/>
+          <w:color w:val="BB9AF7"/>
+          <w:sz w:val="21"/>
+          <w:szCs w:val="21"/>
+        </w:rPr>
+        <w:t>import</w:t>
+      </w:r>
+      <w:r>
+        <w:rPr>
+          <w:rFonts w:ascii="Consolas" w:eastAsia="Times New Roman" w:hAnsi="Consolas" w:cs="Times New Roman"/>
+          <w:color w:val="C0CAF5"/>
+          <w:sz w:val="21"/>
+          <w:szCs w:val="21"/>
+        </w:rPr>
+        <w:t xml:space="preserve"> </w:t>
+      </w:r>
+      <w:proofErr w:type="gramStart"/>
+      <w:r>
+        <w:rPr>
+          <w:rFonts w:ascii="Consolas" w:eastAsia="Times New Roman" w:hAnsi="Consolas" w:cs="Times New Roman"/>
+          <w:color w:val="C0CAF5"/>
+          <w:sz w:val="21"/>
+          <w:szCs w:val="21"/>
+        </w:rPr>
+        <w:t>{ AppService</w:t>
+      </w:r>
+      <w:proofErr w:type="gramEnd"/>
+      <w:r>
+        <w:rPr>
+          <w:rFonts w:ascii="Consolas" w:eastAsia="Times New Roman" w:hAnsi="Consolas" w:cs="Times New Roman"/>
+          <w:color w:val="C0CAF5"/>
+          <w:sz w:val="21"/>
+          <w:szCs w:val="21"/>
+        </w:rPr>
+        <w:t xml:space="preserve"> } </w:t>
+      </w:r>
+      <w:r>
+        <w:rPr>
+          <w:rFonts w:ascii="Consolas" w:eastAsia="Times New Roman" w:hAnsi="Consolas" w:cs="Times New Roman"/>
+          <w:color w:val="BB9AF7"/>
+          <w:sz w:val="21"/>
+          <w:szCs w:val="21"/>
+        </w:rPr>
+        <w:t>from</w:t>
+      </w:r>
+      <w:r>
+        <w:rPr>
+          <w:rFonts w:ascii="Consolas" w:eastAsia="Times New Roman" w:hAnsi="Consolas" w:cs="Times New Roman"/>
+          <w:color w:val="C0CAF5"/>
+          <w:sz w:val="21"/>
+          <w:szCs w:val="21"/>
+        </w:rPr>
+        <w:t xml:space="preserve"> '</w:t>
+      </w:r>
+      <w:r>
+        <w:rPr>
+          <w:rFonts w:ascii="Consolas" w:eastAsia="Times New Roman" w:hAnsi="Consolas" w:cs="Times New Roman"/>
+          <w:color w:val="9ECE6A"/>
+          <w:sz w:val="21"/>
+          <w:szCs w:val="21"/>
+        </w:rPr>
+        <w:t>./</w:t>
+      </w:r>
+      <w:proofErr w:type="spellStart"/>
+      <w:r>
+        <w:rPr>
+          <w:rFonts w:ascii="Consolas" w:eastAsia="Times New Roman" w:hAnsi="Consolas" w:cs="Times New Roman"/>
+          <w:color w:val="9ECE6A"/>
+          <w:sz w:val="21"/>
+          <w:szCs w:val="21"/>
+        </w:rPr>
+        <w:t>app.service</w:t>
+      </w:r>
+      <w:proofErr w:type="spellEnd"/>
+      <w:r>
+        <w:rPr>
+          <w:rFonts w:ascii="Consolas" w:eastAsia="Times New Roman" w:hAnsi="Consolas" w:cs="Times New Roman"/>
+          <w:color w:val="C0CAF5"/>
+          <w:sz w:val="21"/>
+          <w:szCs w:val="21"/>
+        </w:rPr>
+        <w:t>';</w:t>
+      </w:r>
+    </w:p>
+    <w:p>
+      <w:pPr>
+        <w:shd w:val="clear" w:color="auto" w:fill="1A1B26"/>
+        <w:spacing w:after="0" w:line="285" w:lineRule="atLeast"/>
+        <w:ind w:firstLine="0"/>
+        <w:rPr>
+          <w:rFonts w:ascii="Consolas" w:eastAsia="Times New Roman" w:hAnsi="Consolas" w:cs="Times New Roman"/>
+          <w:color w:val="C0CAF5"/>
+          <w:sz w:val="21"/>
+          <w:szCs w:val="21"/>
+        </w:rPr>
+      </w:pPr>
+      <w:r>
+        <w:rPr>
+          <w:rFonts w:ascii="Consolas" w:eastAsia="Times New Roman" w:hAnsi="Consolas" w:cs="Times New Roman"/>
+          <w:color w:val="BB9AF7"/>
+          <w:sz w:val="21"/>
+          <w:szCs w:val="21"/>
+        </w:rPr>
+        <w:t>import</w:t>
+      </w:r>
+      <w:r>
+        <w:rPr>
+          <w:rFonts w:ascii="Consolas" w:eastAsia="Times New Roman" w:hAnsi="Consolas" w:cs="Times New Roman"/>
+          <w:color w:val="C0CAF5"/>
+          <w:sz w:val="21"/>
+          <w:szCs w:val="21"/>
+        </w:rPr>
+        <w:t xml:space="preserve"> </w:t>
+      </w:r>
+      <w:proofErr w:type="gramStart"/>
+      <w:r>
+        <w:rPr>
+          <w:rFonts w:ascii="Consolas" w:eastAsia="Times New Roman" w:hAnsi="Consolas" w:cs="Times New Roman"/>
+          <w:color w:val="C0CAF5"/>
+          <w:sz w:val="21"/>
+          <w:szCs w:val="21"/>
+        </w:rPr>
+        <w:t xml:space="preserve">{ </w:t>
+      </w:r>
+      <w:proofErr w:type="spellStart"/>
+      <w:r>
+        <w:rPr>
+          <w:rFonts w:ascii="Consolas" w:eastAsia="Times New Roman" w:hAnsi="Consolas" w:cs="Times New Roman"/>
+          <w:color w:val="C0CAF5"/>
+          <w:sz w:val="21"/>
+          <w:szCs w:val="21"/>
+        </w:rPr>
+        <w:t>ConfigModule</w:t>
+      </w:r>
+      <w:proofErr w:type="spellEnd"/>
+      <w:proofErr w:type="gramEnd"/>
+      <w:r>
+        <w:rPr>
+          <w:rFonts w:ascii="Consolas" w:eastAsia="Times New Roman" w:hAnsi="Consolas" w:cs="Times New Roman"/>
+          <w:color w:val="C0CAF5"/>
+          <w:sz w:val="21"/>
+          <w:szCs w:val="21"/>
+        </w:rPr>
+        <w:t xml:space="preserve"> } </w:t>
+      </w:r>
+      <w:r>
+        <w:rPr>
+          <w:rFonts w:ascii="Consolas" w:eastAsia="Times New Roman" w:hAnsi="Consolas" w:cs="Times New Roman"/>
+          <w:color w:val="BB9AF7"/>
+          <w:sz w:val="21"/>
+          <w:szCs w:val="21"/>
+        </w:rPr>
+        <w:t>from</w:t>
+      </w:r>
+      <w:r>
+        <w:rPr>
+          <w:rFonts w:ascii="Consolas" w:eastAsia="Times New Roman" w:hAnsi="Consolas" w:cs="Times New Roman"/>
+          <w:color w:val="C0CAF5"/>
+          <w:sz w:val="21"/>
+          <w:szCs w:val="21"/>
+        </w:rPr>
+        <w:t xml:space="preserve"> '</w:t>
+      </w:r>
+      <w:r>
+        <w:rPr>
+          <w:rFonts w:ascii="Consolas" w:eastAsia="Times New Roman" w:hAnsi="Consolas" w:cs="Times New Roman"/>
+          <w:color w:val="9ECE6A"/>
+          <w:sz w:val="21"/>
+          <w:szCs w:val="21"/>
+        </w:rPr>
+        <w:t>@</w:t>
+      </w:r>
+      <w:proofErr w:type="spellStart"/>
+      <w:r>
+        <w:rPr>
+          <w:rFonts w:ascii="Consolas" w:eastAsia="Times New Roman" w:hAnsi="Consolas" w:cs="Times New Roman"/>
+          <w:color w:val="9ECE6A"/>
+          <w:sz w:val="21"/>
+          <w:szCs w:val="21"/>
+        </w:rPr>
+        <w:t>nestjs</w:t>
+      </w:r>
+      <w:proofErr w:type="spellEnd"/>
+      <w:r>
+        <w:rPr>
+          <w:rFonts w:ascii="Consolas" w:eastAsia="Times New Roman" w:hAnsi="Consolas" w:cs="Times New Roman"/>
+          <w:color w:val="9ECE6A"/>
+          <w:sz w:val="21"/>
+          <w:szCs w:val="21"/>
+        </w:rPr>
+        <w:t>/config</w:t>
+      </w:r>
+      <w:r>
+        <w:rPr>
+          <w:rFonts w:ascii="Consolas" w:eastAsia="Times New Roman" w:hAnsi="Consolas" w:cs="Times New Roman"/>
+          <w:color w:val="C0CAF5"/>
+          <w:sz w:val="21"/>
+          <w:szCs w:val="21"/>
+        </w:rPr>
+        <w:t>';</w:t>
+      </w:r>
+    </w:p>
+    <w:p>
+      <w:pPr>
+        <w:shd w:val="clear" w:color="auto" w:fill="1A1B26"/>
+        <w:spacing w:after="0" w:line="285" w:lineRule="atLeast"/>
+        <w:ind w:firstLine="0"/>
+        <w:rPr>
+          <w:rFonts w:ascii="Consolas" w:eastAsia="Times New Roman" w:hAnsi="Consolas" w:cs="Times New Roman"/>
+          <w:color w:val="C0CAF5"/>
+          <w:sz w:val="21"/>
+          <w:szCs w:val="21"/>
+        </w:rPr>
+      </w:pPr>
+      <w:r>
+        <w:rPr>
+          <w:rFonts w:ascii="Consolas" w:eastAsia="Times New Roman" w:hAnsi="Consolas" w:cs="Times New Roman"/>
+          <w:color w:val="BB9AF7"/>
+          <w:sz w:val="21"/>
+          <w:szCs w:val="21"/>
+        </w:rPr>
+        <w:t>import</w:t>
+      </w:r>
+      <w:r>
+        <w:rPr>
+          <w:rFonts w:ascii="Consolas" w:eastAsia="Times New Roman" w:hAnsi="Consolas" w:cs="Times New Roman"/>
+          <w:color w:val="C0CAF5"/>
+          <w:sz w:val="21"/>
+          <w:szCs w:val="21"/>
+        </w:rPr>
+        <w:t xml:space="preserve"> </w:t>
+      </w:r>
+      <w:proofErr w:type="gramStart"/>
+      <w:r>
+        <w:rPr>
+          <w:rFonts w:ascii="Consolas" w:eastAsia="Times New Roman" w:hAnsi="Consolas" w:cs="Times New Roman"/>
+          <w:color w:val="C0CAF5"/>
+          <w:sz w:val="21"/>
+          <w:szCs w:val="21"/>
+        </w:rPr>
+        <w:t xml:space="preserve">{ </w:t>
+      </w:r>
+      <w:proofErr w:type="spellStart"/>
+      <w:r>
+        <w:rPr>
+          <w:rFonts w:ascii="Consolas" w:eastAsia="Times New Roman" w:hAnsi="Consolas" w:cs="Times New Roman"/>
+          <w:color w:val="C0CAF5"/>
+          <w:sz w:val="21"/>
+          <w:szCs w:val="21"/>
+        </w:rPr>
+        <w:t>UsersModule</w:t>
+      </w:r>
+      <w:proofErr w:type="spellEnd"/>
+      <w:proofErr w:type="gramEnd"/>
+      <w:r>
+        <w:rPr>
+          <w:rFonts w:ascii="Consolas" w:eastAsia="Times New Roman" w:hAnsi="Consolas" w:cs="Times New Roman"/>
+          <w:color w:val="C0CAF5"/>
+          <w:sz w:val="21"/>
+          <w:szCs w:val="21"/>
+        </w:rPr>
+        <w:t xml:space="preserve"> } </w:t>
+      </w:r>
+      <w:r>
+        <w:rPr>
+          <w:rFonts w:ascii="Consolas" w:eastAsia="Times New Roman" w:hAnsi="Consolas" w:cs="Times New Roman"/>
+          <w:color w:val="BB9AF7"/>
+          <w:sz w:val="21"/>
+          <w:szCs w:val="21"/>
+        </w:rPr>
+        <w:t>from</w:t>
+      </w:r>
+      <w:r>
+        <w:rPr>
+          <w:rFonts w:ascii="Consolas" w:eastAsia="Times New Roman" w:hAnsi="Consolas" w:cs="Times New Roman"/>
+          <w:color w:val="C0CAF5"/>
+          <w:sz w:val="21"/>
+          <w:szCs w:val="21"/>
+        </w:rPr>
+        <w:t xml:space="preserve"> '</w:t>
+      </w:r>
+      <w:r>
+        <w:rPr>
+          <w:rFonts w:ascii="Consolas" w:eastAsia="Times New Roman" w:hAnsi="Consolas" w:cs="Times New Roman"/>
+          <w:color w:val="9ECE6A"/>
+          <w:sz w:val="21"/>
+          <w:szCs w:val="21"/>
+        </w:rPr>
+        <w:t>./modules/users/</w:t>
+      </w:r>
+      <w:proofErr w:type="spellStart"/>
+      <w:r>
+        <w:rPr>
+          <w:rFonts w:ascii="Consolas" w:eastAsia="Times New Roman" w:hAnsi="Consolas" w:cs="Times New Roman"/>
+          <w:color w:val="9ECE6A"/>
+          <w:sz w:val="21"/>
+          <w:szCs w:val="21"/>
+        </w:rPr>
+        <w:t>users.module</w:t>
+      </w:r>
+      <w:proofErr w:type="spellEnd"/>
+      <w:r>
+        <w:rPr>
+          <w:rFonts w:ascii="Consolas" w:eastAsia="Times New Roman" w:hAnsi="Consolas" w:cs="Times New Roman"/>
+          <w:color w:val="C0CAF5"/>
+          <w:sz w:val="21"/>
+          <w:szCs w:val="21"/>
+        </w:rPr>
+        <w:t>';</w:t>
+      </w:r>
+    </w:p>
+    <w:p>
+      <w:pPr>
+        <w:shd w:val="clear" w:color="auto" w:fill="1A1B26"/>
+        <w:spacing w:after="0" w:line="285" w:lineRule="atLeast"/>
+        <w:ind w:firstLine="0"/>
+        <w:rPr>
+          <w:rFonts w:ascii="Consolas" w:eastAsia="Times New Roman" w:hAnsi="Consolas" w:cs="Times New Roman"/>
+          <w:color w:val="C0CAF5"/>
+          <w:sz w:val="21"/>
+          <w:szCs w:val="21"/>
+        </w:rPr>
+      </w:pPr>
+      <w:r>
+        <w:rPr>
+          <w:rFonts w:ascii="Consolas" w:eastAsia="Times New Roman" w:hAnsi="Consolas" w:cs="Times New Roman"/>
+          <w:color w:val="BB9AF7"/>
+          <w:sz w:val="21"/>
+          <w:szCs w:val="21"/>
+        </w:rPr>
+        <w:t>import</w:t>
+      </w:r>
+      <w:r>
+        <w:rPr>
+          <w:rFonts w:ascii="Consolas" w:eastAsia="Times New Roman" w:hAnsi="Consolas" w:cs="Times New Roman"/>
+          <w:color w:val="C0CAF5"/>
+          <w:sz w:val="21"/>
+          <w:szCs w:val="21"/>
+        </w:rPr>
+        <w:t xml:space="preserve"> </w:t>
+      </w:r>
+      <w:proofErr w:type="gramStart"/>
+      <w:r>
+        <w:rPr>
+          <w:rFonts w:ascii="Consolas" w:eastAsia="Times New Roman" w:hAnsi="Consolas" w:cs="Times New Roman"/>
+          <w:color w:val="C0CAF5"/>
+          <w:sz w:val="21"/>
+          <w:szCs w:val="21"/>
+        </w:rPr>
+        <w:t xml:space="preserve">{ </w:t>
+      </w:r>
+      <w:proofErr w:type="spellStart"/>
+      <w:r>
+        <w:rPr>
+          <w:rFonts w:ascii="Consolas" w:eastAsia="Times New Roman" w:hAnsi="Consolas" w:cs="Times New Roman"/>
+          <w:color w:val="C0CAF5"/>
+          <w:sz w:val="21"/>
+          <w:szCs w:val="21"/>
+        </w:rPr>
+        <w:t>TypeOrmModule</w:t>
+      </w:r>
+      <w:proofErr w:type="spellEnd"/>
+      <w:proofErr w:type="gramEnd"/>
+      <w:r>
+        <w:rPr>
+          <w:rFonts w:ascii="Consolas" w:eastAsia="Times New Roman" w:hAnsi="Consolas" w:cs="Times New Roman"/>
+          <w:color w:val="C0CAF5"/>
+          <w:sz w:val="21"/>
+          <w:szCs w:val="21"/>
+        </w:rPr>
+        <w:t xml:space="preserve"> } </w:t>
+      </w:r>
+      <w:r>
+        <w:rPr>
+          <w:rFonts w:ascii="Consolas" w:eastAsia="Times New Roman" w:hAnsi="Consolas" w:cs="Times New Roman"/>
+          <w:color w:val="BB9AF7"/>
+          <w:sz w:val="21"/>
+          <w:szCs w:val="21"/>
+        </w:rPr>
+        <w:t>from</w:t>
+      </w:r>
+      <w:r>
+        <w:rPr>
+          <w:rFonts w:ascii="Consolas" w:eastAsia="Times New Roman" w:hAnsi="Consolas" w:cs="Times New Roman"/>
+          <w:color w:val="C0CAF5"/>
+          <w:sz w:val="21"/>
+          <w:szCs w:val="21"/>
+        </w:rPr>
+        <w:t xml:space="preserve"> '</w:t>
+      </w:r>
+      <w:r>
+        <w:rPr>
+          <w:rFonts w:ascii="Consolas" w:eastAsia="Times New Roman" w:hAnsi="Consolas" w:cs="Times New Roman"/>
+          <w:color w:val="9ECE6A"/>
+          <w:sz w:val="21"/>
+          <w:szCs w:val="21"/>
+        </w:rPr>
+        <w:t>@</w:t>
+      </w:r>
+      <w:proofErr w:type="spellStart"/>
+      <w:r>
+        <w:rPr>
+          <w:rFonts w:ascii="Consolas" w:eastAsia="Times New Roman" w:hAnsi="Consolas" w:cs="Times New Roman"/>
+          <w:color w:val="9ECE6A"/>
+          <w:sz w:val="21"/>
+          <w:szCs w:val="21"/>
+        </w:rPr>
+        <w:t>nestjs</w:t>
+      </w:r>
+      <w:proofErr w:type="spellEnd"/>
+      <w:r>
+        <w:rPr>
+          <w:rFonts w:ascii="Consolas" w:eastAsia="Times New Roman" w:hAnsi="Consolas" w:cs="Times New Roman"/>
+          <w:color w:val="9ECE6A"/>
+          <w:sz w:val="21"/>
+          <w:szCs w:val="21"/>
+        </w:rPr>
+        <w:t>/</w:t>
+      </w:r>
+      <w:proofErr w:type="spellStart"/>
+      <w:r>
+        <w:rPr>
+          <w:rFonts w:ascii="Consolas" w:eastAsia="Times New Roman" w:hAnsi="Consolas" w:cs="Times New Roman"/>
+          <w:color w:val="9ECE6A"/>
+          <w:sz w:val="21"/>
+          <w:szCs w:val="21"/>
+        </w:rPr>
+        <w:t>typeorm</w:t>
+      </w:r>
+      <w:proofErr w:type="spellEnd"/>
+      <w:r>
+        <w:rPr>
+          <w:rFonts w:ascii="Consolas" w:eastAsia="Times New Roman" w:hAnsi="Consolas" w:cs="Times New Roman"/>
+          <w:color w:val="C0CAF5"/>
+          <w:sz w:val="21"/>
+          <w:szCs w:val="21"/>
+        </w:rPr>
+        <w:t>';</w:t>
+      </w:r>
+    </w:p>
+    <w:p>
+      <w:pPr>
+        <w:shd w:val="clear" w:color="auto" w:fill="1A1B26"/>
+        <w:spacing w:after="0" w:line="285" w:lineRule="atLeast"/>
+        <w:ind w:firstLine="0"/>
+        <w:rPr>
+          <w:rFonts w:ascii="Consolas" w:eastAsia="Times New Roman" w:hAnsi="Consolas" w:cs="Times New Roman"/>
+          <w:color w:val="C0CAF5"/>
+          <w:sz w:val="21"/>
+          <w:szCs w:val="21"/>
+        </w:rPr>
+      </w:pPr>
+    </w:p>
+    <w:p>
+      <w:pPr>
+        <w:shd w:val="clear" w:color="auto" w:fill="1A1B26"/>
+        <w:spacing w:after="0" w:line="285" w:lineRule="atLeast"/>
+        <w:ind w:firstLine="0"/>
+        <w:rPr>
+          <w:rFonts w:ascii="Consolas" w:eastAsia="Times New Roman" w:hAnsi="Consolas" w:cs="Times New Roman"/>
+          <w:color w:val="C0CAF5"/>
+          <w:sz w:val="21"/>
+          <w:szCs w:val="21"/>
+        </w:rPr>
+      </w:pPr>
+      <w:r>
+        <w:rPr>
+          <w:rFonts w:ascii="Consolas" w:eastAsia="Times New Roman" w:hAnsi="Consolas" w:cs="Times New Roman"/>
+          <w:color w:val="C0CAF5"/>
+          <w:sz w:val="21"/>
+          <w:szCs w:val="21"/>
+        </w:rPr>
+        <w:t>@</w:t>
+      </w:r>
+      <w:proofErr w:type="gramStart"/>
+      <w:r>
+        <w:rPr>
+          <w:rFonts w:ascii="Consolas" w:eastAsia="Times New Roman" w:hAnsi="Consolas" w:cs="Times New Roman"/>
+          <w:color w:val="7AA2F7"/>
+          <w:sz w:val="21"/>
+          <w:szCs w:val="21"/>
+        </w:rPr>
+        <w:t>Module</w:t>
+      </w:r>
+      <w:r>
+        <w:rPr>
+          <w:rFonts w:ascii="Consolas" w:eastAsia="Times New Roman" w:hAnsi="Consolas" w:cs="Times New Roman"/>
+          <w:color w:val="C0CAF5"/>
+          <w:sz w:val="21"/>
+          <w:szCs w:val="21"/>
+        </w:rPr>
+        <w:t>(</w:t>
+      </w:r>
+      <w:proofErr w:type="gramEnd"/>
+      <w:r>
+        <w:rPr>
+          <w:rFonts w:ascii="Consolas" w:eastAsia="Times New Roman" w:hAnsi="Consolas" w:cs="Times New Roman"/>
+          <w:color w:val="C0CAF5"/>
+          <w:sz w:val="21"/>
+          <w:szCs w:val="21"/>
+        </w:rPr>
+        <w:t>{</w:t>
+      </w:r>
+    </w:p>
+    <w:p>
+      <w:pPr>
+        <w:shd w:val="clear" w:color="auto" w:fill="1A1B26"/>
+        <w:spacing w:after="0" w:line="285" w:lineRule="atLeast"/>
+        <w:ind w:firstLine="0"/>
+        <w:rPr>
+          <w:rFonts w:ascii="Consolas" w:eastAsia="Times New Roman" w:hAnsi="Consolas" w:cs="Times New Roman"/>
+          <w:color w:val="C0CAF5"/>
+          <w:sz w:val="21"/>
+          <w:szCs w:val="21"/>
+        </w:rPr>
+      </w:pPr>
+      <w:r>
+        <w:rPr>
+          <w:rFonts w:ascii="Consolas" w:eastAsia="Times New Roman" w:hAnsi="Consolas" w:cs="Times New Roman"/>
+          <w:color w:val="C0CAF5"/>
+          <w:sz w:val="21"/>
+          <w:szCs w:val="21"/>
+        </w:rPr>
+        <w:t>  imports: [</w:t>
+      </w:r>
+      <w:proofErr w:type="spellStart"/>
+      <w:r>
+        <w:rPr>
+          <w:rFonts w:ascii="Consolas" w:eastAsia="Times New Roman" w:hAnsi="Consolas" w:cs="Times New Roman"/>
+          <w:color w:val="C0CAF5"/>
+          <w:sz w:val="21"/>
+          <w:szCs w:val="21"/>
+        </w:rPr>
+        <w:t>ConfigModule.</w:t>
+      </w:r>
+      <w:r>
+        <w:rPr>
+          <w:rFonts w:ascii="Consolas" w:eastAsia="Times New Roman" w:hAnsi="Consolas" w:cs="Times New Roman"/>
+          <w:color w:val="7AA2F7"/>
+          <w:sz w:val="21"/>
+          <w:szCs w:val="21"/>
+        </w:rPr>
+        <w:t>forRoot</w:t>
+      </w:r>
+      <w:proofErr w:type="spellEnd"/>
+      <w:r>
+        <w:rPr>
+          <w:rFonts w:ascii="Consolas" w:eastAsia="Times New Roman" w:hAnsi="Consolas" w:cs="Times New Roman"/>
+          <w:color w:val="C0CAF5"/>
+          <w:sz w:val="21"/>
+          <w:szCs w:val="21"/>
+        </w:rPr>
+        <w:t>(),</w:t>
+      </w:r>
+    </w:p>
+    <w:p>
+      <w:pPr>
+        <w:shd w:val="clear" w:color="auto" w:fill="1A1B26"/>
+        <w:spacing w:after="0" w:line="285" w:lineRule="atLeast"/>
+        <w:ind w:firstLine="0"/>
+        <w:rPr>
+          <w:rFonts w:ascii="Consolas" w:eastAsia="Times New Roman" w:hAnsi="Consolas" w:cs="Times New Roman"/>
+          <w:color w:val="C0CAF5"/>
+          <w:sz w:val="21"/>
+          <w:szCs w:val="21"/>
+        </w:rPr>
+      </w:pPr>
+      <w:r>
+        <w:rPr>
+          <w:rFonts w:ascii="Consolas" w:eastAsia="Times New Roman" w:hAnsi="Consolas" w:cs="Times New Roman"/>
+          <w:color w:val="C0CAF5"/>
+          <w:sz w:val="21"/>
+          <w:szCs w:val="21"/>
+        </w:rPr>
+        <w:t xml:space="preserve">  </w:t>
+      </w:r>
+      <w:proofErr w:type="spellStart"/>
+      <w:r>
+        <w:rPr>
+          <w:rFonts w:ascii="Consolas" w:eastAsia="Times New Roman" w:hAnsi="Consolas" w:cs="Times New Roman"/>
+          <w:color w:val="C0CAF5"/>
+          <w:sz w:val="21"/>
+          <w:szCs w:val="21"/>
+        </w:rPr>
+        <w:t>TypeOrmModule.</w:t>
+      </w:r>
+      <w:r>
+        <w:rPr>
+          <w:rFonts w:ascii="Consolas" w:eastAsia="Times New Roman" w:hAnsi="Consolas" w:cs="Times New Roman"/>
+          <w:color w:val="7AA2F7"/>
+          <w:sz w:val="21"/>
+          <w:szCs w:val="21"/>
+        </w:rPr>
+        <w:t>forRoot</w:t>
+      </w:r>
+      <w:proofErr w:type="spellEnd"/>
+      <w:r>
+        <w:rPr>
+          <w:rFonts w:ascii="Consolas" w:eastAsia="Times New Roman" w:hAnsi="Consolas" w:cs="Times New Roman"/>
+          <w:color w:val="C0CAF5"/>
+          <w:sz w:val="21"/>
+          <w:szCs w:val="21"/>
+        </w:rPr>
+        <w:t>({</w:t>
+      </w:r>
+    </w:p>
+    <w:p>
+      <w:pPr>
+        <w:shd w:val="clear" w:color="auto" w:fill="1A1B26"/>
+        <w:spacing w:after="0" w:line="285" w:lineRule="atLeast"/>
+        <w:ind w:firstLine="0"/>
+        <w:rPr>
+          <w:rFonts w:ascii="Consolas" w:eastAsia="Times New Roman" w:hAnsi="Consolas" w:cs="Times New Roman"/>
+          <w:color w:val="C0CAF5"/>
+          <w:sz w:val="21"/>
+          <w:szCs w:val="21"/>
+        </w:rPr>
+      </w:pPr>
+      <w:r>
+        <w:rPr>
+          <w:rFonts w:ascii="Consolas" w:eastAsia="Times New Roman" w:hAnsi="Consolas" w:cs="Times New Roman"/>
+          <w:color w:val="C0CAF5"/>
+          <w:sz w:val="21"/>
+          <w:szCs w:val="21"/>
+        </w:rPr>
+        <w:t>    type: '</w:t>
+      </w:r>
+      <w:proofErr w:type="spellStart"/>
+      <w:r>
+        <w:rPr>
+          <w:rFonts w:ascii="Consolas" w:eastAsia="Times New Roman" w:hAnsi="Consolas" w:cs="Times New Roman"/>
+          <w:color w:val="9ECE6A"/>
+          <w:sz w:val="21"/>
+          <w:szCs w:val="21"/>
+        </w:rPr>
+        <w:t>postgres</w:t>
+      </w:r>
+      <w:proofErr w:type="spellEnd"/>
+      <w:r>
+        <w:rPr>
+          <w:rFonts w:ascii="Consolas" w:eastAsia="Times New Roman" w:hAnsi="Consolas" w:cs="Times New Roman"/>
+          <w:color w:val="C0CAF5"/>
+          <w:sz w:val="21"/>
+          <w:szCs w:val="21"/>
+        </w:rPr>
+        <w:t>',</w:t>
+      </w:r>
+    </w:p>
+    <w:p>
+      <w:pPr>
+        <w:shd w:val="clear" w:color="auto" w:fill="1A1B26"/>
+        <w:spacing w:after="0" w:line="285" w:lineRule="atLeast"/>
+        <w:ind w:firstLine="0"/>
+        <w:rPr>
+          <w:rFonts w:ascii="Consolas" w:eastAsia="Times New Roman" w:hAnsi="Consolas" w:cs="Times New Roman"/>
+          <w:color w:val="C0CAF5"/>
+          <w:sz w:val="21"/>
+          <w:szCs w:val="21"/>
+        </w:rPr>
+      </w:pPr>
+      <w:r>
+        <w:rPr>
+          <w:rFonts w:ascii="Consolas" w:eastAsia="Times New Roman" w:hAnsi="Consolas" w:cs="Times New Roman"/>
+          <w:color w:val="C0CAF5"/>
+          <w:sz w:val="21"/>
+          <w:szCs w:val="21"/>
+        </w:rPr>
+        <w:t>    host: '</w:t>
+      </w:r>
+      <w:r>
+        <w:rPr>
+          <w:rFonts w:ascii="Consolas" w:eastAsia="Times New Roman" w:hAnsi="Consolas" w:cs="Times New Roman"/>
+          <w:color w:val="9ECE6A"/>
+          <w:sz w:val="21"/>
+          <w:szCs w:val="21"/>
+        </w:rPr>
+        <w:t>localhost</w:t>
+      </w:r>
+      <w:r>
+        <w:rPr>
+          <w:rFonts w:ascii="Consolas" w:eastAsia="Times New Roman" w:hAnsi="Consolas" w:cs="Times New Roman"/>
+          <w:color w:val="C0CAF5"/>
+          <w:sz w:val="21"/>
+          <w:szCs w:val="21"/>
+        </w:rPr>
+        <w:t>',</w:t>
+      </w:r>
+    </w:p>
+    <w:p>
+      <w:pPr>
+        <w:shd w:val="clear" w:color="auto" w:fill="1A1B26"/>
+        <w:spacing w:after="0" w:line="285" w:lineRule="atLeast"/>
+        <w:ind w:firstLine="0"/>
+        <w:rPr>
+          <w:rFonts w:ascii="Consolas" w:eastAsia="Times New Roman" w:hAnsi="Consolas" w:cs="Times New Roman"/>
+          <w:color w:val="C0CAF5"/>
+          <w:sz w:val="21"/>
+          <w:szCs w:val="21"/>
+        </w:rPr>
+      </w:pPr>
+      <w:r>
+        <w:rPr>
+          <w:rFonts w:ascii="Consolas" w:eastAsia="Times New Roman" w:hAnsi="Consolas" w:cs="Times New Roman"/>
+          <w:color w:val="C0CAF5"/>
+          <w:sz w:val="21"/>
+          <w:szCs w:val="21"/>
+        </w:rPr>
+        <w:t xml:space="preserve">    port: </w:t>
+      </w:r>
+      <w:r>
+        <w:rPr>
+          <w:rFonts w:ascii="Consolas" w:eastAsia="Times New Roman" w:hAnsi="Consolas" w:cs="Times New Roman"/>
+          <w:color w:val="FF9E64"/>
+          <w:sz w:val="21"/>
+          <w:szCs w:val="21"/>
+        </w:rPr>
+        <w:t>5434</w:t>
+      </w:r>
+      <w:r>
+        <w:rPr>
+          <w:rFonts w:ascii="Consolas" w:eastAsia="Times New Roman" w:hAnsi="Consolas" w:cs="Times New Roman"/>
+          <w:color w:val="C0CAF5"/>
+          <w:sz w:val="21"/>
+          <w:szCs w:val="21"/>
+        </w:rPr>
+        <w:t>,</w:t>
+      </w:r>
+    </w:p>
+    <w:p>
+      <w:pPr>
+        <w:shd w:val="clear" w:color="auto" w:fill="1A1B26"/>
+        <w:spacing w:after="0" w:line="285" w:lineRule="atLeast"/>
+        <w:ind w:firstLine="0"/>
+        <w:rPr>
+          <w:rFonts w:ascii="Consolas" w:eastAsia="Times New Roman" w:hAnsi="Consolas" w:cs="Times New Roman"/>
+          <w:color w:val="C0CAF5"/>
+          <w:sz w:val="21"/>
+          <w:szCs w:val="21"/>
+        </w:rPr>
+      </w:pPr>
+      <w:r>
+        <w:rPr>
+          <w:rFonts w:ascii="Consolas" w:eastAsia="Times New Roman" w:hAnsi="Consolas" w:cs="Times New Roman"/>
+          <w:color w:val="C0CAF5"/>
+          <w:sz w:val="21"/>
+          <w:szCs w:val="21"/>
+        </w:rPr>
+        <w:t>    username: '</w:t>
+      </w:r>
+      <w:proofErr w:type="spellStart"/>
+      <w:r>
+        <w:rPr>
+          <w:rFonts w:ascii="Consolas" w:eastAsia="Times New Roman" w:hAnsi="Consolas" w:cs="Times New Roman"/>
+          <w:color w:val="9ECE6A"/>
+          <w:sz w:val="21"/>
+          <w:szCs w:val="21"/>
+        </w:rPr>
+        <w:t>postgres</w:t>
+      </w:r>
+      <w:proofErr w:type="spellEnd"/>
+      <w:r>
+        <w:rPr>
+          <w:rFonts w:ascii="Consolas" w:eastAsia="Times New Roman" w:hAnsi="Consolas" w:cs="Times New Roman"/>
+          <w:color w:val="C0CAF5"/>
+          <w:sz w:val="21"/>
+          <w:szCs w:val="21"/>
+        </w:rPr>
+        <w:t>',</w:t>
+      </w:r>
+    </w:p>
+    <w:p>
+      <w:pPr>
+        <w:shd w:val="clear" w:color="auto" w:fill="1A1B26"/>
+        <w:spacing w:after="0" w:line="285" w:lineRule="atLeast"/>
+        <w:ind w:firstLine="0"/>
+        <w:rPr>
+          <w:rFonts w:ascii="Consolas" w:eastAsia="Times New Roman" w:hAnsi="Consolas" w:cs="Times New Roman"/>
+          <w:color w:val="C0CAF5"/>
+          <w:sz w:val="21"/>
+          <w:szCs w:val="21"/>
+        </w:rPr>
+      </w:pPr>
+      <w:r>
+        <w:rPr>
+          <w:rFonts w:ascii="Consolas" w:eastAsia="Times New Roman" w:hAnsi="Consolas" w:cs="Times New Roman"/>
+          <w:color w:val="C0CAF5"/>
+          <w:sz w:val="21"/>
+          <w:szCs w:val="21"/>
+        </w:rPr>
+        <w:t>    password: '</w:t>
+      </w:r>
+      <w:proofErr w:type="spellStart"/>
+      <w:r>
+        <w:rPr>
+          <w:rFonts w:ascii="Consolas" w:eastAsia="Times New Roman" w:hAnsi="Consolas" w:cs="Times New Roman"/>
+          <w:color w:val="9ECE6A"/>
+          <w:sz w:val="21"/>
+          <w:szCs w:val="21"/>
+        </w:rPr>
+        <w:t>postgresql</w:t>
+      </w:r>
+      <w:proofErr w:type="spellEnd"/>
+      <w:r>
+        <w:rPr>
+          <w:rFonts w:ascii="Consolas" w:eastAsia="Times New Roman" w:hAnsi="Consolas" w:cs="Times New Roman"/>
+          <w:color w:val="C0CAF5"/>
+          <w:sz w:val="21"/>
+          <w:szCs w:val="21"/>
+        </w:rPr>
+        <w:t>',</w:t>
+      </w:r>
+    </w:p>
+    <w:p>
+      <w:pPr>
+        <w:shd w:val="clear" w:color="auto" w:fill="1A1B26"/>
+        <w:spacing w:after="0" w:line="285" w:lineRule="atLeast"/>
+        <w:ind w:firstLine="0"/>
+        <w:rPr>
+          <w:rFonts w:ascii="Consolas" w:eastAsia="Times New Roman" w:hAnsi="Consolas" w:cs="Times New Roman"/>
+          <w:color w:val="C0CAF5"/>
+          <w:sz w:val="21"/>
+          <w:szCs w:val="21"/>
+        </w:rPr>
+      </w:pPr>
+      <w:r>
+        <w:rPr>
+          <w:rFonts w:ascii="Consolas" w:eastAsia="Times New Roman" w:hAnsi="Consolas" w:cs="Times New Roman"/>
+          <w:color w:val="C0CAF5"/>
+          <w:sz w:val="21"/>
+          <w:szCs w:val="21"/>
+        </w:rPr>
+        <w:t>    database: '</w:t>
+      </w:r>
+      <w:proofErr w:type="spellStart"/>
+      <w:r>
+        <w:rPr>
+          <w:rFonts w:ascii="Consolas" w:eastAsia="Times New Roman" w:hAnsi="Consolas" w:cs="Times New Roman"/>
+          <w:color w:val="9ECE6A"/>
+          <w:sz w:val="21"/>
+          <w:szCs w:val="21"/>
+        </w:rPr>
+        <w:t>bd_inventario</w:t>
+      </w:r>
+      <w:proofErr w:type="spellEnd"/>
+      <w:r>
+        <w:rPr>
+          <w:rFonts w:ascii="Consolas" w:eastAsia="Times New Roman" w:hAnsi="Consolas" w:cs="Times New Roman"/>
+          <w:color w:val="C0CAF5"/>
+          <w:sz w:val="21"/>
+          <w:szCs w:val="21"/>
+        </w:rPr>
+        <w:t>',</w:t>
+      </w:r>
+    </w:p>
+    <w:p>
+      <w:pPr>
+        <w:shd w:val="clear" w:color="auto" w:fill="1A1B26"/>
+        <w:spacing w:after="0" w:line="285" w:lineRule="atLeast"/>
+        <w:ind w:firstLine="0"/>
+        <w:rPr>
+          <w:rFonts w:ascii="Consolas" w:eastAsia="Times New Roman" w:hAnsi="Consolas" w:cs="Times New Roman"/>
+          <w:color w:val="C0CAF5"/>
+          <w:sz w:val="21"/>
+          <w:szCs w:val="21"/>
+        </w:rPr>
+      </w:pPr>
+      <w:r>
+        <w:rPr>
+          <w:rFonts w:ascii="Consolas" w:eastAsia="Times New Roman" w:hAnsi="Consolas" w:cs="Times New Roman"/>
+          <w:color w:val="C0CAF5"/>
+          <w:sz w:val="21"/>
+          <w:szCs w:val="21"/>
+        </w:rPr>
+        <w:t xml:space="preserve">    </w:t>
+      </w:r>
+      <w:proofErr w:type="gramStart"/>
+      <w:r>
+        <w:rPr>
+          <w:rFonts w:ascii="Consolas" w:eastAsia="Times New Roman" w:hAnsi="Consolas" w:cs="Times New Roman"/>
+          <w:color w:val="C0CAF5"/>
+          <w:sz w:val="21"/>
+          <w:szCs w:val="21"/>
+        </w:rPr>
+        <w:t>entities:[</w:t>
+      </w:r>
+      <w:proofErr w:type="gramEnd"/>
+    </w:p>
+    <w:p>
+      <w:pPr>
+        <w:shd w:val="clear" w:color="auto" w:fill="1A1B26"/>
+        <w:spacing w:after="0" w:line="285" w:lineRule="atLeast"/>
+        <w:ind w:firstLine="0"/>
+        <w:rPr>
+          <w:rFonts w:ascii="Consolas" w:eastAsia="Times New Roman" w:hAnsi="Consolas" w:cs="Times New Roman"/>
+          <w:color w:val="C0CAF5"/>
+          <w:sz w:val="21"/>
+          <w:szCs w:val="21"/>
+        </w:rPr>
+      </w:pPr>
+      <w:r>
+        <w:rPr>
+          <w:rFonts w:ascii="Consolas" w:eastAsia="Times New Roman" w:hAnsi="Consolas" w:cs="Times New Roman"/>
+          <w:color w:val="C0CAF5"/>
+          <w:sz w:val="21"/>
+          <w:szCs w:val="21"/>
+        </w:rPr>
+        <w:t>      __</w:t>
+      </w:r>
+      <w:proofErr w:type="spellStart"/>
+      <w:r>
+        <w:rPr>
+          <w:rFonts w:ascii="Consolas" w:eastAsia="Times New Roman" w:hAnsi="Consolas" w:cs="Times New Roman"/>
+          <w:color w:val="C0CAF5"/>
+          <w:sz w:val="21"/>
+          <w:szCs w:val="21"/>
+        </w:rPr>
+        <w:t>dirname</w:t>
+      </w:r>
+      <w:proofErr w:type="spellEnd"/>
+      <w:r>
+        <w:rPr>
+          <w:rFonts w:ascii="Consolas" w:eastAsia="Times New Roman" w:hAnsi="Consolas" w:cs="Times New Roman"/>
+          <w:color w:val="C0CAF5"/>
+          <w:sz w:val="21"/>
+          <w:szCs w:val="21"/>
+        </w:rPr>
+        <w:t xml:space="preserve"> </w:t>
+      </w:r>
+      <w:r>
+        <w:rPr>
+          <w:rFonts w:ascii="Consolas" w:eastAsia="Times New Roman" w:hAnsi="Consolas" w:cs="Times New Roman"/>
+          <w:color w:val="BB9AF7"/>
+          <w:sz w:val="21"/>
+          <w:szCs w:val="21"/>
+        </w:rPr>
+        <w:t>+</w:t>
+      </w:r>
+      <w:r>
+        <w:rPr>
+          <w:rFonts w:ascii="Consolas" w:eastAsia="Times New Roman" w:hAnsi="Consolas" w:cs="Times New Roman"/>
+          <w:color w:val="C0CAF5"/>
+          <w:sz w:val="21"/>
+          <w:szCs w:val="21"/>
+        </w:rPr>
+        <w:t xml:space="preserve"> '</w:t>
+      </w:r>
+      <w:proofErr w:type="gramStart"/>
+      <w:r>
+        <w:rPr>
+          <w:rFonts w:ascii="Consolas" w:eastAsia="Times New Roman" w:hAnsi="Consolas" w:cs="Times New Roman"/>
+          <w:color w:val="9ECE6A"/>
+          <w:sz w:val="21"/>
+          <w:szCs w:val="21"/>
+        </w:rPr>
+        <w:t>/..</w:t>
+      </w:r>
+      <w:proofErr w:type="gramEnd"/>
+      <w:r>
+        <w:rPr>
+          <w:rFonts w:ascii="Consolas" w:eastAsia="Times New Roman" w:hAnsi="Consolas" w:cs="Times New Roman"/>
+          <w:color w:val="9ECE6A"/>
+          <w:sz w:val="21"/>
+          <w:szCs w:val="21"/>
+        </w:rPr>
+        <w:t>/**/*entity{.ts,.js}</w:t>
+      </w:r>
+      <w:r>
+        <w:rPr>
+          <w:rFonts w:ascii="Consolas" w:eastAsia="Times New Roman" w:hAnsi="Consolas" w:cs="Times New Roman"/>
+          <w:color w:val="C0CAF5"/>
+          <w:sz w:val="21"/>
+          <w:szCs w:val="21"/>
+        </w:rPr>
+        <w:t>'</w:t>
+      </w:r>
+    </w:p>
+    <w:p>
+      <w:pPr>
+        <w:shd w:val="clear" w:color="auto" w:fill="1A1B26"/>
+        <w:spacing w:after="0" w:line="285" w:lineRule="atLeast"/>
+        <w:ind w:firstLine="0"/>
+        <w:rPr>
+          <w:rFonts w:ascii="Consolas" w:eastAsia="Times New Roman" w:hAnsi="Consolas" w:cs="Times New Roman"/>
+          <w:color w:val="C0CAF5"/>
+          <w:sz w:val="21"/>
+          <w:szCs w:val="21"/>
+        </w:rPr>
+      </w:pPr>
+      <w:r>
+        <w:rPr>
+          <w:rFonts w:ascii="Consolas" w:eastAsia="Times New Roman" w:hAnsi="Consolas" w:cs="Times New Roman"/>
+          <w:color w:val="C0CAF5"/>
+          <w:sz w:val="21"/>
+          <w:szCs w:val="21"/>
+        </w:rPr>
+        <w:t>    ],</w:t>
+      </w:r>
+    </w:p>
+    <w:p>
+      <w:pPr>
+        <w:shd w:val="clear" w:color="auto" w:fill="1A1B26"/>
+        <w:spacing w:after="0" w:line="285" w:lineRule="atLeast"/>
+        <w:ind w:firstLine="0"/>
+        <w:rPr>
+          <w:rFonts w:ascii="Consolas" w:eastAsia="Times New Roman" w:hAnsi="Consolas" w:cs="Times New Roman"/>
+          <w:color w:val="C0CAF5"/>
+          <w:sz w:val="21"/>
+          <w:szCs w:val="21"/>
+        </w:rPr>
+      </w:pPr>
+      <w:r>
+        <w:rPr>
+          <w:rFonts w:ascii="Consolas" w:eastAsia="Times New Roman" w:hAnsi="Consolas" w:cs="Times New Roman"/>
+          <w:color w:val="C0CAF5"/>
+          <w:sz w:val="21"/>
+          <w:szCs w:val="21"/>
+        </w:rPr>
+        <w:t xml:space="preserve">    synchronize: </w:t>
+      </w:r>
+      <w:r>
+        <w:rPr>
+          <w:rFonts w:ascii="Consolas" w:eastAsia="Times New Roman" w:hAnsi="Consolas" w:cs="Times New Roman"/>
+          <w:color w:val="FF9E64"/>
+          <w:sz w:val="21"/>
+          <w:szCs w:val="21"/>
+        </w:rPr>
+        <w:t>false</w:t>
+      </w:r>
+    </w:p>
+    <w:p>
+      <w:pPr>
+        <w:shd w:val="clear" w:color="auto" w:fill="1A1B26"/>
+        <w:spacing w:after="0" w:line="285" w:lineRule="atLeast"/>
+        <w:ind w:firstLine="0"/>
+        <w:rPr>
+          <w:rFonts w:ascii="Consolas" w:eastAsia="Times New Roman" w:hAnsi="Consolas" w:cs="Times New Roman"/>
+          <w:color w:val="C0CAF5"/>
+          <w:sz w:val="21"/>
+          <w:szCs w:val="21"/>
+        </w:rPr>
+      </w:pPr>
+    </w:p>
+    <w:p>
+      <w:pPr>
+        <w:shd w:val="clear" w:color="auto" w:fill="1A1B26"/>
+        <w:spacing w:after="0" w:line="285" w:lineRule="atLeast"/>
+        <w:ind w:firstLine="0"/>
+        <w:rPr>
+          <w:rFonts w:ascii="Consolas" w:eastAsia="Times New Roman" w:hAnsi="Consolas" w:cs="Times New Roman"/>
+          <w:color w:val="C0CAF5"/>
+          <w:sz w:val="21"/>
+          <w:szCs w:val="21"/>
+        </w:rPr>
+      </w:pPr>
+      <w:r>
+        <w:rPr>
+          <w:rFonts w:ascii="Consolas" w:eastAsia="Times New Roman" w:hAnsi="Consolas" w:cs="Times New Roman"/>
+          <w:color w:val="C0CAF5"/>
+          <w:sz w:val="21"/>
+          <w:szCs w:val="21"/>
+        </w:rPr>
+        <w:t xml:space="preserve">  }), </w:t>
+      </w:r>
+    </w:p>
+    <w:p>
+      <w:pPr>
+        <w:shd w:val="clear" w:color="auto" w:fill="1A1B26"/>
+        <w:spacing w:after="0" w:line="285" w:lineRule="atLeast"/>
+        <w:ind w:firstLine="0"/>
+        <w:rPr>
+          <w:rFonts w:ascii="Consolas" w:eastAsia="Times New Roman" w:hAnsi="Consolas" w:cs="Times New Roman"/>
+          <w:color w:val="C0CAF5"/>
+          <w:sz w:val="21"/>
+          <w:szCs w:val="21"/>
+        </w:rPr>
+      </w:pPr>
+      <w:r>
+        <w:rPr>
+          <w:rFonts w:ascii="Consolas" w:eastAsia="Times New Roman" w:hAnsi="Consolas" w:cs="Times New Roman"/>
+          <w:color w:val="C0CAF5"/>
+          <w:sz w:val="21"/>
+          <w:szCs w:val="21"/>
+        </w:rPr>
+        <w:t xml:space="preserve">    </w:t>
+      </w:r>
+    </w:p>
+    <w:p>
+      <w:pPr>
+        <w:shd w:val="clear" w:color="auto" w:fill="1A1B26"/>
+        <w:spacing w:after="0" w:line="285" w:lineRule="atLeast"/>
+        <w:ind w:firstLine="0"/>
+        <w:rPr>
+          <w:rFonts w:ascii="Consolas" w:eastAsia="Times New Roman" w:hAnsi="Consolas" w:cs="Times New Roman"/>
+          <w:color w:val="C0CAF5"/>
+          <w:sz w:val="21"/>
+          <w:szCs w:val="21"/>
+        </w:rPr>
+      </w:pPr>
+      <w:r>
+        <w:rPr>
+          <w:rFonts w:ascii="Consolas" w:eastAsia="Times New Roman" w:hAnsi="Consolas" w:cs="Times New Roman"/>
+          <w:color w:val="C0CAF5"/>
+          <w:sz w:val="21"/>
+          <w:szCs w:val="21"/>
+        </w:rPr>
+        <w:t xml:space="preserve">    </w:t>
+      </w:r>
+      <w:proofErr w:type="spellStart"/>
+      <w:r>
+        <w:rPr>
+          <w:rFonts w:ascii="Consolas" w:eastAsia="Times New Roman" w:hAnsi="Consolas" w:cs="Times New Roman"/>
+          <w:color w:val="C0CAF5"/>
+          <w:sz w:val="21"/>
+          <w:szCs w:val="21"/>
+        </w:rPr>
+        <w:t>UsersModule</w:t>
+      </w:r>
+      <w:proofErr w:type="spellEnd"/>
+      <w:r>
+        <w:rPr>
+          <w:rFonts w:ascii="Consolas" w:eastAsia="Times New Roman" w:hAnsi="Consolas" w:cs="Times New Roman"/>
+          <w:color w:val="C0CAF5"/>
+          <w:sz w:val="21"/>
+          <w:szCs w:val="21"/>
+        </w:rPr>
+        <w:t>],</w:t>
+      </w:r>
+    </w:p>
+    <w:p>
+      <w:pPr>
+        <w:shd w:val="clear" w:color="auto" w:fill="1A1B26"/>
+        <w:spacing w:after="0" w:line="285" w:lineRule="atLeast"/>
+        <w:ind w:firstLine="0"/>
+        <w:rPr>
+          <w:rFonts w:ascii="Consolas" w:eastAsia="Times New Roman" w:hAnsi="Consolas" w:cs="Times New Roman"/>
+          <w:color w:val="C0CAF5"/>
+          <w:sz w:val="21"/>
+          <w:szCs w:val="21"/>
+        </w:rPr>
+      </w:pPr>
+      <w:r>
+        <w:rPr>
+          <w:rFonts w:ascii="Consolas" w:eastAsia="Times New Roman" w:hAnsi="Consolas" w:cs="Times New Roman"/>
+          <w:color w:val="C0CAF5"/>
+          <w:sz w:val="21"/>
+          <w:szCs w:val="21"/>
+        </w:rPr>
+        <w:t>  controllers: [</w:t>
+      </w:r>
+      <w:proofErr w:type="spellStart"/>
+      <w:r>
+        <w:rPr>
+          <w:rFonts w:ascii="Consolas" w:eastAsia="Times New Roman" w:hAnsi="Consolas" w:cs="Times New Roman"/>
+          <w:color w:val="C0CAF5"/>
+          <w:sz w:val="21"/>
+          <w:szCs w:val="21"/>
+        </w:rPr>
+        <w:t>AppController</w:t>
+      </w:r>
+      <w:proofErr w:type="spellEnd"/>
+      <w:r>
+        <w:rPr>
+          <w:rFonts w:ascii="Consolas" w:eastAsia="Times New Roman" w:hAnsi="Consolas" w:cs="Times New Roman"/>
+          <w:color w:val="C0CAF5"/>
+          <w:sz w:val="21"/>
+          <w:szCs w:val="21"/>
+        </w:rPr>
+        <w:t>],</w:t>
+      </w:r>
+    </w:p>
+    <w:p>
+      <w:pPr>
+        <w:shd w:val="clear" w:color="auto" w:fill="1A1B26"/>
+        <w:spacing w:after="0" w:line="285" w:lineRule="atLeast"/>
+        <w:ind w:firstLine="0"/>
+        <w:rPr>
+          <w:rFonts w:ascii="Consolas" w:eastAsia="Times New Roman" w:hAnsi="Consolas" w:cs="Times New Roman"/>
+          <w:color w:val="C0CAF5"/>
+          <w:sz w:val="21"/>
+          <w:szCs w:val="21"/>
+        </w:rPr>
+      </w:pPr>
+      <w:r>
+        <w:rPr>
+          <w:rFonts w:ascii="Consolas" w:eastAsia="Times New Roman" w:hAnsi="Consolas" w:cs="Times New Roman"/>
+          <w:color w:val="C0CAF5"/>
+          <w:sz w:val="21"/>
+          <w:szCs w:val="21"/>
+        </w:rPr>
+        <w:t>  providers: [AppService],</w:t>
+      </w:r>
+    </w:p>
+    <w:p>
+      <w:pPr>
+        <w:shd w:val="clear" w:color="auto" w:fill="1A1B26"/>
+        <w:spacing w:after="0" w:line="285" w:lineRule="atLeast"/>
+        <w:ind w:firstLine="0"/>
+        <w:rPr>
+          <w:rFonts w:ascii="Consolas" w:eastAsia="Times New Roman" w:hAnsi="Consolas" w:cs="Times New Roman"/>
+          <w:color w:val="C0CAF5"/>
+          <w:sz w:val="21"/>
+          <w:szCs w:val="21"/>
+        </w:rPr>
+      </w:pPr>
+      <w:r>
+        <w:rPr>
+          <w:rFonts w:ascii="Consolas" w:eastAsia="Times New Roman" w:hAnsi="Consolas" w:cs="Times New Roman"/>
+          <w:color w:val="C0CAF5"/>
+          <w:sz w:val="21"/>
+          <w:szCs w:val="21"/>
+        </w:rPr>
+        <w:t>})</w:t>
+      </w:r>
+    </w:p>
+    <w:p>
+      <w:pPr>
+        <w:shd w:val="clear" w:color="auto" w:fill="1A1B26"/>
+        <w:spacing w:after="0" w:line="285" w:lineRule="atLeast"/>
+        <w:ind w:firstLine="0"/>
+        <w:rPr>
+          <w:rFonts w:ascii="Consolas" w:eastAsia="Times New Roman" w:hAnsi="Consolas" w:cs="Times New Roman"/>
+          <w:color w:val="C0CAF5"/>
+          <w:sz w:val="21"/>
+          <w:szCs w:val="21"/>
+        </w:rPr>
+      </w:pPr>
+      <w:r>
+        <w:rPr>
+          <w:rFonts w:ascii="Consolas" w:eastAsia="Times New Roman" w:hAnsi="Consolas" w:cs="Times New Roman"/>
+          <w:color w:val="BB9AF7"/>
+          <w:sz w:val="21"/>
+          <w:szCs w:val="21"/>
+        </w:rPr>
+        <w:t>export</w:t>
+      </w:r>
+      <w:r>
+        <w:rPr>
+          <w:rFonts w:ascii="Consolas" w:eastAsia="Times New Roman" w:hAnsi="Consolas" w:cs="Times New Roman"/>
+          <w:color w:val="C0CAF5"/>
+          <w:sz w:val="21"/>
+          <w:szCs w:val="21"/>
+        </w:rPr>
+        <w:t xml:space="preserve"> </w:t>
+      </w:r>
+      <w:r>
+        <w:rPr>
+          <w:rFonts w:ascii="Consolas" w:eastAsia="Times New Roman" w:hAnsi="Consolas" w:cs="Times New Roman"/>
+          <w:color w:val="BB9AF7"/>
+          <w:sz w:val="21"/>
+          <w:szCs w:val="21"/>
+        </w:rPr>
+        <w:t>class</w:t>
+      </w:r>
+      <w:r>
+        <w:rPr>
+          <w:rFonts w:ascii="Consolas" w:eastAsia="Times New Roman" w:hAnsi="Consolas" w:cs="Times New Roman"/>
+          <w:color w:val="C0CAF5"/>
+          <w:sz w:val="21"/>
+          <w:szCs w:val="21"/>
+        </w:rPr>
+        <w:t xml:space="preserve"> </w:t>
+      </w:r>
+      <w:proofErr w:type="spellStart"/>
+      <w:r>
+        <w:rPr>
+          <w:rFonts w:ascii="Consolas" w:eastAsia="Times New Roman" w:hAnsi="Consolas" w:cs="Times New Roman"/>
+          <w:color w:val="7DCFFF"/>
+          <w:sz w:val="21"/>
+          <w:szCs w:val="21"/>
+        </w:rPr>
+        <w:t>AppModule</w:t>
+      </w:r>
+      <w:proofErr w:type="spellEnd"/>
+      <w:r>
+        <w:rPr>
+          <w:rFonts w:ascii="Consolas" w:eastAsia="Times New Roman" w:hAnsi="Consolas" w:cs="Times New Roman"/>
+          <w:color w:val="C0CAF5"/>
+          <w:sz w:val="21"/>
+          <w:szCs w:val="21"/>
+        </w:rPr>
+        <w:t xml:space="preserve"> {}</w:t>
+      </w:r>
+    </w:p>
+    <w:p>
+      <w:pPr>
+        <w:shd w:val="clear" w:color="auto" w:fill="1A1B26"/>
+        <w:spacing w:after="0" w:line="285" w:lineRule="atLeast"/>
+        <w:ind w:firstLine="0"/>
+        <w:rPr>
+          <w:rFonts w:ascii="Consolas" w:eastAsia="Times New Roman" w:hAnsi="Consolas" w:cs="Times New Roman"/>
+          <w:color w:val="C0CAF5"/>
+          <w:sz w:val="21"/>
+          <w:szCs w:val="21"/>
+        </w:rPr>
+      </w:pPr>
+    </w:p>
+    <w:p>
+      <w:pPr>
+        <w:rPr>
+          <w:rFonts w:ascii="Consolas" w:hAnsi="Consolas"/>
+          <w:lang w:val="es-ES"/>
+        </w:rPr>
+      </w:pPr>
+    </w:p>
+    <w:p>
+      <w:pPr>
+        <w:rPr>
+          <w:rFonts w:ascii="Consolas" w:hAnsi="Consolas"/>
+          <w:lang w:val="es-ES"/>
+        </w:rPr>
+      </w:pPr>
+      <w:r>
+        <w:rPr>
+          <w:rFonts w:ascii="Consolas" w:hAnsi="Consolas"/>
+          <w:lang w:val="es-ES"/>
+        </w:rPr>
+        <w:t xml:space="preserve">seguidamente hacemos la prueba con migraciones con el </w:t>
+      </w:r>
+      <w:proofErr w:type="gramStart"/>
+      <w:r>
+        <w:rPr>
+          <w:rFonts w:ascii="Consolas" w:hAnsi="Consolas"/>
+          <w:lang w:val="es-ES"/>
+        </w:rPr>
+        <w:t xml:space="preserve">comando  </w:t>
+      </w:r>
+      <w:proofErr w:type="spellStart"/>
+      <w:r>
+        <w:rPr>
+          <w:rFonts w:ascii="Consolas" w:hAnsi="Consolas"/>
+          <w:lang w:val="es-ES"/>
+        </w:rPr>
+        <w:t>generate</w:t>
+      </w:r>
+      <w:proofErr w:type="spellEnd"/>
+      <w:proofErr w:type="gramEnd"/>
+      <w:r>
+        <w:rPr>
+          <w:rFonts w:ascii="Consolas" w:hAnsi="Consolas"/>
+          <w:lang w:val="es-ES"/>
+        </w:rPr>
+        <w:t xml:space="preserve"> y hacemos correr con el comando run ojo tiene que estar prendido el </w:t>
+      </w:r>
+      <w:proofErr w:type="spellStart"/>
+      <w:r>
+        <w:rPr>
+          <w:rFonts w:ascii="Consolas" w:hAnsi="Consolas"/>
+          <w:lang w:val="es-ES"/>
+        </w:rPr>
+        <w:t>docker</w:t>
+      </w:r>
+      <w:proofErr w:type="spellEnd"/>
+    </w:p>
+    <w:p>
+      <w:pPr>
+        <w:ind w:firstLine="0"/>
+        <w:rPr>
+          <w:rFonts w:ascii="Consolas" w:hAnsi="Consolas"/>
+          <w:lang w:val="es-ES"/>
+        </w:rPr>
+      </w:pPr>
+      <w:r>
+        <w:rPr>
+          <w:rFonts w:ascii="Consolas" w:hAnsi="Consolas"/>
+          <w:lang w:val="es-ES"/>
+        </w:rPr>
+        <w:t>Actividad nº1:</w:t>
+      </w:r>
+    </w:p>
+    <w:p>
+      <w:pPr>
+        <w:ind w:firstLine="0"/>
+        <w:rPr>
+          <w:rFonts w:ascii="Consolas" w:hAnsi="Consolas"/>
+          <w:lang w:val="es-ES"/>
+        </w:rPr>
+      </w:pPr>
+      <w:r>
+        <w:rPr>
+          <w:rFonts w:ascii="Consolas" w:hAnsi="Consolas"/>
+          <w:lang w:val="es-ES"/>
+        </w:rPr>
+        <w:t xml:space="preserve">Crear un repositorio para este mismo proyecto y hacerme colaborador </w:t>
+      </w:r>
+      <w:proofErr w:type="gramStart"/>
+      <w:r>
+        <w:rPr>
+          <w:rFonts w:ascii="Consolas" w:hAnsi="Consolas"/>
+          <w:lang w:val="es-ES"/>
+        </w:rPr>
+        <w:t>correo:israellimacondori32@gmail.com</w:t>
+      </w:r>
+      <w:proofErr w:type="gramEnd"/>
+    </w:p>
+    <w:p>
+      <w:pPr>
+        <w:ind w:firstLine="0"/>
+        <w:rPr>
+          <w:rFonts w:ascii="Consolas" w:hAnsi="Consolas"/>
+          <w:lang w:val="es-ES"/>
+        </w:rPr>
+      </w:pPr>
+      <w:r>
+        <w:rPr>
+          <w:rFonts w:ascii="Consolas" w:hAnsi="Consolas"/>
+          <w:lang w:val="es-ES"/>
+        </w:rPr>
+        <w:lastRenderedPageBreak/>
+        <w:drawing>
+          <wp:anchor distT="0" distB="0" distL="114300" distR="114300" simplePos="0" relativeHeight="251658240" behindDoc="0" locked="0" layoutInCell="1" allowOverlap="1" wp14:anchorId="5CF460B6" wp14:editId="39DB9227">
+            <wp:simplePos x="0" y="0"/>
+            <wp:positionH relativeFrom="column">
+              <wp:posOffset>495300</wp:posOffset>
+            </wp:positionH>
+            <wp:positionV relativeFrom="paragraph">
+              <wp:posOffset>533400</wp:posOffset>
+            </wp:positionV>
+            <wp:extent cx="4556760" cy="2743200"/>
+            <wp:effectExtent l="0" t="0" r="0" b="0"/>
+            <wp:wrapSquare wrapText="bothSides"/>
+            <wp:docPr id="4" name="Imagen 4"/>
+            <wp:cNvGraphicFramePr>
+              <a:graphicFrameLocks xmlns:a="http://schemas.openxmlformats.org/drawingml/2006/main" noChangeAspect="1"/>
+            </wp:cNvGraphicFramePr>
+            <a:graphic xmlns:a="http://schemas.openxmlformats.org/drawingml/2006/main">
+              <a:graphicData uri="http://schemas.openxmlformats.org/drawingml/2006/picture">
+                <pic:pic xmlns:pic="http://schemas.openxmlformats.org/drawingml/2006/picture">
+                  <pic:nvPicPr>
+                    <pic:cNvPr id="1" name=""/>
+                    <pic:cNvPicPr/>
+                  </pic:nvPicPr>
+                  <pic:blipFill>
+                    <a:blip r:embed="rId13">
+                      <a:extLst>
+                        <a:ext uri="{28A0092B-C50C-407E-A947-70E740481C1C}">
+                          <a14:useLocalDpi xmlns:a14="http://schemas.microsoft.com/office/drawing/2010/main" val="0"/>
+                        </a:ext>
+                      </a:extLst>
+                    </a:blip>
+                    <a:stretch>
+                      <a:fillRect/>
+                    </a:stretch>
+                  </pic:blipFill>
+                  <pic:spPr>
+                    <a:xfrm>
+                      <a:off x="0" y="0"/>
+                      <a:ext cx="4556760" cy="2743200"/>
+                    </a:xfrm>
+                    <a:prstGeom prst="rect">
+                      <a:avLst/>
+                    </a:prstGeom>
+                  </pic:spPr>
+                </pic:pic>
+              </a:graphicData>
+            </a:graphic>
+          </wp:anchor>
+        </w:drawing>
+      </w:r>
+      <w:r>
+        <w:rPr>
+          <w:rFonts w:ascii="Consolas" w:hAnsi="Consolas"/>
+          <w:lang w:val="es-ES"/>
+        </w:rPr>
+        <w:t xml:space="preserve">Seguir los mismos pasos y documentar mediante </w:t>
+      </w:r>
+      <w:proofErr w:type="spellStart"/>
+      <w:r>
+        <w:rPr>
+          <w:rFonts w:ascii="Consolas" w:hAnsi="Consolas"/>
+          <w:lang w:val="es-ES"/>
+        </w:rPr>
+        <w:t>commit</w:t>
+      </w:r>
+      <w:proofErr w:type="spellEnd"/>
+      <w:r>
+        <w:rPr>
+          <w:rFonts w:ascii="Consolas" w:hAnsi="Consolas"/>
+          <w:lang w:val="es-ES"/>
+        </w:rPr>
+        <w:t xml:space="preserve"> utilizando el flujo de </w:t>
+      </w:r>
+      <w:proofErr w:type="spellStart"/>
+      <w:r>
+        <w:rPr>
+          <w:rFonts w:ascii="Consolas" w:hAnsi="Consolas"/>
+          <w:lang w:val="es-ES"/>
+        </w:rPr>
+        <w:t>git</w:t>
+      </w:r>
+      <w:proofErr w:type="spellEnd"/>
+      <w:r>
+        <w:rPr>
+          <w:rFonts w:ascii="Consolas" w:hAnsi="Consolas"/>
+          <w:lang w:val="es-ES"/>
+        </w:rPr>
+        <w:t xml:space="preserve"> </w:t>
+      </w:r>
+      <w:proofErr w:type="spellStart"/>
+      <w:r>
+        <w:rPr>
+          <w:rFonts w:ascii="Consolas" w:hAnsi="Consolas"/>
+          <w:lang w:val="es-ES"/>
+        </w:rPr>
+        <w:t>flow</w:t>
+      </w:r>
+      <w:proofErr w:type="spellEnd"/>
+      <w:r>
+        <w:rPr>
+          <w:rFonts w:ascii="Consolas" w:hAnsi="Consolas"/>
+          <w:lang w:val="es-ES"/>
+        </w:rPr>
+        <w:t xml:space="preserve"> </w:t>
+      </w:r>
+    </w:p>
+    <w:p>
+      <w:pPr>
+        <w:ind w:firstLine="0"/>
+        <w:rPr>
+          <w:rFonts w:ascii="Consolas" w:hAnsi="Consolas"/>
+          <w:lang w:val="es-ES"/>
+        </w:rPr>
+      </w:pPr>
+    </w:p>
+    <w:p>
+      <w:pPr>
+        <w:rPr>
+          <w:rFonts w:ascii="Consolas" w:hAnsi="Consolas"/>
+          <w:lang w:val="es-ES"/>
+        </w:rPr>
+      </w:pPr>
+    </w:p>
+    <w:p>
+      <w:pPr>
+        <w:ind w:firstLine="0"/>
+        <w:rPr>
+          <w:rFonts w:ascii="Consolas" w:eastAsia="Times New Roman" w:hAnsi="Consolas" w:cs="Times New Roman"/>
+          <w:b/>
+          <w:bCs/>
+          <w:color w:val="auto"/>
+          <w:sz w:val="21"/>
+          <w:szCs w:val="21"/>
+          <w:lang w:val="es-ES"/>
+        </w:rPr>
+      </w:pPr>
+    </w:p>
+    <w:p>
+      <w:pPr>
+        <w:ind w:firstLine="0"/>
+        <w:rPr>
+          <w:rFonts w:ascii="Consolas" w:eastAsia="Times New Roman" w:hAnsi="Consolas" w:cs="Times New Roman"/>
+          <w:b/>
+          <w:bCs/>
+          <w:color w:val="auto"/>
+          <w:sz w:val="21"/>
+          <w:szCs w:val="21"/>
+          <w:lang w:val="es-ES"/>
+        </w:rPr>
+      </w:pPr>
+    </w:p>
+    <w:p>
+      <w:pPr>
+        <w:ind w:firstLine="0"/>
+        <w:rPr>
+          <w:rFonts w:ascii="Consolas" w:eastAsia="Times New Roman" w:hAnsi="Consolas" w:cs="Times New Roman"/>
+          <w:color w:val="auto"/>
+          <w:sz w:val="21"/>
+          <w:szCs w:val="21"/>
+          <w:lang w:val="es-ES"/>
+        </w:rPr>
+      </w:pPr>
+    </w:p>
+    <w:p>
+      <w:pPr>
+        <w:rPr>
+          <w:rFonts w:ascii="Consolas" w:eastAsia="Times New Roman" w:hAnsi="Consolas" w:cs="Times New Roman"/>
+          <w:sz w:val="21"/>
+          <w:szCs w:val="21"/>
+          <w:lang w:val="es-ES"/>
+        </w:rPr>
+      </w:pPr>
+    </w:p>
+    <w:p>
+      <w:pPr>
+        <w:rPr>
+          <w:rFonts w:ascii="Consolas" w:eastAsia="Times New Roman" w:hAnsi="Consolas" w:cs="Times New Roman"/>
+          <w:color w:val="auto"/>
+          <w:sz w:val="21"/>
+          <w:szCs w:val="21"/>
+          <w:lang w:val="es-ES"/>
+        </w:rPr>
+      </w:pPr>
+    </w:p>
+    <w:p>
+      <w:pPr>
+        <w:rPr>
+          <w:rFonts w:ascii="Consolas" w:eastAsia="Times New Roman" w:hAnsi="Consolas" w:cs="Times New Roman"/>
+          <w:sz w:val="21"/>
+          <w:szCs w:val="21"/>
+          <w:lang w:val="es-ES"/>
+        </w:rPr>
+      </w:pPr>
+    </w:p>
+    <w:p>
+      <w:pPr>
+        <w:rPr>
+          <w:rFonts w:ascii="Consolas" w:eastAsia="Times New Roman" w:hAnsi="Consolas" w:cs="Times New Roman"/>
+          <w:sz w:val="21"/>
+          <w:szCs w:val="21"/>
+          <w:lang w:val="es-ES"/>
+        </w:rPr>
+      </w:pPr>
+    </w:p>
+    <w:p>
+      <w:pPr>
+        <w:ind w:firstLine="0"/>
+        <w:rPr>
+          <w:rFonts w:ascii="Consolas" w:eastAsia="Times New Roman" w:hAnsi="Consolas" w:cs="Times New Roman"/>
+          <w:sz w:val="21"/>
+          <w:szCs w:val="21"/>
+          <w:lang w:val="es-ES"/>
+        </w:rPr>
+      </w:pPr>
+      <w:r>
+        <w:rPr>
+          <w:rFonts w:ascii="Consolas" w:eastAsia="Times New Roman" w:hAnsi="Consolas" w:cs="Times New Roman"/>
+          <w:sz w:val="21"/>
+          <w:szCs w:val="21"/>
+          <w:lang w:val="es-ES"/>
+        </w:rPr>
+        <w:t>Imagen de referencia del flujo</w:t>
+      </w:r>
+    </w:p>
+    <w:p>
+      <w:pPr>
+        <w:ind w:firstLine="0"/>
+        <w:rPr>
+          <w:rFonts w:ascii="Consolas" w:eastAsia="Times New Roman" w:hAnsi="Consolas" w:cs="Times New Roman"/>
+          <w:sz w:val="21"/>
+          <w:szCs w:val="21"/>
+          <w:u w:val="single"/>
+          <w:lang w:val="es-ES"/>
+        </w:rPr>
+      </w:pPr>
+      <w:r>
+        <w:rPr>
+          <w:rFonts w:ascii="Consolas" w:eastAsia="Times New Roman" w:hAnsi="Consolas" w:cs="Times New Roman"/>
+          <w:sz w:val="21"/>
+          <w:szCs w:val="21"/>
+          <w:lang w:val="es-ES"/>
+        </w:rPr>
+        <w:t xml:space="preserve">Se </w:t>
+      </w:r>
+      <w:proofErr w:type="gramStart"/>
+      <w:r>
+        <w:rPr>
+          <w:rFonts w:ascii="Consolas" w:eastAsia="Times New Roman" w:hAnsi="Consolas" w:cs="Times New Roman"/>
+          <w:sz w:val="21"/>
+          <w:szCs w:val="21"/>
+          <w:lang w:val="es-ES"/>
+        </w:rPr>
+        <w:t>calificara</w:t>
+      </w:r>
+      <w:proofErr w:type="gramEnd"/>
+      <w:r>
+        <w:rPr>
+          <w:rFonts w:ascii="Consolas" w:eastAsia="Times New Roman" w:hAnsi="Consolas" w:cs="Times New Roman"/>
+          <w:sz w:val="21"/>
+          <w:szCs w:val="21"/>
+          <w:lang w:val="es-ES"/>
+        </w:rPr>
+        <w:t xml:space="preserve"> el flujo realizado en los </w:t>
+      </w:r>
+      <w:proofErr w:type="spellStart"/>
+      <w:r>
+        <w:rPr>
+          <w:rFonts w:ascii="Consolas" w:eastAsia="Times New Roman" w:hAnsi="Consolas" w:cs="Times New Roman"/>
+          <w:sz w:val="21"/>
+          <w:szCs w:val="21"/>
+          <w:lang w:val="es-ES"/>
+        </w:rPr>
+        <w:t>commits</w:t>
+      </w:r>
+      <w:proofErr w:type="spellEnd"/>
+    </w:p>
+    <w:p>
+      <w:pPr>
+        <w:ind w:firstLine="0"/>
+        <w:rPr>
+          <w:rFonts w:ascii="Consolas" w:eastAsia="Times New Roman" w:hAnsi="Consolas" w:cs="Times New Roman"/>
           <w:sz w:val="21"/>
           <w:szCs w:val="21"/>
           <w:lang w:val="es-ES"/>

</xml_diff>